<commit_message>
refactor(paper): 改用 extraTex 作为 PDF/DOCX 唯一正文来源
- 移除 artifacts/source/ 持久化 Markdown 与 references/meta.yaml
- 新增 extraTex/ 目录直接承载 .tex 正文片段
- 重构 manuscript_tool.py：移除 YAML 依赖，改为直接解析 main.tex 中的 \input 指令
- 更新 fix_docx_spacing.py、inspect_docx_styles.py 项目根检测逻辑
- 同步更新 AGENTS.md、README.md、CHANGELOG.md 等文档

Co-Authored-By: Claude Opus 4.6 <noreply@anthropic.com>
</commit_message>
<xml_diff>
--- a/projects/paper-sci-01/main.docx
+++ b/projects/paper-sci-01/main.docx
@@ -2,7 +2,7 @@
 <file path=word/document.xml><?xml version="1.0" encoding="utf-8"?>
 <w:document xmlns:w="http://schemas.openxmlformats.org/wordprocessingml/2006/main" xmlns:m="http://schemas.openxmlformats.org/officeDocument/2006/math" xmlns:r="http://schemas.openxmlformats.org/officeDocument/2006/relationships" xmlns:o="urn:schemas-microsoft-com:office:office" xmlns:v="urn:schemas-microsoft-com:vml" xmlns:w10="urn:schemas-microsoft-com:office:word" xmlns:a="http://schemas.openxmlformats.org/drawingml/2006/main" xmlns:pic="http://schemas.openxmlformats.org/drawingml/2006/picture" xmlns:wp="http://schemas.openxmlformats.org/drawingml/2006/wordprocessingDrawing">
   <w:body>
-    <w:bookmarkStart w:id="46" w:name="X6090568b3e5df82c29aa37fb780fcfa931c406d"/>
+    <w:bookmarkStart w:id="24" w:name="X6090568b3e5df82c29aa37fb780fcfa931c406d"/>
     <w:p>
       <w:pPr>
         <w:pStyle w:val="1"/>
@@ -32,14 +32,17 @@
         <w:t xml:space="preserve">2†</w:t>
       </w:r>
       <w:r>
-        <w:t xml:space="preserve">, and Template Author Three</w:t>
+        <w:t xml:space="preserve">,</w:t>
+      </w:r>
+      <w:r>
+        <w:t xml:space="preserve"> </w:t>
+      </w:r>
+      <w:r>
+        <w:t xml:space="preserve">Template Author Three</w:t>
       </w:r>
       <w:r>
         <w:t xml:space="preserve">1*</w:t>
       </w:r>
-      <w:r>
-        <w:t xml:space="preserve">.</w:t>
-      </w:r>
     </w:p>
     <w:p>
       <w:pPr>
@@ -51,7 +54,13 @@
         <w:t xml:space="preserve">1</w:t>
       </w:r>
       <w:r>
-        <w:t xml:space="preserve">Department of Translational Bioinformatics, Example Research Institute, Guangzhou, China</w:t>
+        <w:t xml:space="preserve">Department of Translational Bioinformatics, Example Research</w:t>
+      </w:r>
+      <w:r>
+        <w:t xml:space="preserve"> </w:t>
+      </w:r>
+      <w:r>
+        <w:t xml:space="preserve">Institute, Guangzhou, China</w:t>
       </w:r>
     </w:p>
     <w:p>
@@ -64,7 +73,13 @@
         <w:t xml:space="preserve">2</w:t>
       </w:r>
       <w:r>
-        <w:t xml:space="preserve">School of Biomedical Data Science, Example University, Shanghai, China</w:t>
+        <w:t xml:space="preserve">School of Biomedical Data Science, Example University,</w:t>
+      </w:r>
+      <w:r>
+        <w:t xml:space="preserve"> </w:t>
+      </w:r>
+      <w:r>
+        <w:t xml:space="preserve">Shanghai, China</w:t>
       </w:r>
     </w:p>
     <w:p>
@@ -77,7 +92,13 @@
         <w:t xml:space="preserve">†</w:t>
       </w:r>
       <w:r>
-        <w:t xml:space="preserve">Template Author One and Template Author Two contributed equally to this demonstration manuscript.</w:t>
+        <w:t xml:space="preserve">Template Author One and Template Author Two contributed</w:t>
+      </w:r>
+      <w:r>
+        <w:t xml:space="preserve"> </w:t>
+      </w:r>
+      <w:r>
+        <w:t xml:space="preserve">equally to this demonstration manuscript.</w:t>
       </w:r>
     </w:p>
     <w:p>
@@ -86,18 +107,125 @@
         <w:spacing w:line="360" w:lineRule="auto" w:after="80" w:before="0"/>
         <w:ind w:firstLine="0"/>
       </w:pPr>
+      <w:r>
+        <w:t xml:space="preserve">*</w:t>
+      </w:r>
+      <w:r>
+        <w:t xml:space="preserve">Correspondence: template.author@example.org.</w:t>
+      </w:r>
+    </w:p>
+    <w:p>
+      <w:pPr>
+        <w:pStyle w:val="BodyText"/>
+        <w:spacing w:line="360" w:lineRule="auto" w:after="80" w:before="0"/>
+        <w:ind w:firstLine="0"/>
+      </w:pPr>
+      <w:r>
+        <w:t xml:space="preserve">Running title: Structural variation demo manuscript</w:t>
+      </w:r>
+    </w:p>
+    <w:bookmarkEnd w:id="24"/>
+    <w:bookmarkStart w:id="25" w:name="abstract"/>
+    <w:p>
+      <w:pPr>
+        <w:pStyle w:val="1"/>
+        <w:spacing w:line="360" w:lineRule="auto" w:after="80" w:before="0"/>
+        <w:ind w:firstLine="0"/>
+      </w:pPr>
+      <w:r>
+        <w:t xml:space="preserve">Abstract</w:t>
+      </w:r>
+    </w:p>
+    <w:p>
+      <w:pPr>
+        <w:pStyle w:val="FirstParagraph"/>
+        <w:spacing w:line="360" w:lineRule="auto" w:after="80" w:before="0"/>
+        <w:ind w:firstLine="0"/>
+      </w:pPr>
+      <w:r>
+        <w:t xml:space="preserve">This public demonstration manuscript reformats the main messages of a</w:t>
+      </w:r>
+      <w:r>
+        <w:t xml:space="preserve"> </w:t>
+      </w:r>
+      <w:r>
+        <w:t xml:space="preserve">recently published</w:t>
+      </w:r>
+      <w:r>
+        <w:t xml:space="preserve"> </w:t>
+      </w:r>
       <w:r>
         <w:rPr>
           <w:i/>
           <w:iCs/>
         </w:rPr>
-        <w:t xml:space="preserve">Correspondence:</w:t>
-      </w:r>
-      <w:r>
-        <w:t xml:space="preserve"> </w:t>
-      </w:r>
-      <w:r>
-        <w:t xml:space="preserve">template.author@example.org</w:t>
+        <w:t xml:space="preserve">Cancer Cell</w:t>
+      </w:r>
+      <w:r>
+        <w:t xml:space="preserve"> </w:t>
+      </w:r>
+      <w:r>
+        <w:t xml:space="preserve">study on structural variation in</w:t>
+      </w:r>
+      <w:r>
+        <w:t xml:space="preserve"> </w:t>
+      </w:r>
+      <w:r>
+        <w:t xml:space="preserve">pediatric cancer into the</w:t>
+      </w:r>
+      <w:r>
+        <w:t xml:space="preserve"> </w:t>
+      </w:r>
+      <w:r>
+        <w:rPr>
+          <w:rStyle w:val="VerbatimChar"/>
+        </w:rPr>
+        <w:t xml:space="preserve">bensz-paper</w:t>
+      </w:r>
+      <w:r>
+        <w:t xml:space="preserve"> </w:t>
+      </w:r>
+      <w:r>
+        <w:t xml:space="preserve">workflow. The source article</w:t>
+      </w:r>
+      <w:r>
+        <w:t xml:space="preserve"> </w:t>
+      </w:r>
+      <w:r>
+        <w:t xml:space="preserve">reported pan-cancer analyses across 1,616 pediatric and 2,203 adult</w:t>
+      </w:r>
+      <w:r>
+        <w:t xml:space="preserve"> </w:t>
+      </w:r>
+      <w:r>
+        <w:t xml:space="preserve">whole genomes and showed that structural-variation burden differed</w:t>
+      </w:r>
+      <w:r>
+        <w:t xml:space="preserve"> </w:t>
+      </w:r>
+      <w:r>
+        <w:t xml:space="preserve">markedly across pediatric cancer types, remained much lower than that of</w:t>
+      </w:r>
+      <w:r>
+        <w:t xml:space="preserve"> </w:t>
+      </w:r>
+      <w:r>
+        <w:t xml:space="preserve">most adult solid tumors, and was nevertheless highly informative for</w:t>
+      </w:r>
+      <w:r>
+        <w:t xml:space="preserve"> </w:t>
+      </w:r>
+      <w:r>
+        <w:t xml:space="preserve">leukemias and other hematological malignancies</w:t>
+      </w:r>
+      <w:r>
+        <w:rPr>
+          <w:vertAlign w:val="superscript"/>
+        </w:rPr>
+        <w:t xml:space="preserve">1</w:t>
+      </w:r>
+      <w:r>
+        <w:t xml:space="preserve">.</w:t>
       </w:r>
     </w:p>
     <w:p>
@@ -107,10 +235,928 @@
         <w:ind w:firstLine="0"/>
       </w:pPr>
       <w:r>
-        <w:t xml:space="preserve">Running title: Structural variation demo manuscript</w:t>
-      </w:r>
-    </w:p>
-    <w:bookmarkStart w:id="24" w:name="abstract"/>
+        <w:t xml:space="preserve">The same study further highlighted recurrent disruption of driver genes,</w:t>
+      </w:r>
+      <w:r>
+        <w:t xml:space="preserve"> </w:t>
+      </w:r>
+      <w:r>
+        <w:t xml:space="preserve">distinct hotspot patterns around RAG recombination signal sequences, and</w:t>
+      </w:r>
+      <w:r>
+        <w:t xml:space="preserve"> </w:t>
+      </w:r>
+      <w:r>
+        <w:t xml:space="preserve">signature-level evidence that RAG-mediated mutagenesis contributes to</w:t>
+      </w:r>
+      <w:r>
+        <w:t xml:space="preserve"> </w:t>
+      </w:r>
+      <w:r>
+        <w:t xml:space="preserve">part of the lymphoid structural-variation landscape</w:t>
+      </w:r>
+      <w:r>
+        <w:rPr>
+          <w:vertAlign w:val="superscript"/>
+        </w:rPr>
+        <w:t xml:space="preserve">1</w:t>
+      </w:r>
+      <w:r>
+        <w:t xml:space="preserve">. Here</w:t>
+      </w:r>
+      <w:r>
+        <w:t xml:space="preserve"> </w:t>
+      </w:r>
+      <w:r>
+        <w:t xml:space="preserve">we condense those public findings into a journal-style example project</w:t>
+      </w:r>
+      <w:r>
+        <w:t xml:space="preserve"> </w:t>
+      </w:r>
+      <w:r>
+        <w:t xml:space="preserve">whose purpose is typesetting validation rather than scientific novelty.</w:t>
+      </w:r>
+    </w:p>
+    <w:bookmarkEnd w:id="25"/>
+    <w:bookmarkStart w:id="26" w:name="introduction"/>
+    <w:p>
+      <w:pPr>
+        <w:pStyle w:val="1"/>
+        <w:spacing w:line="360" w:lineRule="auto" w:after="80" w:before="0"/>
+        <w:ind w:firstLine="0"/>
+      </w:pPr>
+      <w:r>
+        <w:t xml:space="preserve">Introduction</w:t>
+      </w:r>
+    </w:p>
+    <w:p>
+      <w:pPr>
+        <w:pStyle w:val="FirstParagraph"/>
+        <w:spacing w:line="360" w:lineRule="auto" w:after="80" w:before="0"/>
+        <w:ind w:firstLine="0"/>
+      </w:pPr>
+      <w:r>
+        <w:t xml:space="preserve">Structural variants are a major source of oncogenic activation, tumor</w:t>
+      </w:r>
+      <w:r>
+        <w:t xml:space="preserve"> </w:t>
+      </w:r>
+      <w:r>
+        <w:t xml:space="preserve">suppressor loss, enhancer hijacking, and genome reorganization. In</w:t>
+      </w:r>
+      <w:r>
+        <w:t xml:space="preserve"> </w:t>
+      </w:r>
+      <w:r>
+        <w:t xml:space="preserve">pediatric tumors, however, broad pan-cancer summaries of structural</w:t>
+      </w:r>
+      <w:r>
+        <w:t xml:space="preserve"> </w:t>
+      </w:r>
+      <w:r>
+        <w:t xml:space="preserve">variation have historically lagged behind point-mutation catalogs, which</w:t>
+      </w:r>
+      <w:r>
+        <w:t xml:space="preserve"> </w:t>
+      </w:r>
+      <w:r>
+        <w:t xml:space="preserve">made it harder to compare disease classes within a unified framework.</w:t>
+      </w:r>
+    </w:p>
+    <w:p>
+      <w:pPr>
+        <w:pStyle w:val="BodyText"/>
+        <w:spacing w:line="360" w:lineRule="auto" w:after="80" w:before="0"/>
+        <w:ind w:firstLine="0"/>
+      </w:pPr>
+      <w:r>
+        <w:t xml:space="preserve">Earlier pediatric pan-cancer genomics efforts and whole-cancer</w:t>
+      </w:r>
+      <w:r>
+        <w:t xml:space="preserve"> </w:t>
+      </w:r>
+      <w:r>
+        <w:t xml:space="preserve">structural-variation surveys provided important context for that gap by</w:t>
+      </w:r>
+      <w:r>
+        <w:t xml:space="preserve"> </w:t>
+      </w:r>
+      <w:r>
+        <w:t xml:space="preserve">outlining recurrent genomic alterations across childhood cancers and by</w:t>
+      </w:r>
+      <w:r>
+        <w:t xml:space="preserve"> </w:t>
+      </w:r>
+      <w:r>
+        <w:t xml:space="preserve">formalizing major rearrangement patterns across human malignancies</w:t>
+      </w:r>
+      <w:r>
+        <w:rPr>
+          <w:vertAlign w:val="superscript"/>
+        </w:rPr>
+        <w:t xml:space="preserve">2–4</w:t>
+      </w:r>
+      <w:r>
+        <w:t xml:space="preserve">.</w:t>
+      </w:r>
+    </w:p>
+    <w:p>
+      <w:pPr>
+        <w:pStyle w:val="BodyText"/>
+        <w:spacing w:line="360" w:lineRule="auto" w:after="80" w:before="0"/>
+        <w:ind w:firstLine="0"/>
+      </w:pPr>
+      <w:r>
+        <w:t xml:space="preserve">The public study by Greenhalgh and colleagues addressed that gap by</w:t>
+      </w:r>
+      <w:r>
+        <w:t xml:space="preserve"> </w:t>
+      </w:r>
+      <w:r>
+        <w:t xml:space="preserve">surveying pediatric and adult whole-genome cohorts side by side and by</w:t>
+      </w:r>
+      <w:r>
+        <w:t xml:space="preserve"> </w:t>
+      </w:r>
+      <w:r>
+        <w:t xml:space="preserve">focusing on the biological consequences of rearrangements instead of</w:t>
+      </w:r>
+      <w:r>
+        <w:t xml:space="preserve"> </w:t>
+      </w:r>
+      <w:r>
+        <w:t xml:space="preserve">only their raw counts</w:t>
+      </w:r>
+      <w:r>
+        <w:rPr>
+          <w:vertAlign w:val="superscript"/>
+        </w:rPr>
+        <w:t xml:space="preserve">1</w:t>
+      </w:r>
+      <w:r>
+        <w:t xml:space="preserve">. Their work is especially useful as</w:t>
+      </w:r>
+      <w:r>
+        <w:t xml:space="preserve"> </w:t>
+      </w:r>
+      <w:r>
+        <w:t xml:space="preserve">a formatting example because it combines large-cohort genomics, mutation</w:t>
+      </w:r>
+      <w:r>
+        <w:t xml:space="preserve"> </w:t>
+      </w:r>
+      <w:r>
+        <w:t xml:space="preserve">signatures, and clinically relevant language in a conventional IMRaD</w:t>
+      </w:r>
+      <w:r>
+        <w:t xml:space="preserve"> </w:t>
+      </w:r>
+      <w:r>
+        <w:t xml:space="preserve">structure.</w:t>
+      </w:r>
+    </w:p>
+    <w:p>
+      <w:pPr>
+        <w:pStyle w:val="BodyText"/>
+        <w:spacing w:line="360" w:lineRule="auto" w:after="80" w:before="0"/>
+        <w:ind w:firstLine="0"/>
+      </w:pPr>
+      <w:r>
+        <w:t xml:space="preserve">This project does not reproduce the journal article verbatim. Instead,</w:t>
+      </w:r>
+      <w:r>
+        <w:t xml:space="preserve"> </w:t>
+      </w:r>
+      <w:r>
+        <w:t xml:space="preserve">it uses publicly accessible metadata and abstract-level findings to</w:t>
+      </w:r>
+      <w:r>
+        <w:t xml:space="preserve"> </w:t>
+      </w:r>
+      <w:r>
+        <w:t xml:space="preserve">create a clean demonstration manuscript for the</w:t>
+      </w:r>
+      <w:r>
+        <w:t xml:space="preserve"> </w:t>
+      </w:r>
+      <w:r>
+        <w:rPr>
+          <w:rStyle w:val="VerbatimChar"/>
+        </w:rPr>
+        <w:t xml:space="preserve">bensz-paper</w:t>
+      </w:r>
+      <w:r>
+        <w:t xml:space="preserve"> </w:t>
+      </w:r>
+      <w:r>
+        <w:t xml:space="preserve">package.</w:t>
+      </w:r>
+      <w:r>
+        <w:t xml:space="preserve"> </w:t>
+      </w:r>
+      <w:r>
+        <w:t xml:space="preserve">The goal is to give repository users a ready-to-render SCI template with</w:t>
+      </w:r>
+      <w:r>
+        <w:t xml:space="preserve"> </w:t>
+      </w:r>
+      <w:r>
+        <w:t xml:space="preserve">both PDF and Word outputs while keeping the sample text openly</w:t>
+      </w:r>
+      <w:r>
+        <w:t xml:space="preserve"> </w:t>
+      </w:r>
+      <w:r>
+        <w:t xml:space="preserve">shareable.</w:t>
+      </w:r>
+    </w:p>
+    <w:bookmarkEnd w:id="26"/>
+    <w:bookmarkStart w:id="27" w:name="methods"/>
+    <w:p>
+      <w:pPr>
+        <w:pStyle w:val="1"/>
+        <w:spacing w:line="360" w:lineRule="auto" w:after="80" w:before="0"/>
+        <w:ind w:firstLine="0"/>
+      </w:pPr>
+      <w:r>
+        <w:t xml:space="preserve">Methods</w:t>
+      </w:r>
+    </w:p>
+    <w:p>
+      <w:pPr>
+        <w:pStyle w:val="FirstParagraph"/>
+        <w:spacing w:line="360" w:lineRule="auto" w:after="80" w:before="0"/>
+        <w:ind w:firstLine="0"/>
+      </w:pPr>
+      <w:r>
+        <w:t xml:space="preserve">For this demonstration project, we used only public information</w:t>
+      </w:r>
+      <w:r>
+        <w:t xml:space="preserve"> </w:t>
+      </w:r>
+      <w:r>
+        <w:t xml:space="preserve">available from the published bibliographic record and abstract of the</w:t>
+      </w:r>
+      <w:r>
+        <w:t xml:space="preserve"> </w:t>
+      </w:r>
+      <w:r>
+        <w:t xml:space="preserve">source article</w:t>
+      </w:r>
+      <w:r>
+        <w:rPr>
+          <w:vertAlign w:val="superscript"/>
+        </w:rPr>
+        <w:t xml:space="preserve">1</w:t>
+      </w:r>
+      <w:r>
+        <w:t xml:space="preserve">. No unpublished files, figures,</w:t>
+      </w:r>
+      <w:r>
+        <w:t xml:space="preserve"> </w:t>
+      </w:r>
+      <w:r>
+        <w:t xml:space="preserve">supplementary tables, or protected full-text material from other</w:t>
+      </w:r>
+      <w:r>
+        <w:t xml:space="preserve"> </w:t>
+      </w:r>
+      <w:r>
+        <w:t xml:space="preserve">manuscripts were imported into this repository.</w:t>
+      </w:r>
+    </w:p>
+    <w:p>
+      <w:pPr>
+        <w:pStyle w:val="BodyText"/>
+        <w:spacing w:line="360" w:lineRule="auto" w:after="80" w:before="0"/>
+        <w:ind w:firstLine="0"/>
+      </w:pPr>
+      <w:r>
+        <w:t xml:space="preserve">The manuscript body is maintained directly as LaTeX fragments under</w:t>
+      </w:r>
+      <w:r>
+        <w:t xml:space="preserve"> </w:t>
+      </w:r>
+      <w:r>
+        <w:rPr>
+          <w:rStyle w:val="VerbatimChar"/>
+        </w:rPr>
+        <w:t xml:space="preserve">extraTex/</w:t>
+      </w:r>
+      <w:r>
+        <w:t xml:space="preserve">. During build,</w:t>
+      </w:r>
+      <w:r>
+        <w:t xml:space="preserve"> </w:t>
+      </w:r>
+      <w:r>
+        <w:rPr>
+          <w:rStyle w:val="VerbatimChar"/>
+        </w:rPr>
+        <w:t xml:space="preserve">packages/bensz-paper/scripts/manuscript_tool.py</w:t>
+      </w:r>
+      <w:r>
+        <w:t xml:space="preserve"> </w:t>
+      </w:r>
+      <w:r>
+        <w:t xml:space="preserve">compiles</w:t>
+      </w:r>
+      <w:r>
+        <w:t xml:space="preserve"> </w:t>
+      </w:r>
+      <w:r>
+        <w:rPr>
+          <w:rStyle w:val="VerbatimChar"/>
+        </w:rPr>
+        <w:t xml:space="preserve">main.tex</w:t>
+      </w:r>
+      <w:r>
+        <w:t xml:space="preserve"> </w:t>
+      </w:r>
+      <w:r>
+        <w:t xml:space="preserve">against those source files for PDF output and converts the same</w:t>
+      </w:r>
+      <w:r>
+        <w:t xml:space="preserve"> </w:t>
+      </w:r>
+      <w:r>
+        <w:rPr>
+          <w:rStyle w:val="VerbatimChar"/>
+        </w:rPr>
+        <w:t xml:space="preserve">extraTex/**/*.tex</w:t>
+      </w:r>
+      <w:r>
+        <w:t xml:space="preserve"> </w:t>
+      </w:r>
+      <w:r>
+        <w:t xml:space="preserve">fragments into temporary Markdown at runtime for</w:t>
+      </w:r>
+      <w:r>
+        <w:t xml:space="preserve"> </w:t>
+      </w:r>
+      <w:r>
+        <w:t xml:space="preserve">Pandoc-based DOCX export. The Markdown is treated only as an</w:t>
+      </w:r>
+      <w:r>
+        <w:t xml:space="preserve"> </w:t>
+      </w:r>
+      <w:r>
+        <w:t xml:space="preserve">intermediate representation and is not stored as a second editable</w:t>
+      </w:r>
+      <w:r>
+        <w:t xml:space="preserve"> </w:t>
+      </w:r>
+      <w:r>
+        <w:t xml:space="preserve">source of truth.</w:t>
+      </w:r>
+    </w:p>
+    <w:p>
+      <w:pPr>
+        <w:pStyle w:val="BodyText"/>
+        <w:spacing w:line="360" w:lineRule="auto" w:after="80" w:before="0"/>
+        <w:ind w:firstLine="0"/>
+      </w:pPr>
+      <w:r>
+        <w:t xml:space="preserve">PDF rendering follows the fixed sequence</w:t>
+      </w:r>
+      <w:r>
+        <w:t xml:space="preserve"> </w:t>
+      </w:r>
+      <w:r>
+        <w:rPr>
+          <w:rStyle w:val="VerbatimChar"/>
+        </w:rPr>
+        <w:t xml:space="preserve">xelatex -&gt; biber -&gt; xelatex -&gt; xelatex</w:t>
+      </w:r>
+      <w:r>
+        <w:t xml:space="preserve">. DOCX rendering uses Pandoc</w:t>
+      </w:r>
+      <w:r>
+        <w:t xml:space="preserve"> </w:t>
+      </w:r>
+      <w:r>
+        <w:t xml:space="preserve">with the bundled</w:t>
+      </w:r>
+      <w:r>
+        <w:t xml:space="preserve"> </w:t>
+      </w:r>
+      <w:r>
+        <w:rPr>
+          <w:rStyle w:val="VerbatimChar"/>
+        </w:rPr>
+        <w:t xml:space="preserve">reference.docx</w:t>
+      </w:r>
+      <w:r>
+        <w:t xml:space="preserve"> </w:t>
+      </w:r>
+      <w:r>
+        <w:t xml:space="preserve">and CSL file, after which a</w:t>
+      </w:r>
+      <w:r>
+        <w:t xml:space="preserve"> </w:t>
+      </w:r>
+      <w:r>
+        <w:t xml:space="preserve">post-processing step normalizes line spacing, paragraph spacing, and</w:t>
+      </w:r>
+      <w:r>
+        <w:t xml:space="preserve"> </w:t>
+      </w:r>
+      <w:r>
+        <w:t xml:space="preserve">bibliography placement so that the Word output remains visually close to</w:t>
+      </w:r>
+      <w:r>
+        <w:t xml:space="preserve"> </w:t>
+      </w:r>
+      <w:r>
+        <w:t xml:space="preserve">the LaTeX PDF.</w:t>
+      </w:r>
+    </w:p>
+    <w:bookmarkEnd w:id="27"/>
+    <w:bookmarkStart w:id="28" w:name="results"/>
+    <w:p>
+      <w:pPr>
+        <w:pStyle w:val="1"/>
+        <w:spacing w:line="360" w:lineRule="auto" w:after="80" w:before="0"/>
+        <w:ind w:firstLine="0"/>
+      </w:pPr>
+      <w:r>
+        <w:t xml:space="preserve">Results</w:t>
+      </w:r>
+    </w:p>
+    <w:p>
+      <w:pPr>
+        <w:pStyle w:val="FirstParagraph"/>
+        <w:spacing w:line="360" w:lineRule="auto" w:after="80" w:before="0"/>
+        <w:ind w:firstLine="0"/>
+      </w:pPr>
+      <w:r>
+        <w:t xml:space="preserve">Greenhalgh et al. reported that structural-variation burden varied by</w:t>
+      </w:r>
+      <w:r>
+        <w:t xml:space="preserve"> </w:t>
+      </w:r>
+      <w:r>
+        <w:t xml:space="preserve">roughly two orders of magnitude across pediatric cancer types,</w:t>
+      </w:r>
+      <w:r>
+        <w:t xml:space="preserve"> </w:t>
+      </w:r>
+      <w:r>
+        <w:t xml:space="preserve">underscoring that rearrangement biology is highly disease-specific</w:t>
+      </w:r>
+      <w:r>
+        <w:t xml:space="preserve"> </w:t>
+      </w:r>
+      <w:r>
+        <w:t xml:space="preserve">rather than uniform across childhood malignancies</w:t>
+      </w:r>
+      <w:r>
+        <w:rPr>
+          <w:vertAlign w:val="superscript"/>
+        </w:rPr>
+        <w:t xml:space="preserve">1</w:t>
+      </w:r>
+      <w:r>
+        <w:t xml:space="preserve">.</w:t>
+      </w:r>
+      <w:r>
+        <w:t xml:space="preserve"> </w:t>
+      </w:r>
+      <w:r>
+        <w:t xml:space="preserve">Compared with adult brain and solid tumors, most pediatric solid cancers</w:t>
+      </w:r>
+      <w:r>
+        <w:t xml:space="preserve"> </w:t>
+      </w:r>
+      <w:r>
+        <w:t xml:space="preserve">carried substantially fewer structural variants, whereas hematological</w:t>
+      </w:r>
+      <w:r>
+        <w:t xml:space="preserve"> </w:t>
+      </w:r>
+      <w:r>
+        <w:t xml:space="preserve">malignancies showed a much closer burden profile.</w:t>
+      </w:r>
+    </w:p>
+    <w:p>
+      <w:pPr>
+        <w:pStyle w:val="BodyText"/>
+        <w:spacing w:line="360" w:lineRule="auto" w:after="80" w:before="0"/>
+        <w:ind w:firstLine="0"/>
+      </w:pPr>
+      <w:r>
+        <w:t xml:space="preserve">The same analysis ranked genes disrupted by structural variants and</w:t>
+      </w:r>
+      <w:r>
+        <w:t xml:space="preserve"> </w:t>
+      </w:r>
+      <w:r>
+        <w:t xml:space="preserve">found that the highest-priority events aligned with recognized pediatric</w:t>
+      </w:r>
+      <w:r>
+        <w:t xml:space="preserve"> </w:t>
+      </w:r>
+      <w:r>
+        <w:t xml:space="preserve">cancer drivers, while adult cohorts were enriched for disruptions</w:t>
+      </w:r>
+      <w:r>
+        <w:t xml:space="preserve"> </w:t>
+      </w:r>
+      <w:r>
+        <w:t xml:space="preserve">involving fragile genomic regions</w:t>
+      </w:r>
+      <w:r>
+        <w:rPr>
+          <w:vertAlign w:val="superscript"/>
+        </w:rPr>
+        <w:t xml:space="preserve">1</w:t>
+      </w:r>
+      <w:r>
+        <w:t xml:space="preserve">. This contrast suggested</w:t>
+      </w:r>
+      <w:r>
+        <w:t xml:space="preserve"> </w:t>
+      </w:r>
+      <w:r>
+        <w:t xml:space="preserve">that pediatric structural variation more often tracks direct driver</w:t>
+      </w:r>
+      <w:r>
+        <w:t xml:space="preserve"> </w:t>
+      </w:r>
+      <w:r>
+        <w:t xml:space="preserve">selection, whereas adult rearrangement landscapes carry a larger imprint</w:t>
+      </w:r>
+      <w:r>
+        <w:t xml:space="preserve"> </w:t>
+      </w:r>
+      <w:r>
+        <w:t xml:space="preserve">of accumulated genomic instability.</w:t>
+      </w:r>
+    </w:p>
+    <w:p>
+      <w:pPr>
+        <w:pStyle w:val="BodyText"/>
+        <w:spacing w:line="360" w:lineRule="auto" w:after="80" w:before="0"/>
+        <w:ind w:firstLine="0"/>
+      </w:pPr>
+      <w:r>
+        <w:t xml:space="preserve">A second notable result concerned hotspot architecture near RAG</w:t>
+      </w:r>
+      <w:r>
+        <w:t xml:space="preserve"> </w:t>
+      </w:r>
+      <w:r>
+        <w:t xml:space="preserve">recombination signal sequences. In pediatric acute lymphoblastic</w:t>
+      </w:r>
+      <w:r>
+        <w:t xml:space="preserve"> </w:t>
+      </w:r>
+      <w:r>
+        <w:t xml:space="preserve">leukemias, recurrent hotspots affected both immune loci and oncogenic</w:t>
+      </w:r>
+      <w:r>
+        <w:t xml:space="preserve"> </w:t>
+      </w:r>
+      <w:r>
+        <w:t xml:space="preserve">driver genes, while adult lymphoid cancers were described as showing</w:t>
+      </w:r>
+      <w:r>
+        <w:t xml:space="preserve"> </w:t>
+      </w:r>
+      <w:r>
+        <w:t xml:space="preserve">disruption of immune loci without the same degree of pediatric driver</w:t>
+      </w:r>
+      <w:r>
+        <w:t xml:space="preserve"> </w:t>
+      </w:r>
+      <w:r>
+        <w:t xml:space="preserve">involvement</w:t>
+      </w:r>
+      <w:r>
+        <w:rPr>
+          <w:vertAlign w:val="superscript"/>
+        </w:rPr>
+        <w:t xml:space="preserve">1</w:t>
+      </w:r>
+      <w:r>
+        <w:t xml:space="preserve">.</w:t>
+      </w:r>
+    </w:p>
+    <w:p>
+      <w:pPr>
+        <w:pStyle w:val="BodyText"/>
+        <w:spacing w:line="360" w:lineRule="auto" w:after="80" w:before="0"/>
+        <w:ind w:firstLine="0"/>
+      </w:pPr>
+      <w:r>
+        <w:t xml:space="preserve">Finally, signature extraction and longitudinal clustering added an</w:t>
+      </w:r>
+      <w:r>
+        <w:t xml:space="preserve"> </w:t>
+      </w:r>
+      <w:r>
+        <w:t xml:space="preserve">evolutionary perspective. The authors described ten structural-variation</w:t>
+      </w:r>
+      <w:r>
+        <w:t xml:space="preserve"> </w:t>
+      </w:r>
+      <w:r>
+        <w:t xml:space="preserve">signatures, implicated RAG-mediated mutagenesis in the etiology of</w:t>
+      </w:r>
+      <w:r>
+        <w:t xml:space="preserve"> </w:t>
+      </w:r>
+      <w:r>
+        <w:t xml:space="preserve">COSMIC SV7 within lymphoid cancers, and used multiple samples from 13</w:t>
+      </w:r>
+      <w:r>
+        <w:t xml:space="preserve"> </w:t>
+      </w:r>
+      <w:r>
+        <w:t xml:space="preserve">patients to illustrate that structural variants continue to shape</w:t>
+      </w:r>
+      <w:r>
+        <w:t xml:space="preserve"> </w:t>
+      </w:r>
+      <w:r>
+        <w:t xml:space="preserve">intra-tumor heterogeneity over time</w:t>
+      </w:r>
+      <w:r>
+        <w:rPr>
+          <w:vertAlign w:val="superscript"/>
+        </w:rPr>
+        <w:t xml:space="preserve">1</w:t>
+      </w:r>
+      <w:r>
+        <w:t xml:space="preserve">.</w:t>
+      </w:r>
+    </w:p>
+    <w:bookmarkEnd w:id="28"/>
+    <w:bookmarkStart w:id="29" w:name="discussion"/>
+    <w:p>
+      <w:pPr>
+        <w:pStyle w:val="1"/>
+        <w:spacing w:line="360" w:lineRule="auto" w:after="80" w:before="0"/>
+        <w:ind w:firstLine="0"/>
+      </w:pPr>
+      <w:r>
+        <w:t xml:space="preserve">Discussion</w:t>
+      </w:r>
+    </w:p>
+    <w:p>
+      <w:pPr>
+        <w:pStyle w:val="FirstParagraph"/>
+        <w:spacing w:line="360" w:lineRule="auto" w:after="80" w:before="0"/>
+        <w:ind w:firstLine="0"/>
+      </w:pPr>
+      <w:r>
+        <w:t xml:space="preserve">From a translational perspective, this public study reinforces that</w:t>
+      </w:r>
+      <w:r>
+        <w:t xml:space="preserve"> </w:t>
+      </w:r>
+      <w:r>
+        <w:t xml:space="preserve">structural variation should not be treated as a secondary genomic layer</w:t>
+      </w:r>
+      <w:r>
+        <w:t xml:space="preserve"> </w:t>
+      </w:r>
+      <w:r>
+        <w:t xml:space="preserve">in pediatric oncology. Even when overall rearrangement burden is lower</w:t>
+      </w:r>
+      <w:r>
+        <w:t xml:space="preserve"> </w:t>
+      </w:r>
+      <w:r>
+        <w:t xml:space="preserve">than that in adult solid tumors, the disrupted loci can still</w:t>
+      </w:r>
+      <w:r>
+        <w:t xml:space="preserve"> </w:t>
+      </w:r>
+      <w:r>
+        <w:t xml:space="preserve">concentrate in biologically decisive drivers and therefore remain highly</w:t>
+      </w:r>
+      <w:r>
+        <w:t xml:space="preserve"> </w:t>
+      </w:r>
+      <w:r>
+        <w:t xml:space="preserve">relevant for disease classification and downstream clinical testing</w:t>
+      </w:r>
+      <w:r>
+        <w:rPr>
+          <w:vertAlign w:val="superscript"/>
+        </w:rPr>
+        <w:t xml:space="preserve">1</w:t>
+      </w:r>
+      <w:r>
+        <w:t xml:space="preserve">.</w:t>
+      </w:r>
+    </w:p>
+    <w:p>
+      <w:pPr>
+        <w:pStyle w:val="BodyText"/>
+        <w:spacing w:line="360" w:lineRule="auto" w:after="80" w:before="0"/>
+        <w:ind w:firstLine="0"/>
+      </w:pPr>
+      <w:r>
+        <w:t xml:space="preserve">The RAG-associated hotspot and signature findings are also important</w:t>
+      </w:r>
+      <w:r>
+        <w:t xml:space="preserve"> </w:t>
+      </w:r>
+      <w:r>
+        <w:t xml:space="preserve">conceptually because they connect genome architecture to</w:t>
+      </w:r>
+      <w:r>
+        <w:t xml:space="preserve"> </w:t>
+      </w:r>
+      <w:r>
+        <w:t xml:space="preserve">lineage-specific mutational processes. That link helps explain why</w:t>
+      </w:r>
+      <w:r>
+        <w:t xml:space="preserve"> </w:t>
+      </w:r>
+      <w:r>
+        <w:t xml:space="preserve">lymphoid malignancies may display recurrent rearrangement patterns that</w:t>
+      </w:r>
+      <w:r>
+        <w:t xml:space="preserve"> </w:t>
+      </w:r>
+      <w:r>
+        <w:t xml:space="preserve">differ from those seen in non-hematological tumors and provides a</w:t>
+      </w:r>
+      <w:r>
+        <w:t xml:space="preserve"> </w:t>
+      </w:r>
+      <w:r>
+        <w:t xml:space="preserve">clearer mechanistic narrative than burden summaries alone</w:t>
+      </w:r>
+      <w:r>
+        <w:rPr>
+          <w:vertAlign w:val="superscript"/>
+        </w:rPr>
+        <w:t xml:space="preserve">1</w:t>
+      </w:r>
+      <w:r>
+        <w:t xml:space="preserve">.</w:t>
+      </w:r>
+    </w:p>
+    <w:p>
+      <w:pPr>
+        <w:pStyle w:val="BodyText"/>
+        <w:spacing w:line="360" w:lineRule="auto" w:after="80" w:before="0"/>
+        <w:ind w:firstLine="0"/>
+      </w:pPr>
+      <w:r>
+        <w:t xml:space="preserve">This repository example intentionally stops at the level of a concise</w:t>
+      </w:r>
+      <w:r>
+        <w:t xml:space="preserve"> </w:t>
+      </w:r>
+      <w:r>
+        <w:t xml:space="preserve">public summary. Users who need full methodological detail, extended</w:t>
+      </w:r>
+      <w:r>
+        <w:t xml:space="preserve"> </w:t>
+      </w:r>
+      <w:r>
+        <w:t xml:space="preserve">figure interpretation, or exact supplemental evidence should consult the</w:t>
+      </w:r>
+      <w:r>
+        <w:t xml:space="preserve"> </w:t>
+      </w:r>
+      <w:r>
+        <w:t xml:space="preserve">published article directly rather than rely on this demonstration text.</w:t>
+      </w:r>
+      <w:r>
+        <w:t xml:space="preserve"> </w:t>
+      </w:r>
+      <w:r>
+        <w:t xml:space="preserve">The value of the current project lies in showing how an openly shareable</w:t>
+      </w:r>
+      <w:r>
+        <w:t xml:space="preserve"> </w:t>
+      </w:r>
+      <w:r>
+        <w:t xml:space="preserve">manuscript skeleton can be rendered into publication-style PDF and DOCX</w:t>
+      </w:r>
+      <w:r>
+        <w:t xml:space="preserve"> </w:t>
+      </w:r>
+      <w:r>
+        <w:t xml:space="preserve">artifacts with a single build command.</w:t>
+      </w:r>
+    </w:p>
+    <w:bookmarkEnd w:id="29"/>
+    <w:bookmarkStart w:id="30" w:name="conclusion"/>
+    <w:p>
+      <w:pPr>
+        <w:pStyle w:val="1"/>
+        <w:spacing w:line="360" w:lineRule="auto" w:after="80" w:before="0"/>
+        <w:ind w:firstLine="0"/>
+      </w:pPr>
+      <w:r>
+        <w:t xml:space="preserve">Conclusion</w:t>
+      </w:r>
+    </w:p>
+    <w:p>
+      <w:pPr>
+        <w:pStyle w:val="FirstParagraph"/>
+        <w:spacing w:line="360" w:lineRule="auto" w:after="80" w:before="0"/>
+        <w:ind w:firstLine="0"/>
+      </w:pPr>
+      <w:r>
+        <w:t xml:space="preserve">This</w:t>
+      </w:r>
+      <w:r>
+        <w:t xml:space="preserve"> </w:t>
+      </w:r>
+      <w:r>
+        <w:rPr>
+          <w:rStyle w:val="VerbatimChar"/>
+        </w:rPr>
+        <w:t xml:space="preserve">paper-sci-01</w:t>
+      </w:r>
+      <w:r>
+        <w:t xml:space="preserve"> </w:t>
+      </w:r>
+      <w:r>
+        <w:t xml:space="preserve">example demonstrates that</w:t>
+      </w:r>
+      <w:r>
+        <w:t xml:space="preserve"> </w:t>
+      </w:r>
+      <w:r>
+        <w:rPr>
+          <w:rStyle w:val="VerbatimChar"/>
+        </w:rPr>
+        <w:t xml:space="preserve">bensz-paper</w:t>
+      </w:r>
+      <w:r>
+        <w:t xml:space="preserve"> </w:t>
+      </w:r>
+      <w:r>
+        <w:t xml:space="preserve">can host a</w:t>
+      </w:r>
+      <w:r>
+        <w:t xml:space="preserve"> </w:t>
+      </w:r>
+      <w:r>
+        <w:t xml:space="preserve">complete SCI-style writing workflow with one public source of truth and</w:t>
+      </w:r>
+      <w:r>
+        <w:t xml:space="preserve"> </w:t>
+      </w:r>
+      <w:r>
+        <w:t xml:space="preserve">dual PDF/DOCX outputs. The sample text highlights how</w:t>
+      </w:r>
+      <w:r>
+        <w:t xml:space="preserve"> </w:t>
+      </w:r>
+      <w:r>
+        <w:t xml:space="preserve">structural-variation profiling reveals disease-specific patterns, driver</w:t>
+      </w:r>
+      <w:r>
+        <w:t xml:space="preserve"> </w:t>
+      </w:r>
+      <w:r>
+        <w:t xml:space="preserve">disruption, RAG-associated hotspots, and ongoing clonal evolution in</w:t>
+      </w:r>
+      <w:r>
+        <w:t xml:space="preserve"> </w:t>
+      </w:r>
+      <w:r>
+        <w:t xml:space="preserve">pediatric cancer, while the project structure itself serves as a</w:t>
+      </w:r>
+      <w:r>
+        <w:t xml:space="preserve"> </w:t>
+      </w:r>
+      <w:r>
+        <w:t xml:space="preserve">reusable starting point for future manuscripts</w:t>
+      </w:r>
+      <w:r>
+        <w:rPr>
+          <w:vertAlign w:val="superscript"/>
+        </w:rPr>
+        <w:t xml:space="preserve">1</w:t>
+      </w:r>
+      <w:r>
+        <w:t xml:space="preserve">.</w:t>
+      </w:r>
+    </w:p>
+    <w:bookmarkEnd w:id="30"/>
+    <w:bookmarkStart w:id="35" w:name="additional-information"/>
+    <w:p>
+      <w:pPr>
+        <w:pStyle w:val="1"/>
+        <w:spacing w:line="360" w:lineRule="auto" w:after="80" w:before="0"/>
+        <w:ind w:firstLine="0"/>
+      </w:pPr>
+      <w:r>
+        <w:t xml:space="preserve">Additional information</w:t>
+      </w:r>
+    </w:p>
+    <w:bookmarkStart w:id="31" w:name="source-statement"/>
     <w:p>
       <w:pPr>
         <w:pStyle w:val="2"/>
@@ -118,7 +1164,7 @@
         <w:ind w:firstLine="0"/>
       </w:pPr>
       <w:r>
-        <w:t xml:space="preserve">Abstract</w:t>
+        <w:t xml:space="preserve">Source statement</w:t>
       </w:r>
     </w:p>
     <w:p>
@@ -128,7 +1174,13 @@
         <w:ind w:firstLine="0"/>
       </w:pPr>
       <w:r>
-        <w:t xml:space="preserve">This public demonstration manuscript reformats the main messages of a recently published</w:t>
+        <w:t xml:space="preserve">This project is a formatting demonstration derived from public metadata</w:t>
+      </w:r>
+      <w:r>
+        <w:t xml:space="preserve"> </w:t>
+      </w:r>
+      <w:r>
+        <w:t xml:space="preserve">and abstract-level findings of Greenhalgh et al.,</w:t>
       </w:r>
       <w:r>
         <w:t xml:space="preserve"> </w:t>
@@ -144,7 +1196,66 @@
         <w:t xml:space="preserve"> </w:t>
       </w:r>
       <w:r>
-        <w:t xml:space="preserve">study on structural variation in pediatric cancer into the</w:t>
+        <w:t xml:space="preserve">2026</w:t>
+      </w:r>
+      <w:r>
+        <w:rPr>
+          <w:vertAlign w:val="superscript"/>
+        </w:rPr>
+        <w:t xml:space="preserve">1</w:t>
+      </w:r>
+      <w:r>
+        <w:t xml:space="preserve">. It is</w:t>
+      </w:r>
+      <w:r>
+        <w:t xml:space="preserve"> </w:t>
+      </w:r>
+      <w:r>
+        <w:rPr>
+          <w:b/>
+          <w:bCs/>
+        </w:rPr>
+        <w:t xml:space="preserve">not</w:t>
+      </w:r>
+      <w:r>
+        <w:t xml:space="preserve"> </w:t>
+      </w:r>
+      <w:r>
+        <w:t xml:space="preserve">the publisher PDF, not the article’s</w:t>
+      </w:r>
+      <w:r>
+        <w:t xml:space="preserve"> </w:t>
+      </w:r>
+      <w:r>
+        <w:t xml:space="preserve">original full text, and not an unpublished manuscript.</w:t>
+      </w:r>
+    </w:p>
+    <w:bookmarkEnd w:id="31"/>
+    <w:bookmarkStart w:id="32" w:name="availability-of-materials"/>
+    <w:p>
+      <w:pPr>
+        <w:pStyle w:val="2"/>
+        <w:spacing w:line="360" w:lineRule="auto" w:after="80" w:before="0"/>
+        <w:ind w:firstLine="0"/>
+      </w:pPr>
+      <w:r>
+        <w:t xml:space="preserve">Availability of materials</w:t>
+      </w:r>
+    </w:p>
+    <w:p>
+      <w:pPr>
+        <w:pStyle w:val="FirstParagraph"/>
+        <w:spacing w:line="360" w:lineRule="auto" w:after="80" w:before="0"/>
+        <w:ind w:firstLine="0"/>
+      </w:pPr>
+      <w:r>
+        <w:t xml:space="preserve">All editable source files required to rebuild this demonstration project</w:t>
+      </w:r>
+      <w:r>
+        <w:t xml:space="preserve"> </w:t>
+      </w:r>
+      <w:r>
+        <w:t xml:space="preserve">are stored in this repository, with manuscript content maintained under</w:t>
       </w:r>
       <w:r>
         <w:t xml:space="preserve"> </w:t>
@@ -153,45 +1264,102 @@
         <w:rPr>
           <w:rStyle w:val="VerbatimChar"/>
         </w:rPr>
+        <w:t xml:space="preserve">projects/paper-sci-01/extraTex/</w:t>
+      </w:r>
+      <w:r>
+        <w:t xml:space="preserve">. Generated artifacts are written to</w:t>
+      </w:r>
+      <w:r>
+        <w:t xml:space="preserve"> </w:t>
+      </w:r>
+      <w:r>
+        <w:rPr>
+          <w:rStyle w:val="VerbatimChar"/>
+        </w:rPr>
+        <w:t xml:space="preserve">.latex-cache/</w:t>
+      </w:r>
+      <w:r>
+        <w:t xml:space="preserve">,</w:t>
+      </w:r>
+      <w:r>
+        <w:t xml:space="preserve"> </w:t>
+      </w:r>
+      <w:r>
+        <w:rPr>
+          <w:rStyle w:val="VerbatimChar"/>
+        </w:rPr>
+        <w:t xml:space="preserve">main.pdf</w:t>
+      </w:r>
+      <w:r>
+        <w:t xml:space="preserve">, and</w:t>
+      </w:r>
+      <w:r>
+        <w:t xml:space="preserve"> </w:t>
+      </w:r>
+      <w:r>
+        <w:rPr>
+          <w:rStyle w:val="VerbatimChar"/>
+        </w:rPr>
+        <w:t xml:space="preserve">main.docx</w:t>
+      </w:r>
+      <w:r>
+        <w:t xml:space="preserve"> </w:t>
+      </w:r>
+      <w:r>
+        <w:t xml:space="preserve">during the official build</w:t>
+      </w:r>
+      <w:r>
+        <w:t xml:space="preserve"> </w:t>
+      </w:r>
+      <w:r>
+        <w:t xml:space="preserve">process.</w:t>
+      </w:r>
+    </w:p>
+    <w:bookmarkEnd w:id="32"/>
+    <w:bookmarkStart w:id="33" w:name="funding"/>
+    <w:p>
+      <w:pPr>
+        <w:pStyle w:val="2"/>
+        <w:spacing w:line="360" w:lineRule="auto" w:after="80" w:before="0"/>
+        <w:ind w:firstLine="0"/>
+      </w:pPr>
+      <w:r>
+        <w:t xml:space="preserve">Funding</w:t>
+      </w:r>
+    </w:p>
+    <w:p>
+      <w:pPr>
+        <w:pStyle w:val="FirstParagraph"/>
+        <w:spacing w:line="360" w:lineRule="auto" w:after="80" w:before="0"/>
+        <w:ind w:firstLine="0"/>
+      </w:pPr>
+      <w:r>
+        <w:t xml:space="preserve">No external funding was associated with this demonstration manuscript.</w:t>
+      </w:r>
+      <w:r>
+        <w:t xml:space="preserve"> </w:t>
+      </w:r>
+      <w:r>
+        <w:t xml:space="preserve">The sample exists solely to validate the</w:t>
+      </w:r>
+      <w:r>
+        <w:t xml:space="preserve"> </w:t>
+      </w:r>
+      <w:r>
+        <w:rPr>
+          <w:rStyle w:val="VerbatimChar"/>
+        </w:rPr>
         <w:t xml:space="preserve">bensz-paper</w:t>
       </w:r>
       <w:r>
         <w:t xml:space="preserve"> </w:t>
       </w:r>
       <w:r>
-        <w:t xml:space="preserve">workflow. The source article reported pan-cancer analyses across 1,616 pediatric and 2,203 adult whole genomes and showed that structural-variation burden differed markedly across pediatric cancer types, remained much lower than that of most adult solid tumors, and was nevertheless highly informative for leukemias and other hematological malignancies</w:t>
-      </w:r>
-      <w:r>
-        <w:rPr>
-          <w:vertAlign w:val="superscript"/>
-        </w:rPr>
-        <w:t xml:space="preserve">1</w:t>
-      </w:r>
-      <w:r>
-        <w:t xml:space="preserve">.</w:t>
-      </w:r>
-    </w:p>
-    <w:p>
-      <w:pPr>
-        <w:pStyle w:val="BodyText"/>
-        <w:spacing w:line="360" w:lineRule="auto" w:after="80" w:before="0"/>
-        <w:ind w:firstLine="0"/>
-      </w:pPr>
-      <w:r>
-        <w:t xml:space="preserve">The same study further highlighted recurrent disruption of driver genes, distinct hotspot patterns around RAG recombination signal sequences, and signature-level evidence that RAG-mediated mutagenesis contributes to part of the lymphoid structural-variation landscape</w:t>
-      </w:r>
-      <w:r>
-        <w:rPr>
-          <w:vertAlign w:val="superscript"/>
-        </w:rPr>
-        <w:t xml:space="preserve">1</w:t>
-      </w:r>
-      <w:r>
-        <w:t xml:space="preserve">. Here we condense those public findings into a journal-style example project whose purpose is typesetting validation rather than scientific novelty.</w:t>
-      </w:r>
-    </w:p>
-    <w:bookmarkEnd w:id="24"/>
-    <w:bookmarkStart w:id="25" w:name="introduction"/>
+        <w:t xml:space="preserve">package workflow.</w:t>
+      </w:r>
+    </w:p>
+    <w:bookmarkEnd w:id="33"/>
+    <w:bookmarkStart w:id="34" w:name="competing-interests"/>
     <w:p>
       <w:pPr>
         <w:pStyle w:val="2"/>
@@ -199,7 +1367,7 @@
         <w:ind w:firstLine="0"/>
       </w:pPr>
       <w:r>
-        <w:t xml:space="preserve">Introduction</w:t>
+        <w:t xml:space="preserve">Competing interests</w:t>
       </w:r>
     </w:p>
     <w:p>
@@ -209,74 +1377,18 @@
         <w:ind w:firstLine="0"/>
       </w:pPr>
       <w:r>
-        <w:t xml:space="preserve">Structural variants are a major source of oncogenic activation, tumor suppressor loss, enhancer hijacking, and genome reorganization. In pediatric tumors, however, broad pan-cancer summaries of structural variation have historically lagged behind point-mutation catalogs, which made it harder to compare disease classes within a unified framework.</w:t>
-      </w:r>
-    </w:p>
-    <w:p>
-      <w:pPr>
-        <w:pStyle w:val="BodyText"/>
-        <w:spacing w:line="360" w:lineRule="auto" w:after="80" w:before="0"/>
-        <w:ind w:firstLine="360"/>
-      </w:pPr>
-      <w:r>
-        <w:t xml:space="preserve">Earlier pediatric pan-cancer genomics efforts and whole-cancer structural-variation surveys provided important context for that gap by outlining recurrent genomic alterations across childhood cancers and by formalizing major rearrangement patterns across human malignancies</w:t>
-      </w:r>
-      <w:r>
-        <w:rPr>
-          <w:vertAlign w:val="superscript"/>
-        </w:rPr>
-        <w:t xml:space="preserve">2–4</w:t>
-      </w:r>
-      <w:r>
-        <w:t xml:space="preserve">.</w:t>
-      </w:r>
-    </w:p>
-    <w:p>
-      <w:pPr>
-        <w:pStyle w:val="BodyText"/>
-        <w:spacing w:line="360" w:lineRule="auto" w:after="80" w:before="0"/>
-        <w:ind w:firstLine="360"/>
-      </w:pPr>
-      <w:r>
-        <w:t xml:space="preserve">The public study by Greenhalgh and colleagues addressed that gap by surveying pediatric and adult whole-genome cohorts side by side and by focusing on the biological consequences of rearrangements instead of only their raw counts</w:t>
-      </w:r>
-      <w:r>
-        <w:rPr>
-          <w:vertAlign w:val="superscript"/>
-        </w:rPr>
-        <w:t xml:space="preserve">1</w:t>
-      </w:r>
-      <w:r>
-        <w:t xml:space="preserve">. Their work is especially useful as a formatting example because it combines large-cohort genomics, mutation signatures, and clinically relevant language in a conventional IMRaD structure.</w:t>
-      </w:r>
-    </w:p>
-    <w:p>
-      <w:pPr>
-        <w:pStyle w:val="BodyText"/>
-        <w:spacing w:line="360" w:lineRule="auto" w:after="80" w:before="0"/>
-        <w:ind w:firstLine="360"/>
-      </w:pPr>
-      <w:r>
-        <w:t xml:space="preserve">This project does not reproduce the journal article verbatim. Instead, it uses publicly accessible metadata and abstract-level findings to create a clean demonstration manuscript for the</w:t>
-      </w:r>
-      <w:r>
-        <w:t xml:space="preserve"> </w:t>
-      </w:r>
-      <w:r>
-        <w:rPr>
-          <w:rStyle w:val="VerbatimChar"/>
-        </w:rPr>
-        <w:t xml:space="preserve">bensz-paper</w:t>
-      </w:r>
-      <w:r>
-        <w:t xml:space="preserve"> </w:t>
-      </w:r>
-      <w:r>
-        <w:t xml:space="preserve">package. The goal is to give repository users a ready-to-render SCI template with both PDF and Word outputs while keeping the sample text openly shareable.</w:t>
-      </w:r>
-    </w:p>
-    <w:bookmarkEnd w:id="25"/>
-    <w:bookmarkStart w:id="26" w:name="methods"/>
+        <w:t xml:space="preserve">The authors of this demonstration template declare no competing</w:t>
+      </w:r>
+      <w:r>
+        <w:t xml:space="preserve"> </w:t>
+      </w:r>
+      <w:r>
+        <w:t xml:space="preserve">interests related to the sample text or build workflow.</w:t>
+      </w:r>
+    </w:p>
+    <w:bookmarkEnd w:id="34"/>
+    <w:bookmarkEnd w:id="35"/>
+    <w:bookmarkStart w:id="36" w:name="figure-legends"/>
     <w:p>
       <w:pPr>
         <w:pStyle w:val="2"/>
@@ -284,357 +1396,24 @@
         <w:ind w:firstLine="0"/>
       </w:pPr>
       <w:r>
-        <w:t xml:space="preserve">Methods</w:t>
-      </w:r>
-    </w:p>
-    <w:p>
-      <w:pPr>
-        <w:pStyle w:val="FirstParagraph"/>
-        <w:spacing w:line="360" w:lineRule="auto" w:after="80" w:before="0"/>
-        <w:ind w:firstLine="0"/>
-      </w:pPr>
-      <w:r>
-        <w:t xml:space="preserve">For this demonstration project, we used only public information available from the published bibliographic record and abstract of the source article</w:t>
-      </w:r>
-      <w:r>
-        <w:rPr>
-          <w:vertAlign w:val="superscript"/>
-        </w:rPr>
-        <w:t xml:space="preserve">1</w:t>
-      </w:r>
-      <w:r>
-        <w:t xml:space="preserve">. No unpublished files, figures, supplementary tables, or protected full-text material from other manuscripts were imported into this repository.</w:t>
-      </w:r>
-    </w:p>
-    <w:p>
-      <w:pPr>
-        <w:pStyle w:val="BodyText"/>
-        <w:spacing w:line="360" w:lineRule="auto" w:after="80" w:before="0"/>
-        <w:ind w:firstLine="360"/>
-      </w:pPr>
-      <w:r>
-        <w:t xml:space="preserve">The manuscript body was rewritten as an original summary and then stored in Markdown fragments under</w:t>
-      </w:r>
-      <w:r>
-        <w:t xml:space="preserve"> </w:t>
-      </w:r>
-      <w:r>
-        <w:rPr>
-          <w:rStyle w:val="VerbatimChar"/>
-        </w:rPr>
-        <w:t xml:space="preserve">artifacts/source/</w:t>
-      </w:r>
-      <w:r>
-        <w:t xml:space="preserve">. During build,</w:t>
-      </w:r>
-      <w:r>
-        <w:t xml:space="preserve"> </w:t>
-      </w:r>
-      <w:r>
-        <w:rPr>
-          <w:rStyle w:val="VerbatimChar"/>
-        </w:rPr>
-        <w:t xml:space="preserve">packages/bensz-paper/scripts/manuscript_tool.py</w:t>
-      </w:r>
-      <w:r>
-        <w:t xml:space="preserve"> </w:t>
-      </w:r>
-      <w:r>
-        <w:t xml:space="preserve">converts those fragments into LaTeX section files inside</w:t>
-      </w:r>
-      <w:r>
-        <w:t xml:space="preserve"> </w:t>
-      </w:r>
-      <w:r>
-        <w:rPr>
-          <w:rStyle w:val="VerbatimChar"/>
-        </w:rPr>
-        <w:t xml:space="preserve">.latex-cache/extraTex/</w:t>
-      </w:r>
-      <w:r>
-        <w:t xml:space="preserve"> </w:t>
-      </w:r>
-      <w:r>
-        <w:t xml:space="preserve">for PDF compilation and into a consolidated Markdown document for Pandoc-based DOCX export.</w:t>
-      </w:r>
-    </w:p>
-    <w:p>
-      <w:pPr>
-        <w:pStyle w:val="BodyText"/>
-        <w:spacing w:line="360" w:lineRule="auto" w:after="80" w:before="0"/>
-        <w:ind w:firstLine="360"/>
-      </w:pPr>
-      <w:r>
-        <w:t xml:space="preserve">PDF rendering follows the fixed sequence</w:t>
-      </w:r>
-      <w:r>
-        <w:t xml:space="preserve"> </w:t>
-      </w:r>
-      <w:r>
-        <w:rPr>
-          <w:rStyle w:val="VerbatimChar"/>
-        </w:rPr>
-        <w:t xml:space="preserve">xelatex -&gt; biber -&gt; xelatex -&gt; xelatex</w:t>
-      </w:r>
-      <w:r>
-        <w:t xml:space="preserve">. DOCX rendering uses Pandoc with the bundled</w:t>
-      </w:r>
-      <w:r>
-        <w:t xml:space="preserve"> </w:t>
-      </w:r>
-      <w:r>
-        <w:rPr>
-          <w:rStyle w:val="VerbatimChar"/>
-        </w:rPr>
-        <w:t xml:space="preserve">reference.docx</w:t>
-      </w:r>
-      <w:r>
-        <w:t xml:space="preserve"> </w:t>
-      </w:r>
-      <w:r>
-        <w:t xml:space="preserve">and CSL file, after which a post-processing step normalizes line spacing, paragraph spacing, and bibliography placement so that the Word output remains visually close to the LaTeX PDF.</w:t>
-      </w:r>
-    </w:p>
-    <w:bookmarkEnd w:id="26"/>
-    <w:bookmarkStart w:id="27" w:name="results"/>
-    <w:p>
-      <w:pPr>
-        <w:pStyle w:val="2"/>
-        <w:spacing w:line="360" w:lineRule="auto" w:after="80" w:before="0"/>
-        <w:ind w:firstLine="0"/>
-      </w:pPr>
-      <w:r>
-        <w:t xml:space="preserve">Results</w:t>
-      </w:r>
-    </w:p>
-    <w:p>
-      <w:pPr>
-        <w:pStyle w:val="FirstParagraph"/>
-        <w:spacing w:line="360" w:lineRule="auto" w:after="80" w:before="0"/>
-        <w:ind w:firstLine="0"/>
-      </w:pPr>
-      <w:r>
-        <w:t xml:space="preserve">Greenhalgh et al. reported that structural-variation burden varied by roughly two orders of magnitude across pediatric cancer types, underscoring that rearrangement biology is highly disease-specific rather than uniform across childhood malignancies</w:t>
-      </w:r>
-      <w:r>
-        <w:rPr>
-          <w:vertAlign w:val="superscript"/>
-        </w:rPr>
-        <w:t xml:space="preserve">1</w:t>
-      </w:r>
-      <w:r>
-        <w:t xml:space="preserve">. Compared with adult brain and solid tumors, most pediatric solid cancers carried substantially fewer structural variants, whereas hematological malignancies showed a much closer burden profile.</w:t>
-      </w:r>
-    </w:p>
-    <w:p>
-      <w:pPr>
-        <w:pStyle w:val="BodyText"/>
-        <w:spacing w:line="360" w:lineRule="auto" w:after="80" w:before="0"/>
-        <w:ind w:firstLine="360"/>
-      </w:pPr>
-      <w:r>
-        <w:t xml:space="preserve">The same analysis ranked genes disrupted by structural variants and found that the highest-priority events aligned with recognized pediatric cancer drivers, while adult cohorts were enriched for disruptions involving fragile genomic regions</w:t>
-      </w:r>
-      <w:r>
-        <w:rPr>
-          <w:vertAlign w:val="superscript"/>
-        </w:rPr>
-        <w:t xml:space="preserve">1</w:t>
-      </w:r>
-      <w:r>
-        <w:t xml:space="preserve">. This contrast suggested that pediatric structural variation more often tracks direct driver selection, whereas adult rearrangement landscapes carry a larger imprint of accumulated genomic instability.</w:t>
-      </w:r>
-    </w:p>
-    <w:p>
-      <w:pPr>
-        <w:pStyle w:val="BodyText"/>
-        <w:spacing w:line="360" w:lineRule="auto" w:after="80" w:before="0"/>
-        <w:ind w:firstLine="360"/>
-      </w:pPr>
-      <w:r>
-        <w:t xml:space="preserve">A second notable result concerned hotspot architecture near RAG recombination signal sequences. In pediatric acute lymphoblastic leukemias, recurrent hotspots affected both immune loci and oncogenic driver genes, while adult lymphoid cancers were described as showing disruption of immune loci without the same degree of pediatric driver involvement</w:t>
-      </w:r>
-      <w:r>
-        <w:rPr>
-          <w:vertAlign w:val="superscript"/>
-        </w:rPr>
-        <w:t xml:space="preserve">1</w:t>
-      </w:r>
-      <w:r>
-        <w:t xml:space="preserve">.</w:t>
-      </w:r>
-    </w:p>
-    <w:p>
-      <w:pPr>
-        <w:pStyle w:val="BodyText"/>
-        <w:spacing w:line="360" w:lineRule="auto" w:after="80" w:before="0"/>
-        <w:ind w:firstLine="360"/>
-      </w:pPr>
-      <w:r>
-        <w:t xml:space="preserve">Finally, signature extraction and longitudinal clustering added an evolutionary perspective. The authors described ten structural-variation signatures, implicated RAG-mediated mutagenesis in the etiology of COSMIC SV7 within lymphoid cancers, and used multiple samples from 13 patients to illustrate that structural variants continue to shape intra-tumor heterogeneity over time</w:t>
-      </w:r>
-      <w:r>
-        <w:rPr>
-          <w:vertAlign w:val="superscript"/>
-        </w:rPr>
-        <w:t xml:space="preserve">1</w:t>
-      </w:r>
-      <w:r>
-        <w:t xml:space="preserve">.</w:t>
-      </w:r>
-    </w:p>
-    <w:bookmarkEnd w:id="27"/>
-    <w:bookmarkStart w:id="28" w:name="discussion"/>
-    <w:p>
-      <w:pPr>
-        <w:pStyle w:val="2"/>
-        <w:spacing w:line="360" w:lineRule="auto" w:after="80" w:before="0"/>
-        <w:ind w:firstLine="0"/>
-      </w:pPr>
-      <w:r>
-        <w:t xml:space="preserve">Discussion</w:t>
-      </w:r>
-    </w:p>
-    <w:p>
-      <w:pPr>
-        <w:pStyle w:val="FirstParagraph"/>
-        <w:spacing w:line="360" w:lineRule="auto" w:after="80" w:before="0"/>
-        <w:ind w:firstLine="0"/>
-      </w:pPr>
-      <w:r>
-        <w:t xml:space="preserve">From a translational perspective, this public study reinforces that structural variation should not be treated as a secondary genomic layer in pediatric oncology. Even when overall rearrangement burden is lower than that in adult solid tumors, the disrupted loci can still concentrate in biologically decisive drivers and therefore remain highly relevant for disease classification and downstream clinical testing</w:t>
-      </w:r>
-      <w:r>
-        <w:rPr>
-          <w:vertAlign w:val="superscript"/>
-        </w:rPr>
-        <w:t xml:space="preserve">1</w:t>
-      </w:r>
-      <w:r>
-        <w:t xml:space="preserve">.</w:t>
-      </w:r>
-    </w:p>
-    <w:p>
-      <w:pPr>
-        <w:pStyle w:val="BodyText"/>
-        <w:spacing w:line="360" w:lineRule="auto" w:after="80" w:before="0"/>
-        <w:ind w:firstLine="360"/>
-      </w:pPr>
-      <w:r>
-        <w:t xml:space="preserve">The RAG-associated hotspot and signature findings are also important conceptually because they connect genome architecture to lineage-specific mutational processes. That link helps explain why lymphoid malignancies may display recurrent rearrangement patterns that differ from those seen in non-hematological tumors and provides a clearer mechanistic narrative than burden summaries alone</w:t>
-      </w:r>
-      <w:r>
-        <w:rPr>
-          <w:vertAlign w:val="superscript"/>
-        </w:rPr>
-        <w:t xml:space="preserve">1</w:t>
-      </w:r>
-      <w:r>
-        <w:t xml:space="preserve">.</w:t>
-      </w:r>
-    </w:p>
-    <w:p>
-      <w:pPr>
-        <w:pStyle w:val="BodyText"/>
-        <w:spacing w:line="360" w:lineRule="auto" w:after="80" w:before="0"/>
-        <w:ind w:firstLine="360"/>
-      </w:pPr>
-      <w:r>
-        <w:t xml:space="preserve">This repository example intentionally stops at the level of a concise public summary. Users who need full methodological detail, extended figure interpretation, or exact supplemental evidence should consult the published article directly rather than rely on this demonstration text. The value of the current project lies in showing how an openly shareable manuscript skeleton can be rendered into publication-style PDF and DOCX artifacts with a single build command.</w:t>
-      </w:r>
-    </w:p>
-    <w:bookmarkEnd w:id="28"/>
-    <w:bookmarkStart w:id="29" w:name="conclusion"/>
-    <w:p>
-      <w:pPr>
-        <w:pStyle w:val="2"/>
-        <w:spacing w:line="360" w:lineRule="auto" w:after="80" w:before="0"/>
-        <w:ind w:firstLine="0"/>
-      </w:pPr>
-      <w:r>
-        <w:t xml:space="preserve">Conclusion</w:t>
-      </w:r>
-    </w:p>
-    <w:p>
-      <w:pPr>
-        <w:pStyle w:val="FirstParagraph"/>
-        <w:spacing w:line="360" w:lineRule="auto" w:after="80" w:before="0"/>
-        <w:ind w:firstLine="0"/>
-      </w:pPr>
-      <w:r>
-        <w:t xml:space="preserve">This</w:t>
-      </w:r>
-      <w:r>
-        <w:t xml:space="preserve"> </w:t>
-      </w:r>
-      <w:r>
-        <w:rPr>
-          <w:rStyle w:val="VerbatimChar"/>
-        </w:rPr>
-        <w:t xml:space="preserve">paper-sci-01</w:t>
-      </w:r>
-      <w:r>
-        <w:t xml:space="preserve"> </w:t>
-      </w:r>
-      <w:r>
-        <w:t xml:space="preserve">example demonstrates that</w:t>
-      </w:r>
-      <w:r>
-        <w:t xml:space="preserve"> </w:t>
-      </w:r>
-      <w:r>
-        <w:rPr>
-          <w:rStyle w:val="VerbatimChar"/>
-        </w:rPr>
-        <w:t xml:space="preserve">bensz-paper</w:t>
-      </w:r>
-      <w:r>
-        <w:t xml:space="preserve"> </w:t>
-      </w:r>
-      <w:r>
-        <w:t xml:space="preserve">can host a complete SCI-style writing workflow with one public source of truth and dual PDF/DOCX outputs. The sample text highlights how structural-variation profiling reveals disease-specific patterns, driver disruption, RAG-associated hotspots, and ongoing clonal evolution in pediatric cancer, while the project structure itself serves as a reusable starting point for future manuscripts</w:t>
-      </w:r>
-      <w:r>
-        <w:rPr>
-          <w:vertAlign w:val="superscript"/>
-        </w:rPr>
-        <w:t xml:space="preserve">1</w:t>
-      </w:r>
-      <w:r>
-        <w:t xml:space="preserve">.</w:t>
-      </w:r>
-    </w:p>
-    <w:bookmarkEnd w:id="29"/>
-    <w:bookmarkStart w:id="34" w:name="additional-information"/>
-    <w:p>
-      <w:pPr>
-        <w:pStyle w:val="2"/>
-        <w:spacing w:line="360" w:lineRule="auto" w:after="80" w:before="0"/>
-        <w:ind w:firstLine="0"/>
-      </w:pPr>
-      <w:r>
-        <w:t xml:space="preserve">Additional information</w:t>
-      </w:r>
-    </w:p>
-    <w:bookmarkStart w:id="30" w:name="source-statement"/>
-    <w:p>
-      <w:pPr>
-        <w:pStyle w:val="3"/>
-        <w:spacing w:line="360" w:lineRule="auto" w:after="80" w:before="0"/>
-        <w:ind w:firstLine="0"/>
-      </w:pPr>
-      <w:r>
-        <w:t xml:space="preserve">Source statement</w:t>
-      </w:r>
-    </w:p>
-    <w:p>
-      <w:pPr>
-        <w:pStyle w:val="FirstParagraph"/>
-        <w:spacing w:line="360" w:lineRule="auto" w:after="80" w:before="0"/>
-        <w:ind w:firstLine="0"/>
-      </w:pPr>
-      <w:r>
-        <w:t xml:space="preserve">This project is a formatting demonstration derived from public metadata and abstract-level findings of Greenhalgh et al.,</w:t>
+        <w:t>References</w:t>
+      </w:r>
+    </w:p>
+    <w:p>
+      <w:pPr>
+        <w:pStyle w:val="af4"/>
+        <w:spacing w:line="360" w:lineRule="auto" w:after="80" w:before="0"/>
+        <w:ind w:firstLine="0" w:left="0"/>
+      </w:pPr>
+      <w:r>
+        <w:t xml:space="preserve">1.</w:t>
+      </w:r>
+      <w:r>
+        <w:t xml:space="preserve"> </w:t>
+      </w:r>
+      <w:r/>
+      <w:r>
+        <w:t xml:space="preserve">Greenhalgh, R.</w:t>
       </w:r>
       <w:r>
         <w:t xml:space="preserve"> </w:t>
@@ -644,200 +1423,10 @@
           <w:i/>
           <w:iCs/>
         </w:rPr>
-        <w:t xml:space="preserve">Cancer Cell</w:t>
-      </w:r>
-      <w:r>
-        <w:t xml:space="preserve"> </w:t>
-      </w:r>
-      <w:r>
-        <w:t xml:space="preserve">2026</w:t>
-      </w:r>
-      <w:r>
-        <w:rPr>
-          <w:vertAlign w:val="superscript"/>
-        </w:rPr>
-        <w:t xml:space="preserve">1</w:t>
-      </w:r>
-      <w:r>
-        <w:t xml:space="preserve">. It is</w:t>
-      </w:r>
-      <w:r>
-        <w:t xml:space="preserve"> </w:t>
-      </w:r>
-      <w:r>
-        <w:rPr>
-          <w:b/>
-          <w:bCs/>
-        </w:rPr>
-        <w:t xml:space="preserve">not</w:t>
-      </w:r>
-      <w:r>
-        <w:t xml:space="preserve"> </w:t>
-      </w:r>
-      <w:r>
-        <w:t xml:space="preserve">the publisher PDF, not the article’s original full text, and not an unpublished manuscript.</w:t>
-      </w:r>
-    </w:p>
-    <w:bookmarkEnd w:id="30"/>
-    <w:bookmarkStart w:id="31" w:name="availability-of-materials"/>
-    <w:p>
-      <w:pPr>
-        <w:pStyle w:val="3"/>
-        <w:spacing w:line="360" w:lineRule="auto" w:after="80" w:before="0"/>
-        <w:ind w:firstLine="0"/>
-      </w:pPr>
-      <w:r>
-        <w:t xml:space="preserve">Availability of materials</w:t>
-      </w:r>
-    </w:p>
-    <w:p>
-      <w:pPr>
-        <w:pStyle w:val="FirstParagraph"/>
-        <w:spacing w:line="360" w:lineRule="auto" w:after="80" w:before="0"/>
-        <w:ind w:firstLine="0"/>
-      </w:pPr>
-      <w:r>
-        <w:t xml:space="preserve">All editable source files required to rebuild this demonstration project are stored in this repository under</w:t>
-      </w:r>
-      <w:r>
-        <w:t xml:space="preserve"> </w:t>
-      </w:r>
-      <w:r>
-        <w:rPr>
-          <w:rStyle w:val="VerbatimChar"/>
-        </w:rPr>
-        <w:t xml:space="preserve">projects/paper-sci-01/</w:t>
-      </w:r>
-      <w:r>
-        <w:t xml:space="preserve">. Generated artifacts are written to</w:t>
-      </w:r>
-      <w:r>
-        <w:t xml:space="preserve"> </w:t>
-      </w:r>
-      <w:r>
-        <w:rPr>
-          <w:rStyle w:val="VerbatimChar"/>
-        </w:rPr>
-        <w:t xml:space="preserve">.latex-cache/</w:t>
-      </w:r>
-      <w:r>
-        <w:t xml:space="preserve">,</w:t>
-      </w:r>
-      <w:r>
-        <w:t xml:space="preserve"> </w:t>
-      </w:r>
-      <w:r>
-        <w:rPr>
-          <w:rStyle w:val="VerbatimChar"/>
-        </w:rPr>
-        <w:t xml:space="preserve">main.pdf</w:t>
-      </w:r>
-      <w:r>
-        <w:t xml:space="preserve">, and</w:t>
-      </w:r>
-      <w:r>
-        <w:t xml:space="preserve"> </w:t>
-      </w:r>
-      <w:r>
-        <w:rPr>
-          <w:rStyle w:val="VerbatimChar"/>
-        </w:rPr>
-        <w:t xml:space="preserve">main.docx</w:t>
-      </w:r>
-      <w:r>
-        <w:t xml:space="preserve"> </w:t>
-      </w:r>
-      <w:r>
-        <w:t xml:space="preserve">during the official build process.</w:t>
-      </w:r>
-    </w:p>
-    <w:bookmarkEnd w:id="31"/>
-    <w:bookmarkStart w:id="32" w:name="funding"/>
-    <w:p>
-      <w:pPr>
-        <w:pStyle w:val="3"/>
-        <w:spacing w:line="360" w:lineRule="auto" w:after="80" w:before="0"/>
-        <w:ind w:firstLine="0"/>
-      </w:pPr>
-      <w:r>
-        <w:t xml:space="preserve">Funding</w:t>
-      </w:r>
-    </w:p>
-    <w:p>
-      <w:pPr>
-        <w:pStyle w:val="FirstParagraph"/>
-        <w:spacing w:line="360" w:lineRule="auto" w:after="80" w:before="0"/>
-        <w:ind w:firstLine="0"/>
-      </w:pPr>
-      <w:r>
-        <w:t xml:space="preserve">No external funding was associated with this demonstration manuscript. The sample exists solely to validate the</w:t>
-      </w:r>
-      <w:r>
-        <w:t xml:space="preserve"> </w:t>
-      </w:r>
-      <w:r>
-        <w:rPr>
-          <w:rStyle w:val="VerbatimChar"/>
-        </w:rPr>
-        <w:t xml:space="preserve">bensz-paper</w:t>
-      </w:r>
-      <w:r>
-        <w:t xml:space="preserve"> </w:t>
-      </w:r>
-      <w:r>
-        <w:t xml:space="preserve">package workflow.</w:t>
-      </w:r>
-    </w:p>
-    <w:bookmarkEnd w:id="32"/>
-    <w:bookmarkStart w:id="33" w:name="competing-interests"/>
-    <w:p>
-      <w:pPr>
-        <w:pStyle w:val="3"/>
-        <w:spacing w:line="360" w:lineRule="auto" w:after="80" w:before="0"/>
-        <w:ind w:firstLine="0"/>
-      </w:pPr>
-      <w:r>
-        <w:t xml:space="preserve">Competing interests</w:t>
-      </w:r>
-    </w:p>
-    <w:p>
-      <w:pPr>
-        <w:pStyle w:val="FirstParagraph"/>
-        <w:spacing w:line="360" w:lineRule="auto" w:after="80" w:before="0"/>
-        <w:ind w:firstLine="0"/>
-      </w:pPr>
-      <w:r>
-        <w:t xml:space="preserve">The authors of this demonstration template declare no competing interests related to the sample text or build workflow.</w:t>
-      </w:r>
-    </w:p>
-    <w:bookmarkEnd w:id="33"/>
-    <w:bookmarkEnd w:id="34"/>
-    <w:bookmarkStart w:id="35" w:name="figure-legends"/>
-    <w:p>
-      <w:pPr>
-        <w:pStyle w:val="2"/>
-        <w:spacing w:line="360" w:lineRule="auto" w:after="80" w:before="0"/>
-        <w:ind w:firstLine="0"/>
-      </w:pPr>
-      <w:r>
-        <w:t>References</w:t>
-      </w:r>
-    </w:p>
-    <w:p>
-      <w:pPr>
-        <w:pStyle w:val="af4"/>
-        <w:spacing w:line="360" w:lineRule="auto" w:after="80" w:before="0"/>
-        <w:ind w:firstLine="0" w:left="0"/>
-      </w:pPr>
-      <w:r>
-        <w:t xml:space="preserve">1.</w:t>
-      </w:r>
-      <w:r>
-        <w:t xml:space="preserve"> </w:t>
-      </w:r>
-      <w:r/>
-      <w:r>
-        <w:t xml:space="preserve">Greenhalgh, R.</w:t>
+        <w:t xml:space="preserve">et al.</w:t>
+      </w:r>
+      <w:r>
+        <w:t xml:space="preserve"> The landscape of structural variation in pediatric cancer.</w:t>
       </w:r>
       <w:r>
         <w:t xml:space="preserve"> </w:t>
@@ -847,25 +1436,12 @@
           <w:i/>
           <w:iCs/>
         </w:rPr>
-        <w:t xml:space="preserve">et al.</w:t>
-      </w:r>
-      <w:r>
-        <w:t xml:space="preserve"> The landscape of structural variation in pediatric cancer.</w:t>
-      </w:r>
-      <w:r>
-        <w:t xml:space="preserve"> </w:t>
-      </w:r>
-      <w:r>
-        <w:rPr>
-          <w:i/>
-          <w:iCs/>
-        </w:rPr>
         <w:t xml:space="preserve">Cancer Cell</w:t>
       </w:r>
       <w:r>
         <w:t xml:space="preserve"> </w:t>
       </w:r>
-      <w:hyperlink r:id="rId36">
+      <w:hyperlink r:id="rId37">
         <w:r>
           <w:rPr>
             <w:rStyle w:val="a4"/>
@@ -879,7 +1455,7 @@
       <w:r>
         <w:t xml:space="preserve">(2026) doi:</w:t>
       </w:r>
-      <w:hyperlink r:id="rId36">
+      <w:hyperlink r:id="rId37">
         <w:r>
           <w:rPr>
             <w:rStyle w:val="a4"/>
@@ -920,7 +1496,7 @@
       <w:r>
         <w:t xml:space="preserve"> </w:t>
       </w:r>
-      <w:hyperlink r:id="rId38">
+      <w:hyperlink r:id="rId39">
         <w:r>
           <w:rPr>
             <w:rStyle w:val="a4"/>
@@ -984,7 +1560,7 @@
       <w:r>
         <w:t xml:space="preserve"> </w:t>
       </w:r>
-      <w:hyperlink r:id="rId40">
+      <w:hyperlink r:id="rId41">
         <w:r>
           <w:rPr>
             <w:rStyle w:val="a4"/>
@@ -1048,7 +1624,7 @@
       <w:r>
         <w:t xml:space="preserve"> </w:t>
       </w:r>
-      <w:hyperlink r:id="rId42">
+      <w:hyperlink r:id="rId43">
         <w:r>
           <w:rPr>
             <w:rStyle w:val="a4"/>
@@ -1085,7 +1661,7 @@
     </w:p>
     <w:p>
       <w:pPr>
-        <w:pStyle w:val="2"/>
+        <w:pStyle w:val="1"/>
         <w:spacing w:line="360" w:lineRule="auto" w:after="80" w:before="0"/>
         <w:ind w:firstLine="0"/>
       </w:pPr>
@@ -1100,7 +1676,13 @@
         <w:ind w:firstLine="0"/>
       </w:pPr>
       <w:r>
-        <w:t xml:space="preserve">No figures are bundled with this public demonstration project. Users can add journal-ready figures later under a project-local</w:t>
+        <w:t xml:space="preserve">No figures are bundled with this public demonstration project. Users can</w:t>
+      </w:r>
+      <w:r>
+        <w:t xml:space="preserve"> </w:t>
+      </w:r>
+      <w:r>
+        <w:t xml:space="preserve">add journal-ready figures later under a project-local</w:t>
       </w:r>
       <w:r>
         <w:t xml:space="preserve"> </w:t>
@@ -1118,11 +1700,11 @@
         <w:t xml:space="preserve">directory and extend the manuscript in the same workflow.</w:t>
       </w:r>
     </w:p>
-    <w:bookmarkEnd w:id="35"/>
-    <w:bookmarkStart w:id="45" w:name="supplementary-materials"/>
-    <w:p>
-      <w:pPr>
-        <w:pStyle w:val="2"/>
+    <w:bookmarkEnd w:id="36"/>
+    <w:bookmarkStart w:id="46" w:name="supplementary-materials"/>
+    <w:p>
+      <w:pPr>
+        <w:pStyle w:val="1"/>
         <w:spacing w:line="360" w:lineRule="auto" w:after="80" w:before="0"/>
         <w:ind w:firstLine="0"/>
       </w:pPr>
@@ -1137,18 +1719,35 @@
         <w:ind w:firstLine="0"/>
       </w:pPr>
       <w:r>
-        <w:t xml:space="preserve">No supplementary tables or appendices are included in this starter project. The section is retained so that downstream users have a ready-made insertion point for supplements when adapting the template to a real manuscript.</w:t>
-      </w:r>
-    </w:p>
-    <w:bookmarkStart w:id="44" w:name="refs"/>
-    <w:bookmarkStart w:id="37" w:name="ref-Greenhalgh_2026"/>
-    <w:bookmarkEnd w:id="37"/>
-    <w:bookmarkStart w:id="39" w:name="ref-Grobner_2018"/>
-    <w:bookmarkEnd w:id="39"/>
-    <w:bookmarkStart w:id="41" w:name="ref-Ma_2018"/>
-    <w:bookmarkEnd w:id="41"/>
-    <w:bookmarkStart w:id="43" w:name="ref-Li_2020"/>
-    <w:bookmarkEnd w:id="43"/>
+        <w:t xml:space="preserve">No supplementary tables or appendices are included in this starter</w:t>
+      </w:r>
+      <w:r>
+        <w:t xml:space="preserve"> </w:t>
+      </w:r>
+      <w:r>
+        <w:t xml:space="preserve">project. The section is retained so that downstream users have a</w:t>
+      </w:r>
+      <w:r>
+        <w:t xml:space="preserve"> </w:t>
+      </w:r>
+      <w:r>
+        <w:t xml:space="preserve">ready-made insertion point for supplements when adapting the template to</w:t>
+      </w:r>
+      <w:r>
+        <w:t xml:space="preserve"> </w:t>
+      </w:r>
+      <w:r>
+        <w:t xml:space="preserve">a real manuscript.</w:t>
+      </w:r>
+    </w:p>
+    <w:bookmarkStart w:id="45" w:name="refs"/>
+    <w:bookmarkStart w:id="38" w:name="ref-Greenhalgh_2026"/>
+    <w:bookmarkEnd w:id="38"/>
+    <w:bookmarkStart w:id="40" w:name="ref-Grobner_2018"/>
+    <w:bookmarkEnd w:id="40"/>
+    <w:bookmarkStart w:id="42" w:name="ref-Ma_2018"/>
+    <w:bookmarkEnd w:id="42"/>
+    <w:bookmarkStart w:id="44" w:name="ref-Li_2020"/>
     <w:bookmarkEnd w:id="44"/>
     <w:bookmarkEnd w:id="45"/>
     <w:bookmarkEnd w:id="46"/>

</xml_diff>

<commit_message>
fix(packages/bensz-paper): 支持 <sup> 标签到 DOCX 上标语的正确转换
- 新增 _convert_sup_tags_to_superscript 将 HTML <sup> 转为 pandoc 原生 ^superscript^ 语法
- pandoc 调用增加 +superscript 扩展以正确渲染上标内容
- 同步更新示例项目的 PDF 与 DOCX 产物

Co-Authored-By: Claude Opus 4.6 <noreply@anthropic.com>
</commit_message>
<xml_diff>
--- a/projects/paper-sci-01/main.docx
+++ b/projects/paper-sci-01/main.docx
@@ -23,12 +23,18 @@
         <w:t xml:space="preserve">Template Author One</w:t>
       </w:r>
       <w:r>
+        <w:rPr>
+          <w:vertAlign w:val="superscript"/>
+        </w:rPr>
         <w:t xml:space="preserve">1†</w:t>
       </w:r>
       <w:r>
         <w:t xml:space="preserve">, Template Author Two</w:t>
       </w:r>
       <w:r>
+        <w:rPr>
+          <w:vertAlign w:val="superscript"/>
+        </w:rPr>
         <w:t xml:space="preserve">2†</w:t>
       </w:r>
       <w:r>
@@ -41,6 +47,9 @@
         <w:t xml:space="preserve">Template Author Three</w:t>
       </w:r>
       <w:r>
+        <w:rPr>
+          <w:vertAlign w:val="superscript"/>
+        </w:rPr>
         <w:t xml:space="preserve">1*</w:t>
       </w:r>
     </w:p>
@@ -51,6 +60,9 @@
         <w:ind w:firstLine="0"/>
       </w:pPr>
       <w:r>
+        <w:rPr>
+          <w:vertAlign w:val="superscript"/>
+        </w:rPr>
         <w:t xml:space="preserve">1</w:t>
       </w:r>
       <w:r>
@@ -70,6 +82,9 @@
         <w:ind w:firstLine="0"/>
       </w:pPr>
       <w:r>
+        <w:rPr>
+          <w:vertAlign w:val="superscript"/>
+        </w:rPr>
         <w:t xml:space="preserve">2</w:t>
       </w:r>
       <w:r>
@@ -89,6 +104,9 @@
         <w:ind w:firstLine="0"/>
       </w:pPr>
       <w:r>
+        <w:rPr>
+          <w:vertAlign w:val="superscript"/>
+        </w:rPr>
         <w:t xml:space="preserve">†</w:t>
       </w:r>
       <w:r>
@@ -108,6 +126,9 @@
         <w:ind w:firstLine="0"/>
       </w:pPr>
       <w:r>
+        <w:rPr>
+          <w:vertAlign w:val="superscript"/>
+        </w:rPr>
         <w:t xml:space="preserve">*</w:t>
       </w:r>
       <w:r>

</xml_diff>

<commit_message>
fix(packages/bensz-paper): 修复 DOCX 标题居中与段落对齐问题
- 首个 Heading 1（论文标题）保持居中对齐，后续标题强制左对齐
- 补充上标 roundtrip 回归测试与标题对齐单元测试
- 更新示例项目产物与 CHANGELOG
</commit_message>
<xml_diff>
--- a/projects/paper-sci-01/main.docx
+++ b/projects/paper-sci-01/main.docx
@@ -8,6 +8,7 @@
         <w:pStyle w:val="1"/>
         <w:spacing w:line="360" w:lineRule="auto" w:after="80" w:before="0"/>
         <w:ind w:firstLine="0"/>
+        <w:jc w:val="center"/>
       </w:pPr>
       <w:r>
         <w:t xml:space="preserve">Template Example: Structural Variation in Pediatric Cancer</w:t>
@@ -152,6 +153,7 @@
         <w:pStyle w:val="1"/>
         <w:spacing w:line="360" w:lineRule="auto" w:after="80" w:before="0"/>
         <w:ind w:firstLine="0"/>
+        <w:jc w:val="left"/>
       </w:pPr>
       <w:r>
         <w:t xml:space="preserve">Abstract</w:t>
@@ -305,6 +307,7 @@
         <w:pStyle w:val="1"/>
         <w:spacing w:line="360" w:lineRule="auto" w:after="80" w:before="0"/>
         <w:ind w:firstLine="0"/>
+        <w:jc w:val="left"/>
       </w:pPr>
       <w:r>
         <w:t xml:space="preserve">Introduction</w:t>
@@ -498,6 +501,7 @@
         <w:pStyle w:val="1"/>
         <w:spacing w:line="360" w:lineRule="auto" w:after="80" w:before="0"/>
         <w:ind w:firstLine="0"/>
+        <w:jc w:val="left"/>
       </w:pPr>
       <w:r>
         <w:t xml:space="preserve">Methods</w:t>
@@ -699,6 +703,7 @@
         <w:pStyle w:val="1"/>
         <w:spacing w:line="360" w:lineRule="auto" w:after="80" w:before="0"/>
         <w:ind w:firstLine="0"/>
+        <w:jc w:val="left"/>
       </w:pPr>
       <w:r>
         <w:t xml:space="preserve">Results</w:t>
@@ -919,6 +924,7 @@
         <w:pStyle w:val="1"/>
         <w:spacing w:line="360" w:lineRule="auto" w:after="80" w:before="0"/>
         <w:ind w:firstLine="0"/>
+        <w:jc w:val="left"/>
       </w:pPr>
       <w:r>
         <w:t xml:space="preserve">Discussion</w:t>
@@ -1075,6 +1081,7 @@
         <w:pStyle w:val="1"/>
         <w:spacing w:line="360" w:lineRule="auto" w:after="80" w:before="0"/>
         <w:ind w:firstLine="0"/>
+        <w:jc w:val="left"/>
       </w:pPr>
       <w:r>
         <w:t xml:space="preserve">Conclusion</w:t>
@@ -1172,6 +1179,7 @@
         <w:pStyle w:val="1"/>
         <w:spacing w:line="360" w:lineRule="auto" w:after="80" w:before="0"/>
         <w:ind w:firstLine="0"/>
+        <w:jc w:val="left"/>
       </w:pPr>
       <w:r>
         <w:t xml:space="preserve">Additional information</w:t>
@@ -1183,6 +1191,7 @@
         <w:pStyle w:val="2"/>
         <w:spacing w:line="360" w:lineRule="auto" w:after="80" w:before="0"/>
         <w:ind w:firstLine="0"/>
+        <w:jc w:val="left"/>
       </w:pPr>
       <w:r>
         <w:t xml:space="preserve">Source statement</w:t>
@@ -1258,6 +1267,7 @@
         <w:pStyle w:val="2"/>
         <w:spacing w:line="360" w:lineRule="auto" w:after="80" w:before="0"/>
         <w:ind w:firstLine="0"/>
+        <w:jc w:val="left"/>
       </w:pPr>
       <w:r>
         <w:t xml:space="preserve">Availability of materials</w:t>
@@ -1343,6 +1353,7 @@
         <w:pStyle w:val="2"/>
         <w:spacing w:line="360" w:lineRule="auto" w:after="80" w:before="0"/>
         <w:ind w:firstLine="0"/>
+        <w:jc w:val="left"/>
       </w:pPr>
       <w:r>
         <w:t xml:space="preserve">Funding</w:t>
@@ -1386,6 +1397,7 @@
         <w:pStyle w:val="2"/>
         <w:spacing w:line="360" w:lineRule="auto" w:after="80" w:before="0"/>
         <w:ind w:firstLine="0"/>
+        <w:jc w:val="left"/>
       </w:pPr>
       <w:r>
         <w:t xml:space="preserve">Competing interests</w:t>
@@ -1415,6 +1427,7 @@
         <w:pStyle w:val="2"/>
         <w:spacing w:line="360" w:lineRule="auto" w:after="80" w:before="0"/>
         <w:ind w:firstLine="0"/>
+        <w:jc w:val="left"/>
       </w:pPr>
       <w:r>
         <w:t>References</w:t>
@@ -1685,6 +1698,7 @@
         <w:pStyle w:val="1"/>
         <w:spacing w:line="360" w:lineRule="auto" w:after="80" w:before="0"/>
         <w:ind w:firstLine="0"/>
+        <w:jc w:val="left"/>
       </w:pPr>
       <w:r>
         <w:t xml:space="preserve">Figure legends</w:t>
@@ -1728,6 +1742,7 @@
         <w:pStyle w:val="1"/>
         <w:spacing w:line="360" w:lineRule="auto" w:after="80" w:before="0"/>
         <w:ind w:firstLine="0"/>
+        <w:jc w:val="left"/>
       </w:pPr>
       <w:r>
         <w:t xml:space="preserve">Supplementary materials</w:t>
@@ -2466,7 +2481,7 @@
     <w:rsid w:val="005107AC"/>
     <w:pPr>
       <w:spacing w:after="330" w:before="340" w:line="360" w:lineRule="auto"/>
-      <w:jc w:val="center"/>
+      <w:jc w:val="left"/>
       <w:outlineLvl w:val="0"/>
     </w:pPr>
     <w:rPr>

</xml_diff>

<commit_message>
fix(packages/bensz-paper): 修复 DOCX 参考文献作者截断口径
- 将 manuscript.csl 的 et-al-min/et-al-use-first 从 6/1 调整为 4/3，与 biblatex 三作者口径一致
- 新增基于 Pandoc citeproc 的回归测试，防止再次回退成"仅首位作者 + et al."

Co-Authored-By: Claude Opus 4.6 <noreply@anthropic.com>
</commit_message>
<xml_diff>
--- a/projects/paper-sci-01/main.docx
+++ b/projects/paper-sci-01/main.docx
@@ -1447,7 +1447,7 @@
       </w:r>
       <w:r/>
       <w:r>
-        <w:t xml:space="preserve">Greenhalgh, R.</w:t>
+        <w:t xml:space="preserve">Greenhalgh, R., Brady, S. W., Yang, W.,</w:t>
       </w:r>
       <w:r>
         <w:t xml:space="preserve"> </w:t>
@@ -1515,7 +1515,7 @@
       </w:r>
       <w:r/>
       <w:r>
-        <w:t xml:space="preserve">Gröbner, S. N.</w:t>
+        <w:t xml:space="preserve">Gröbner, S. N., Worst, B. C., Weischenfeldt, J.,</w:t>
       </w:r>
       <w:r>
         <w:t xml:space="preserve"> </w:t>
@@ -1579,7 +1579,7 @@
       </w:r>
       <w:r/>
       <w:r>
-        <w:t xml:space="preserve">Ma, X.</w:t>
+        <w:t xml:space="preserve">Ma, X., Liu, Y., Liu, Y.,</w:t>
       </w:r>
       <w:r>
         <w:t xml:space="preserve"> </w:t>
@@ -1643,7 +1643,7 @@
       </w:r>
       <w:r/>
       <w:r>
-        <w:t xml:space="preserve">Li, Y.</w:t>
+        <w:t xml:space="preserve">Li, Y., Roberts, N. D., Wala, J. A.,</w:t>
       </w:r>
       <w:r>
         <w:t xml:space="preserve"> </w:t>

</xml_diff>

<commit_message>
fix(packages/bensz-paper): 修复 References 书签稳定性与 DOCX 尾部章节兼容性
- main.tex 改为显式 \section{References} + \printbibliography[heading=none]，保证 PDF 书签稳定出现
- fix_docx_spacing.py 扩展尾部章节识别，兼容 Figure titles and legends 与 Supplemental information titles and legends 命名变体
- results.tex 将 cases 环境改为 array 环境，消除 xelatex 对齐符误报
</commit_message>
<xml_diff>
--- a/projects/paper-sci-01/main.docx
+++ b/projects/paper-sci-01/main.docx
@@ -1618,10 +1618,57 @@
                   <m:e>
                     <m:r>
                       <m:rPr>
-                        <m:nor/>
                         <m:sty m:val="p"/>
                       </m:rPr>
-                      <m:t>otherwise</m:t>
+                      <m:t>o</m:t>
+                    </m:r>
+                    <m:r>
+                      <m:rPr>
+                        <m:sty m:val="p"/>
+                      </m:rPr>
+                      <m:t>t</m:t>
+                    </m:r>
+                    <m:r>
+                      <m:rPr>
+                        <m:sty m:val="p"/>
+                      </m:rPr>
+                      <m:t>h</m:t>
+                    </m:r>
+                    <m:r>
+                      <m:rPr>
+                        <m:sty m:val="p"/>
+                      </m:rPr>
+                      <m:t>e</m:t>
+                    </m:r>
+                    <m:r>
+                      <m:rPr>
+                        <m:sty m:val="p"/>
+                      </m:rPr>
+                      <m:t>r</m:t>
+                    </m:r>
+                    <m:r>
+                      <m:rPr>
+                        <m:sty m:val="p"/>
+                      </m:rPr>
+                      <m:t>w</m:t>
+                    </m:r>
+                    <m:r>
+                      <m:rPr>
+                        <m:sty m:val="p"/>
+                      </m:rPr>
+                      <m:t>i</m:t>
+                    </m:r>
+                    <m:r>
+                      <m:rPr>
+                        <m:sty m:val="p"/>
+                      </m:rPr>
+                      <m:t>s</m:t>
+                    </m:r>
+                    <m:r>
+                      <m:rPr>
+                        <m:sty m:val="p"/>
+                      </m:rPr>
+                      <m:t>e</m:t>
                     </m:r>
                     <m:r>
                       <m:rPr>
@@ -1644,25 +1691,19 @@
         <w:ind w:firstLine="0"/>
       </w:pPr>
       <w:r>
-        <w:t xml:space="preserve">Together, these examples</w:t>
-      </w:r>
-      <w:r>
-        <w:t xml:space="preserve"> </w:t>
-      </w:r>
-      <w:r>
-        <w:t xml:space="preserve">cover inline Greek letters, subscripts, superscripts, fractions,</w:t>
-      </w:r>
-      <w:r>
-        <w:t xml:space="preserve"> </w:t>
-      </w:r>
-      <w:r>
-        <w:t xml:space="preserve">summation, delimiters, and a piecewise definition in both PDF and DOCX</w:t>
-      </w:r>
-      <w:r>
-        <w:t xml:space="preserve"> </w:t>
-      </w:r>
-      <w:r>
-        <w:t xml:space="preserve">export.</w:t>
+        <w:t xml:space="preserve">Together, these examples cover</w:t>
+      </w:r>
+      <w:r>
+        <w:t xml:space="preserve"> </w:t>
+      </w:r>
+      <w:r>
+        <w:t xml:space="preserve">inline Greek letters, subscripts, superscripts, fractions, summation,</w:t>
+      </w:r>
+      <w:r>
+        <w:t xml:space="preserve"> </w:t>
+      </w:r>
+      <w:r>
+        <w:t xml:space="preserve">delimiters, and a piecewise definition in both PDF and DOCX export.</w:t>
       </w:r>
     </w:p>
     <w:p>

</xml_diff>

<commit_message>
fix(packages/bensz-paper): 修复 DOCX References 标题层级与 bibliography 单段排版
- 统一 References 为 Heading 1 并确保位于首条参考文献前
- 移除 CSL second-field-align="flush" 避免编号与正文拆段
- 新增标题升级与单段 bibliography 回归测试
- 版本升级 p_v20260405 → p_v20260406 / CLI 1.3.4 → 1.3.5

Co-Authored-By: Claude Opus 4.6 <noreply@anthropic.com>
</commit_message>
<xml_diff>
--- a/projects/paper-sci-01/main.docx
+++ b/projects/paper-sci-01/main.docx
@@ -2404,7 +2404,7 @@
     <w:bookmarkStart w:id="36" w:name="figure-legends"/>
     <w:p>
       <w:pPr>
-        <w:pStyle w:val="2"/>
+        <w:pStyle w:val="1"/>
         <w:spacing w:line="360" w:lineRule="auto" w:after="80" w:before="0"/>
         <w:ind w:firstLine="0"/>
         <w:jc w:val="left"/>
@@ -2420,17 +2420,7 @@
         <w:ind w:firstLine="0" w:left="0"/>
       </w:pPr>
       <w:r>
-        <w:t xml:space="preserve">1.</w:t>
-      </w:r>
-    </w:p>
-    <w:p>
-      <w:pPr>
-        <w:pStyle w:val="af4"/>
-        <w:spacing w:line="360" w:lineRule="auto" w:after="80" w:before="0"/>
-        <w:ind w:firstLine="0" w:left="0"/>
-      </w:pPr>
-      <w:r>
-        <w:t xml:space="preserve">Greenhalgh, R., Brady, S. W., Yang, W.,</w:t>
+        <w:t xml:space="preserve">1. Greenhalgh, R., Brady, S. W., Yang, W.,</w:t>
       </w:r>
       <w:r>
         <w:t xml:space="preserve"> </w:t>
@@ -2440,43 +2430,41 @@
           <w:i/>
           <w:iCs/>
         </w:rPr>
-        <w:t xml:space="preserve">et</w:t>
+        <w:t xml:space="preserve">et al.</w:t>
+      </w:r>
+      <w:r>
+        <w:t xml:space="preserve"> </w:t>
+      </w:r>
+      <w:r>
+        <w:t xml:space="preserve">The landscape</w:t>
+      </w:r>
+      <w:r>
+        <w:t xml:space="preserve"> </w:t>
+      </w:r>
+      <w:r>
+        <w:t xml:space="preserve">of structural variation in pediatric cancer.</w:t>
+      </w:r>
+      <w:r>
+        <w:t xml:space="preserve"> </w:t>
       </w:r>
       <w:r>
         <w:rPr>
           <w:i/>
           <w:iCs/>
         </w:rPr>
-        <w:t xml:space="preserve"> </w:t>
-      </w:r>
-      <w:r>
-        <w:rPr>
-          <w:i/>
-          <w:iCs/>
-        </w:rPr>
-        <w:t xml:space="preserve">al.</w:t>
-      </w:r>
-      <w:r>
-        <w:t xml:space="preserve"> </w:t>
-      </w:r>
-      <w:r>
-        <w:t xml:space="preserve">The landscape of structural variation in pediatric cancer.</w:t>
-      </w:r>
-      <w:r>
-        <w:t xml:space="preserve"> </w:t>
-      </w:r>
-      <w:r>
-        <w:rPr>
-          <w:i/>
-          <w:iCs/>
-        </w:rPr>
         <w:t xml:space="preserve">Cancer Cell</w:t>
       </w:r>
       <w:r>
         <w:t xml:space="preserve"> </w:t>
       </w:r>
       <w:r>
-        <w:t xml:space="preserve">(2026) doi:</w:t>
+        <w:t xml:space="preserve">(2026)</w:t>
+      </w:r>
+      <w:r>
+        <w:t xml:space="preserve"> </w:t>
+      </w:r>
+      <w:r>
+        <w:t xml:space="preserve">doi:</w:t>
       </w:r>
       <w:hyperlink r:id="rId37">
         <w:r>
@@ -2497,23 +2485,7 @@
         <w:ind w:firstLine="0" w:left="0"/>
       </w:pPr>
       <w:r>
-        <w:t xml:space="preserve">2.</w:t>
-      </w:r>
-    </w:p>
-    <w:p>
-      <w:pPr>
-        <w:pStyle w:val="af4"/>
-        <w:spacing w:line="360" w:lineRule="auto" w:after="80" w:before="0"/>
-        <w:ind w:firstLine="0" w:left="0"/>
-      </w:pPr>
-      <w:r>
-        <w:t xml:space="preserve">Gröbner, S. N., Worst, B. C., Weischenfeldt,</w:t>
-      </w:r>
-      <w:r>
-        <w:t xml:space="preserve"> </w:t>
-      </w:r>
-      <w:r>
-        <w:t xml:space="preserve">J.,</w:t>
+        <w:t xml:space="preserve">2. Gröbner, S. N., Worst, B. C., Weischenfeldt, J.,</w:t>
       </w:r>
       <w:r>
         <w:t xml:space="preserve"> </w:t>
@@ -2529,13 +2501,13 @@
         <w:t xml:space="preserve"> </w:t>
       </w:r>
       <w:r>
-        <w:t xml:space="preserve">The landscape of genomic alterations across</w:t>
-      </w:r>
-      <w:r>
-        <w:t xml:space="preserve"> </w:t>
-      </w:r>
-      <w:r>
-        <w:t xml:space="preserve">childhood cancers.</w:t>
+        <w:t xml:space="preserve">The</w:t>
+      </w:r>
+      <w:r>
+        <w:t xml:space="preserve"> </w:t>
+      </w:r>
+      <w:r>
+        <w:t xml:space="preserve">landscape of genomic alterations across childhood cancers.</w:t>
       </w:r>
       <w:r>
         <w:t xml:space="preserve"> </w:t>
@@ -2558,13 +2530,7 @@
         <w:t xml:space="preserve">555</w:t>
       </w:r>
       <w:r>
-        <w:t xml:space="preserve">, 321–327 (2018)</w:t>
-      </w:r>
-      <w:r>
-        <w:t xml:space="preserve"> </w:t>
-      </w:r>
-      <w:r>
-        <w:t xml:space="preserve">doi:</w:t>
+        <w:t xml:space="preserve">, 321–327 (2018) doi:</w:t>
       </w:r>
       <w:hyperlink r:id="rId39">
         <w:r>
@@ -2585,23 +2551,7 @@
         <w:ind w:firstLine="0" w:left="0"/>
       </w:pPr>
       <w:r>
-        <w:t xml:space="preserve">3.</w:t>
-      </w:r>
-    </w:p>
-    <w:p>
-      <w:pPr>
-        <w:pStyle w:val="af4"/>
-        <w:spacing w:line="360" w:lineRule="auto" w:after="80" w:before="0"/>
-        <w:ind w:firstLine="0" w:left="0"/>
-      </w:pPr>
-      <w:r>
-        <w:t xml:space="preserve">Ma,</w:t>
-      </w:r>
-      <w:r>
-        <w:t xml:space="preserve"> </w:t>
-      </w:r>
-      <w:r>
-        <w:t xml:space="preserve">X., Liu, Y., Liu, Y.,</w:t>
+        <w:t xml:space="preserve">3. Ma, X., Liu, Y., Liu, Y.,</w:t>
       </w:r>
       <w:r>
         <w:t xml:space="preserve"> </w:t>
@@ -2667,23 +2617,7 @@
         <w:ind w:firstLine="0" w:left="0"/>
       </w:pPr>
       <w:r>
-        <w:t xml:space="preserve">4.</w:t>
-      </w:r>
-    </w:p>
-    <w:p>
-      <w:pPr>
-        <w:pStyle w:val="af4"/>
-        <w:spacing w:line="360" w:lineRule="auto" w:after="80" w:before="0"/>
-        <w:ind w:firstLine="0" w:left="0"/>
-      </w:pPr>
-      <w:r>
-        <w:t xml:space="preserve">Li,</w:t>
-      </w:r>
-      <w:r>
-        <w:t xml:space="preserve"> </w:t>
-      </w:r>
-      <w:r>
-        <w:t xml:space="preserve">Y., Roberts, N. D., Wala, J. A.,</w:t>
+        <w:t xml:space="preserve">4. Li, Y., Roberts, N. D., Wala, J. A.,</w:t>
       </w:r>
       <w:r>
         <w:t xml:space="preserve"> </w:t>
@@ -2699,13 +2633,13 @@
         <w:t xml:space="preserve"> </w:t>
       </w:r>
       <w:r>
-        <w:t xml:space="preserve">Patterns of somatic</w:t>
-      </w:r>
-      <w:r>
-        <w:t xml:space="preserve"> </w:t>
-      </w:r>
-      <w:r>
-        <w:t xml:space="preserve">structural variation in human cancer genomes.</w:t>
+        <w:t xml:space="preserve">Patterns of</w:t>
+      </w:r>
+      <w:r>
+        <w:t xml:space="preserve"> </w:t>
+      </w:r>
+      <w:r>
+        <w:t xml:space="preserve">somatic structural variation in human cancer genomes.</w:t>
       </w:r>
       <w:r>
         <w:t xml:space="preserve"> </w:t>

</xml_diff>

<commit_message>
fix(packages/bensz-paper): 收敛 paper-sci-01 的 PDF/DOCX 关键样式并切换到 Vancouver 参考文献链路
- 新增 bml-bibliography.sty 对 vancouver 的条件支持，允许 PDF 端在不影响默认 gb7714-2015 的前提下切换到 Vancouver/JITC 口径
- 修复 bml-core.sty 在完整仓库模式下可能从已安装旧包读取 profile 的问题，改为基于当前包文件目录加载
- 重构 fix_docx_spacing.py：按 LaTeX profile 统一校正 DOCX 首页标题、作者区、章节与 bibliography 段落字号/行距/缩进，补齐 Vancouver 链路的 bibliography 书签与上标内部跳转重写
- 修复 paper-sci-01 PDF 书签层级不完整问题：调整 abstract 等无编号节标题为可进入导航层级的常规节标题，并设置 bookmarksdepth=subsection
- 修复 paper-sci-01 参考文献链接样式：启用 colorlinks 并在 DOCX 中为上标引用添加蓝色可点击链接
- 同步更新 CHANGELOG、README、AGENTS.md、Prompts.md 等文档，公共包版本升至 p_v20260414.3

Co-Authored-By: Claude Opus 4.6 <noreply@anthropic.com>
</commit_message>
<xml_diff>
--- a/projects/paper-sci-01/main.docx
+++ b/projects/paper-sci-01/main.docx
@@ -6,18 +6,100 @@
     <w:p>
       <w:pPr>
         <w:pStyle w:val="1"/>
-        <w:spacing w:line="360" w:lineRule="auto" w:after="80" w:before="0"/>
+        <w:spacing w:line="400" w:lineRule="exact" w:after="432" w:before="0"/>
         <w:ind w:firstLine="0"/>
         <w:jc w:val="center"/>
       </w:pPr>
       <w:r>
+        <w:rPr>
+          <w:rFonts w:ascii="Times New Roman" w:hAnsi="Times New Roman"/>
+          <w:b/>
+          <w:sz w:val="30"/>
+        </w:rPr>
         <w:t xml:space="preserve">Template</w:t>
       </w:r>
       <w:r>
-        <w:t xml:space="preserve"> </w:t>
-      </w:r>
-      <w:r>
+        <w:rPr>
+          <w:rFonts w:ascii="Times New Roman" w:hAnsi="Times New Roman"/>
+          <w:b/>
+          <w:sz w:val="30"/>
+        </w:rPr>
+        <w:t xml:space="preserve"> </w:t>
+      </w:r>
+      <w:r>
+        <w:rPr>
+          <w:rFonts w:ascii="Times New Roman" w:hAnsi="Times New Roman"/>
+          <w:b/>
+          <w:sz w:val="30"/>
+        </w:rPr>
         <w:t xml:space="preserve">Example: Structural Variation in Pediatric Cancer</w:t>
+      </w:r>
+    </w:p>
+    <w:p>
+      <w:pPr>
+        <w:pStyle w:val="BodyText"/>
+        <w:spacing w:before="0" w:after="80" w:line="360" w:lineRule="auto"/>
+        <w:ind w:firstLine="0"/>
+        <w:jc w:val="center"/>
+      </w:pPr>
+      <w:r>
+        <w:rPr>
+          <w:rFonts w:ascii="Times New Roman" w:hAnsi="Times New Roman"/>
+          <w:sz w:val="24"/>
+        </w:rPr>
+        <w:t xml:space="preserve">Template Author One</w:t>
+      </w:r>
+      <w:r>
+        <w:rPr>
+          <w:rFonts w:ascii="Times New Roman" w:hAnsi="Times New Roman"/>
+          <w:sz w:val="24"/>
+          <w:vertAlign w:val="superscript"/>
+        </w:rPr>
+        <w:t xml:space="preserve">1†</w:t>
+      </w:r>
+      <w:r>
+        <w:rPr>
+          <w:rFonts w:ascii="Times New Roman" w:hAnsi="Times New Roman"/>
+          <w:sz w:val="24"/>
+        </w:rPr>
+        <w:t xml:space="preserve">, Template Author Two</w:t>
+      </w:r>
+      <w:r>
+        <w:rPr>
+          <w:rFonts w:ascii="Times New Roman" w:hAnsi="Times New Roman"/>
+          <w:sz w:val="24"/>
+          <w:vertAlign w:val="superscript"/>
+        </w:rPr>
+        <w:t xml:space="preserve">2†</w:t>
+      </w:r>
+      <w:r>
+        <w:rPr>
+          <w:rFonts w:ascii="Times New Roman" w:hAnsi="Times New Roman"/>
+          <w:sz w:val="24"/>
+        </w:rPr>
+        <w:t xml:space="preserve">,</w:t>
+      </w:r>
+      <w:r>
+        <w:rPr>
+          <w:rFonts w:ascii="Times New Roman" w:hAnsi="Times New Roman"/>
+          <w:sz w:val="24"/>
+        </w:rPr>
+        <w:t xml:space="preserve"> </w:t>
+      </w:r>
+      <w:r>
+        <w:rPr>
+          <w:rFonts w:ascii="Times New Roman" w:hAnsi="Times New Roman"/>
+          <w:sz w:val="24"/>
+        </w:rPr>
+        <w:t xml:space="preserve">Template Author Three</w:t>
+      </w:r>
+      <w:r>
+        <w:rPr>
+          <w:rFonts w:ascii="Times New Roman" w:hAnsi="Times New Roman"/>
+          <w:sz w:val="24"/>
+          <w:vertAlign w:val="superscript"/>
+        </w:rPr>
+        <w:t xml:space="preserve">1*</w:t>
       </w:r>
     </w:p>
     <w:p>
@@ -25,40 +107,35 @@
         <w:pStyle w:val="BodyText"/>
         <w:spacing w:line="360" w:lineRule="auto" w:after="80" w:before="0"/>
         <w:ind w:firstLine="0"/>
-        <w:jc w:val="center"/>
-      </w:pPr>
-      <w:r>
-        <w:t xml:space="preserve">Template Author One</w:t>
-      </w:r>
-      <w:r>
-        <w:rPr>
+      </w:pPr>
+      <w:r>
+        <w:rPr>
+          <w:rFonts w:ascii="Times New Roman" w:hAnsi="Times New Roman"/>
+          <w:sz w:val="24"/>
           <w:vertAlign w:val="superscript"/>
         </w:rPr>
-        <w:t xml:space="preserve">1†</w:t>
-      </w:r>
-      <w:r>
-        <w:t xml:space="preserve">, Template Author Two</w:t>
-      </w:r>
-      <w:r>
-        <w:rPr>
-          <w:vertAlign w:val="superscript"/>
-        </w:rPr>
-        <w:t xml:space="preserve">2†</w:t>
-      </w:r>
-      <w:r>
-        <w:t xml:space="preserve">,</w:t>
-      </w:r>
-      <w:r>
-        <w:t xml:space="preserve"> </w:t>
-      </w:r>
-      <w:r>
-        <w:t xml:space="preserve">Template Author Three</w:t>
-      </w:r>
-      <w:r>
-        <w:rPr>
-          <w:vertAlign w:val="superscript"/>
-        </w:rPr>
-        <w:t xml:space="preserve">1*</w:t>
+        <w:t xml:space="preserve">1</w:t>
+      </w:r>
+      <w:r>
+        <w:rPr>
+          <w:rFonts w:ascii="Times New Roman" w:hAnsi="Times New Roman"/>
+          <w:sz w:val="24"/>
+        </w:rPr>
+        <w:t xml:space="preserve">Department of Translational Bioinformatics, Example</w:t>
+      </w:r>
+      <w:r>
+        <w:rPr>
+          <w:rFonts w:ascii="Times New Roman" w:hAnsi="Times New Roman"/>
+          <w:sz w:val="24"/>
+        </w:rPr>
+        <w:t xml:space="preserve"> </w:t>
+      </w:r>
+      <w:r>
+        <w:rPr>
+          <w:rFonts w:ascii="Times New Roman" w:hAnsi="Times New Roman"/>
+          <w:sz w:val="24"/>
+        </w:rPr>
+        <w:t xml:space="preserve">Research Institute, Guangzhou, China</w:t>
       </w:r>
     </w:p>
     <w:p>
@@ -69,18 +146,32 @@
       </w:pPr>
       <w:r>
         <w:rPr>
+          <w:rFonts w:ascii="Times New Roman" w:hAnsi="Times New Roman"/>
+          <w:sz w:val="24"/>
           <w:vertAlign w:val="superscript"/>
         </w:rPr>
-        <w:t xml:space="preserve">1</w:t>
-      </w:r>
-      <w:r>
-        <w:t xml:space="preserve">Department of Translational Bioinformatics, Example</w:t>
-      </w:r>
-      <w:r>
-        <w:t xml:space="preserve"> </w:t>
-      </w:r>
-      <w:r>
-        <w:t xml:space="preserve">Research Institute, Guangzhou, China</w:t>
+        <w:t xml:space="preserve">2</w:t>
+      </w:r>
+      <w:r>
+        <w:rPr>
+          <w:rFonts w:ascii="Times New Roman" w:hAnsi="Times New Roman"/>
+          <w:sz w:val="24"/>
+        </w:rPr>
+        <w:t xml:space="preserve">School of Biomedical Data Science, Example University,</w:t>
+      </w:r>
+      <w:r>
+        <w:rPr>
+          <w:rFonts w:ascii="Times New Roman" w:hAnsi="Times New Roman"/>
+          <w:sz w:val="24"/>
+        </w:rPr>
+        <w:t xml:space="preserve"> </w:t>
+      </w:r>
+      <w:r>
+        <w:rPr>
+          <w:rFonts w:ascii="Times New Roman" w:hAnsi="Times New Roman"/>
+          <w:sz w:val="24"/>
+        </w:rPr>
+        <w:t xml:space="preserve">Shanghai, China</w:t>
       </w:r>
     </w:p>
     <w:p>
@@ -91,18 +182,32 @@
       </w:pPr>
       <w:r>
         <w:rPr>
+          <w:rFonts w:ascii="Times New Roman" w:hAnsi="Times New Roman"/>
+          <w:sz w:val="24"/>
           <w:vertAlign w:val="superscript"/>
         </w:rPr>
-        <w:t xml:space="preserve">2</w:t>
-      </w:r>
-      <w:r>
-        <w:t xml:space="preserve">School of Biomedical Data Science, Example University,</w:t>
-      </w:r>
-      <w:r>
-        <w:t xml:space="preserve"> </w:t>
-      </w:r>
-      <w:r>
-        <w:t xml:space="preserve">Shanghai, China</w:t>
+        <w:t xml:space="preserve">†</w:t>
+      </w:r>
+      <w:r>
+        <w:rPr>
+          <w:rFonts w:ascii="Times New Roman" w:hAnsi="Times New Roman"/>
+          <w:sz w:val="24"/>
+        </w:rPr>
+        <w:t xml:space="preserve">Template Author One and Template Author Two contributed</w:t>
+      </w:r>
+      <w:r>
+        <w:rPr>
+          <w:rFonts w:ascii="Times New Roman" w:hAnsi="Times New Roman"/>
+          <w:sz w:val="24"/>
+        </w:rPr>
+        <w:t xml:space="preserve"> </w:t>
+      </w:r>
+      <w:r>
+        <w:rPr>
+          <w:rFonts w:ascii="Times New Roman" w:hAnsi="Times New Roman"/>
+          <w:sz w:val="24"/>
+        </w:rPr>
+        <w:t xml:space="preserve">equally to this demonstration manuscript.</w:t>
       </w:r>
     </w:p>
     <w:p>
@@ -113,18 +218,18 @@
       </w:pPr>
       <w:r>
         <w:rPr>
+          <w:rFonts w:ascii="Times New Roman" w:hAnsi="Times New Roman"/>
+          <w:sz w:val="24"/>
           <w:vertAlign w:val="superscript"/>
         </w:rPr>
-        <w:t xml:space="preserve">†</w:t>
-      </w:r>
-      <w:r>
-        <w:t xml:space="preserve">Template Author One and Template Author Two contributed</w:t>
-      </w:r>
-      <w:r>
-        <w:t xml:space="preserve"> </w:t>
-      </w:r>
-      <w:r>
-        <w:t xml:space="preserve">equally to this demonstration manuscript.</w:t>
+        <w:t xml:space="preserve">*</w:t>
+      </w:r>
+      <w:r>
+        <w:rPr>
+          <w:rFonts w:ascii="Times New Roman" w:hAnsi="Times New Roman"/>
+          <w:sz w:val="24"/>
+        </w:rPr>
+        <w:t xml:space="preserve">Correspondence: template.author@example.org.</w:t>
       </w:r>
     </w:p>
     <w:p>
@@ -135,21 +240,9 @@
       </w:pPr>
       <w:r>
         <w:rPr>
-          <w:vertAlign w:val="superscript"/>
-        </w:rPr>
-        <w:t xml:space="preserve">*</w:t>
-      </w:r>
-      <w:r>
-        <w:t xml:space="preserve">Correspondence: template.author@example.org.</w:t>
-      </w:r>
-    </w:p>
-    <w:p>
-      <w:pPr>
-        <w:pStyle w:val="BodyText"/>
-        <w:spacing w:line="360" w:lineRule="auto" w:after="80" w:before="0"/>
-        <w:ind w:firstLine="0"/>
-      </w:pPr>
-      <w:r>
+          <w:rFonts w:ascii="Times New Roman" w:hAnsi="Times New Roman"/>
+          <w:sz w:val="24"/>
+        </w:rPr>
         <w:t xml:space="preserve">Running title: Structural variation demo manuscript</w:t>
       </w:r>
     </w:p>
@@ -158,11 +251,16 @@
     <w:p>
       <w:pPr>
         <w:pStyle w:val="1"/>
-        <w:spacing w:line="360" w:lineRule="auto" w:after="80" w:before="0"/>
+        <w:spacing w:line="360" w:lineRule="exact" w:after="60" w:before="0"/>
         <w:ind w:firstLine="0"/>
         <w:jc w:val="left"/>
       </w:pPr>
       <w:r>
+        <w:rPr>
+          <w:rFonts w:ascii="Times New Roman" w:hAnsi="Times New Roman"/>
+          <w:b/>
+          <w:sz w:val="28"/>
+        </w:rPr>
         <w:t xml:space="preserve">Abstract</w:t>
       </w:r>
     </w:p>
@@ -173,88 +271,186 @@
         <w:ind w:firstLine="0"/>
       </w:pPr>
       <w:r>
+        <w:rPr>
+          <w:rFonts w:ascii="Times New Roman" w:hAnsi="Times New Roman"/>
+          <w:sz w:val="24"/>
+        </w:rPr>
         <w:t xml:space="preserve">This public demonstration manuscript reformats the main messages of a</w:t>
       </w:r>
       <w:r>
-        <w:t xml:space="preserve"> </w:t>
-      </w:r>
-      <w:r>
+        <w:rPr>
+          <w:rFonts w:ascii="Times New Roman" w:hAnsi="Times New Roman"/>
+          <w:sz w:val="24"/>
+        </w:rPr>
+        <w:t xml:space="preserve"> </w:t>
+      </w:r>
+      <w:r>
+        <w:rPr>
+          <w:rFonts w:ascii="Times New Roman" w:hAnsi="Times New Roman"/>
+          <w:sz w:val="24"/>
+        </w:rPr>
         <w:t xml:space="preserve">recently published</w:t>
       </w:r>
       <w:r>
-        <w:t xml:space="preserve"> </w:t>
-      </w:r>
-      <w:r>
-        <w:rPr>
+        <w:rPr>
+          <w:rFonts w:ascii="Times New Roman" w:hAnsi="Times New Roman"/>
+          <w:sz w:val="24"/>
+        </w:rPr>
+        <w:t xml:space="preserve"> </w:t>
+      </w:r>
+      <w:r>
+        <w:rPr>
+          <w:rFonts w:ascii="Times New Roman" w:hAnsi="Times New Roman"/>
           <w:i/>
           <w:iCs/>
+          <w:sz w:val="24"/>
         </w:rPr>
         <w:t xml:space="preserve">Cancer Cell</w:t>
       </w:r>
       <w:r>
-        <w:t xml:space="preserve"> </w:t>
-      </w:r>
-      <w:r>
+        <w:rPr>
+          <w:rFonts w:ascii="Times New Roman" w:hAnsi="Times New Roman"/>
+          <w:sz w:val="24"/>
+        </w:rPr>
+        <w:t xml:space="preserve"> </w:t>
+      </w:r>
+      <w:r>
+        <w:rPr>
+          <w:rFonts w:ascii="Times New Roman" w:hAnsi="Times New Roman"/>
+          <w:sz w:val="24"/>
+        </w:rPr>
         <w:t xml:space="preserve">study on structural variation in</w:t>
       </w:r>
       <w:r>
-        <w:t xml:space="preserve"> </w:t>
-      </w:r>
-      <w:r>
+        <w:rPr>
+          <w:rFonts w:ascii="Times New Roman" w:hAnsi="Times New Roman"/>
+          <w:sz w:val="24"/>
+        </w:rPr>
+        <w:t xml:space="preserve"> </w:t>
+      </w:r>
+      <w:r>
+        <w:rPr>
+          <w:rFonts w:ascii="Times New Roman" w:hAnsi="Times New Roman"/>
+          <w:sz w:val="24"/>
+        </w:rPr>
         <w:t xml:space="preserve">pediatric cancer into the</w:t>
       </w:r>
       <w:r>
+        <w:rPr>
+          <w:rFonts w:ascii="Times New Roman" w:hAnsi="Times New Roman"/>
+          <w:sz w:val="24"/>
+        </w:rPr>
         <w:t xml:space="preserve"> </w:t>
       </w:r>
       <w:r>
         <w:rPr>
           <w:rStyle w:val="VerbatimChar"/>
+          <w:rFonts w:ascii="Times New Roman" w:hAnsi="Times New Roman"/>
+          <w:sz w:val="24"/>
         </w:rPr>
         <w:t xml:space="preserve">bensz-paper</w:t>
       </w:r>
       <w:r>
-        <w:t xml:space="preserve"> </w:t>
-      </w:r>
-      <w:r>
+        <w:rPr>
+          <w:rFonts w:ascii="Times New Roman" w:hAnsi="Times New Roman"/>
+          <w:sz w:val="24"/>
+        </w:rPr>
+        <w:t xml:space="preserve"> </w:t>
+      </w:r>
+      <w:r>
+        <w:rPr>
+          <w:rFonts w:ascii="Times New Roman" w:hAnsi="Times New Roman"/>
+          <w:sz w:val="24"/>
+        </w:rPr>
         <w:t xml:space="preserve">workflow. The source</w:t>
       </w:r>
       <w:r>
-        <w:t xml:space="preserve"> </w:t>
-      </w:r>
-      <w:r>
+        <w:rPr>
+          <w:rFonts w:ascii="Times New Roman" w:hAnsi="Times New Roman"/>
+          <w:sz w:val="24"/>
+        </w:rPr>
+        <w:t xml:space="preserve"> </w:t>
+      </w:r>
+      <w:r>
+        <w:rPr>
+          <w:rFonts w:ascii="Times New Roman" w:hAnsi="Times New Roman"/>
+          <w:sz w:val="24"/>
+        </w:rPr>
         <w:t xml:space="preserve">article reported pan-cancer analyses across 1,616 pediatric and 2,203</w:t>
       </w:r>
       <w:r>
-        <w:t xml:space="preserve"> </w:t>
-      </w:r>
-      <w:r>
+        <w:rPr>
+          <w:rFonts w:ascii="Times New Roman" w:hAnsi="Times New Roman"/>
+          <w:sz w:val="24"/>
+        </w:rPr>
+        <w:t xml:space="preserve"> </w:t>
+      </w:r>
+      <w:r>
+        <w:rPr>
+          <w:rFonts w:ascii="Times New Roman" w:hAnsi="Times New Roman"/>
+          <w:sz w:val="24"/>
+        </w:rPr>
         <w:t xml:space="preserve">adult whole genomes and showed that structural-variation burden differed</w:t>
       </w:r>
       <w:r>
-        <w:t xml:space="preserve"> </w:t>
-      </w:r>
-      <w:r>
+        <w:rPr>
+          <w:rFonts w:ascii="Times New Roman" w:hAnsi="Times New Roman"/>
+          <w:sz w:val="24"/>
+        </w:rPr>
+        <w:t xml:space="preserve"> </w:t>
+      </w:r>
+      <w:r>
+        <w:rPr>
+          <w:rFonts w:ascii="Times New Roman" w:hAnsi="Times New Roman"/>
+          <w:sz w:val="24"/>
+        </w:rPr>
         <w:t xml:space="preserve">markedly across pediatric cancer types, remained much lower than that of</w:t>
       </w:r>
       <w:r>
-        <w:t xml:space="preserve"> </w:t>
-      </w:r>
-      <w:r>
+        <w:rPr>
+          <w:rFonts w:ascii="Times New Roman" w:hAnsi="Times New Roman"/>
+          <w:sz w:val="24"/>
+        </w:rPr>
+        <w:t xml:space="preserve"> </w:t>
+      </w:r>
+      <w:r>
+        <w:rPr>
+          <w:rFonts w:ascii="Times New Roman" w:hAnsi="Times New Roman"/>
+          <w:sz w:val="24"/>
+        </w:rPr>
         <w:t xml:space="preserve">most adult solid tumors, and was nevertheless highly informative for</w:t>
       </w:r>
       <w:r>
-        <w:t xml:space="preserve"> </w:t>
-      </w:r>
-      <w:r>
+        <w:rPr>
+          <w:rFonts w:ascii="Times New Roman" w:hAnsi="Times New Roman"/>
+          <w:sz w:val="24"/>
+        </w:rPr>
+        <w:t xml:space="preserve"> </w:t>
+      </w:r>
+      <w:r>
+        <w:rPr>
+          <w:rFonts w:ascii="Times New Roman" w:hAnsi="Times New Roman"/>
+          <w:sz w:val="24"/>
+        </w:rPr>
         <w:t xml:space="preserve">leukemias and other hematological malignancies</w:t>
       </w:r>
-      <w:r>
-        <w:rPr>
-          <w:vertAlign w:val="superscript"/>
-        </w:rPr>
-        <w:t xml:space="preserve">1</w:t>
-      </w:r>
-      <w:r>
+      <w:hyperlink w:anchor="ref-1">
+        <w:r>
+          <w:rPr>
+            <w:rFonts w:ascii="Times New Roman" w:hAnsi="Times New Roman"/>
+            <w:sz w:val="24"/>
+            <w:vertAlign w:val="superscript"/>
+            <w:color w:val="0000FF"/>
+            <w:u w:val="none"/>
+          </w:rPr>
+          <w:t xml:space="preserve">[1]</w:t>
+        </w:r>
+      </w:hyperlink>
+      <w:r>
+        <w:rPr>
+          <w:rFonts w:ascii="Times New Roman" w:hAnsi="Times New Roman"/>
+          <w:sz w:val="24"/>
+        </w:rPr>
         <w:t xml:space="preserve">.</w:t>
       </w:r>
     </w:p>
@@ -265,51 +461,113 @@
         <w:ind w:firstLine="0"/>
       </w:pPr>
       <w:r>
+        <w:rPr>
+          <w:rFonts w:ascii="Times New Roman" w:hAnsi="Times New Roman"/>
+          <w:sz w:val="24"/>
+        </w:rPr>
         <w:t xml:space="preserve">The same study further highlighted recurrent disruption of driver</w:t>
       </w:r>
       <w:r>
-        <w:t xml:space="preserve"> </w:t>
-      </w:r>
-      <w:r>
+        <w:rPr>
+          <w:rFonts w:ascii="Times New Roman" w:hAnsi="Times New Roman"/>
+          <w:sz w:val="24"/>
+        </w:rPr>
+        <w:t xml:space="preserve"> </w:t>
+      </w:r>
+      <w:r>
+        <w:rPr>
+          <w:rFonts w:ascii="Times New Roman" w:hAnsi="Times New Roman"/>
+          <w:sz w:val="24"/>
+        </w:rPr>
         <w:t xml:space="preserve">genes, distinct hotspot patterns around RAG recombination signal</w:t>
       </w:r>
       <w:r>
-        <w:t xml:space="preserve"> </w:t>
-      </w:r>
-      <w:r>
+        <w:rPr>
+          <w:rFonts w:ascii="Times New Roman" w:hAnsi="Times New Roman"/>
+          <w:sz w:val="24"/>
+        </w:rPr>
+        <w:t xml:space="preserve"> </w:t>
+      </w:r>
+      <w:r>
+        <w:rPr>
+          <w:rFonts w:ascii="Times New Roman" w:hAnsi="Times New Roman"/>
+          <w:sz w:val="24"/>
+        </w:rPr>
         <w:t xml:space="preserve">sequences, and signature-level evidence that RAG-mediated mutagenesis</w:t>
       </w:r>
       <w:r>
-        <w:t xml:space="preserve"> </w:t>
-      </w:r>
-      <w:r>
+        <w:rPr>
+          <w:rFonts w:ascii="Times New Roman" w:hAnsi="Times New Roman"/>
+          <w:sz w:val="24"/>
+        </w:rPr>
+        <w:t xml:space="preserve"> </w:t>
+      </w:r>
+      <w:r>
+        <w:rPr>
+          <w:rFonts w:ascii="Times New Roman" w:hAnsi="Times New Roman"/>
+          <w:sz w:val="24"/>
+        </w:rPr>
         <w:t xml:space="preserve">contributes to part of the lymphoid structural-variation landscape</w:t>
       </w:r>
-      <w:r>
-        <w:rPr>
-          <w:vertAlign w:val="superscript"/>
-        </w:rPr>
-        <w:t xml:space="preserve">1</w:t>
-      </w:r>
-      <w:r>
-        <w:t xml:space="preserve">. Here</w:t>
-      </w:r>
-      <w:r>
-        <w:t xml:space="preserve"> </w:t>
-      </w:r>
-      <w:r>
-        <w:t xml:space="preserve">we condense those public findings into a journal-style example project</w:t>
-      </w:r>
-      <w:r>
-        <w:t xml:space="preserve"> </w:t>
-      </w:r>
-      <w:r>
-        <w:t xml:space="preserve">whose purpose is typesetting validation rather than scientific</w:t>
-      </w:r>
-      <w:r>
-        <w:t xml:space="preserve"> </w:t>
-      </w:r>
-      <w:r>
+      <w:hyperlink w:anchor="ref-1">
+        <w:r>
+          <w:rPr>
+            <w:rFonts w:ascii="Times New Roman" w:hAnsi="Times New Roman"/>
+            <w:sz w:val="24"/>
+            <w:vertAlign w:val="superscript"/>
+            <w:color w:val="0000FF"/>
+            <w:u w:val="none"/>
+          </w:rPr>
+          <w:t xml:space="preserve">[1]</w:t>
+        </w:r>
+      </w:hyperlink>
+      <w:r>
+        <w:rPr>
+          <w:rFonts w:ascii="Times New Roman" w:hAnsi="Times New Roman"/>
+          <w:sz w:val="24"/>
+        </w:rPr>
+        <w:t xml:space="preserve">.</w:t>
+      </w:r>
+      <w:r>
+        <w:rPr>
+          <w:rFonts w:ascii="Times New Roman" w:hAnsi="Times New Roman"/>
+          <w:sz w:val="24"/>
+        </w:rPr>
+        <w:t xml:space="preserve"> </w:t>
+      </w:r>
+      <w:r>
+        <w:rPr>
+          <w:rFonts w:ascii="Times New Roman" w:hAnsi="Times New Roman"/>
+          <w:sz w:val="24"/>
+        </w:rPr>
+        <w:t xml:space="preserve">Here we condense those public findings into a journal-style example</w:t>
+      </w:r>
+      <w:r>
+        <w:rPr>
+          <w:rFonts w:ascii="Times New Roman" w:hAnsi="Times New Roman"/>
+          <w:sz w:val="24"/>
+        </w:rPr>
+        <w:t xml:space="preserve"> </w:t>
+      </w:r>
+      <w:r>
+        <w:rPr>
+          <w:rFonts w:ascii="Times New Roman" w:hAnsi="Times New Roman"/>
+          <w:sz w:val="24"/>
+        </w:rPr>
+        <w:t xml:space="preserve">project whose purpose is typesetting validation rather than scientific</w:t>
+      </w:r>
+      <w:r>
+        <w:rPr>
+          <w:rFonts w:ascii="Times New Roman" w:hAnsi="Times New Roman"/>
+          <w:sz w:val="24"/>
+        </w:rPr>
+        <w:t xml:space="preserve"> </w:t>
+      </w:r>
+      <w:r>
+        <w:rPr>
+          <w:rFonts w:ascii="Times New Roman" w:hAnsi="Times New Roman"/>
+          <w:sz w:val="24"/>
+        </w:rPr>
         <w:t xml:space="preserve">novelty.</w:t>
       </w:r>
     </w:p>
@@ -318,11 +576,16 @@
     <w:p>
       <w:pPr>
         <w:pStyle w:val="1"/>
-        <w:spacing w:line="360" w:lineRule="auto" w:after="80" w:before="0"/>
+        <w:spacing w:line="360" w:lineRule="exact" w:after="60" w:before="0"/>
         <w:ind w:firstLine="0"/>
         <w:jc w:val="left"/>
       </w:pPr>
       <w:r>
+        <w:rPr>
+          <w:rFonts w:ascii="Times New Roman" w:hAnsi="Times New Roman"/>
+          <w:b/>
+          <w:sz w:val="28"/>
+        </w:rPr>
         <w:t xml:space="preserve">Introduction</w:t>
       </w:r>
     </w:p>
@@ -333,36 +596,80 @@
         <w:ind w:firstLine="0"/>
       </w:pPr>
       <w:r>
+        <w:rPr>
+          <w:rFonts w:ascii="Times New Roman" w:hAnsi="Times New Roman"/>
+          <w:sz w:val="24"/>
+        </w:rPr>
         <w:t xml:space="preserve">Structural variants are a major source of oncogenic activation, tumor</w:t>
       </w:r>
       <w:r>
-        <w:t xml:space="preserve"> </w:t>
-      </w:r>
-      <w:r>
+        <w:rPr>
+          <w:rFonts w:ascii="Times New Roman" w:hAnsi="Times New Roman"/>
+          <w:sz w:val="24"/>
+        </w:rPr>
+        <w:t xml:space="preserve"> </w:t>
+      </w:r>
+      <w:r>
+        <w:rPr>
+          <w:rFonts w:ascii="Times New Roman" w:hAnsi="Times New Roman"/>
+          <w:sz w:val="24"/>
+        </w:rPr>
         <w:t xml:space="preserve">suppressor loss, enhancer hijacking, and genome reorganization. In</w:t>
       </w:r>
       <w:r>
-        <w:t xml:space="preserve"> </w:t>
-      </w:r>
-      <w:r>
+        <w:rPr>
+          <w:rFonts w:ascii="Times New Roman" w:hAnsi="Times New Roman"/>
+          <w:sz w:val="24"/>
+        </w:rPr>
+        <w:t xml:space="preserve"> </w:t>
+      </w:r>
+      <w:r>
+        <w:rPr>
+          <w:rFonts w:ascii="Times New Roman" w:hAnsi="Times New Roman"/>
+          <w:sz w:val="24"/>
+        </w:rPr>
         <w:t xml:space="preserve">pediatric tumors, however, broad pan-cancer summaries of structural</w:t>
       </w:r>
       <w:r>
-        <w:t xml:space="preserve"> </w:t>
-      </w:r>
-      <w:r>
+        <w:rPr>
+          <w:rFonts w:ascii="Times New Roman" w:hAnsi="Times New Roman"/>
+          <w:sz w:val="24"/>
+        </w:rPr>
+        <w:t xml:space="preserve"> </w:t>
+      </w:r>
+      <w:r>
+        <w:rPr>
+          <w:rFonts w:ascii="Times New Roman" w:hAnsi="Times New Roman"/>
+          <w:sz w:val="24"/>
+        </w:rPr>
         <w:t xml:space="preserve">variation have historically lagged behind point-mutation catalogs, which</w:t>
       </w:r>
       <w:r>
-        <w:t xml:space="preserve"> </w:t>
-      </w:r>
-      <w:r>
+        <w:rPr>
+          <w:rFonts w:ascii="Times New Roman" w:hAnsi="Times New Roman"/>
+          <w:sz w:val="24"/>
+        </w:rPr>
+        <w:t xml:space="preserve"> </w:t>
+      </w:r>
+      <w:r>
+        <w:rPr>
+          <w:rFonts w:ascii="Times New Roman" w:hAnsi="Times New Roman"/>
+          <w:sz w:val="24"/>
+        </w:rPr>
         <w:t xml:space="preserve">made it harder to compare disease classes within a unified</w:t>
       </w:r>
       <w:r>
-        <w:t xml:space="preserve"> </w:t>
-      </w:r>
-      <w:r>
+        <w:rPr>
+          <w:rFonts w:ascii="Times New Roman" w:hAnsi="Times New Roman"/>
+          <w:sz w:val="24"/>
+        </w:rPr>
+        <w:t xml:space="preserve"> </w:t>
+      </w:r>
+      <w:r>
+        <w:rPr>
+          <w:rFonts w:ascii="Times New Roman" w:hAnsi="Times New Roman"/>
+          <w:sz w:val="24"/>
+        </w:rPr>
         <w:t xml:space="preserve">framework.</w:t>
       </w:r>
     </w:p>
@@ -373,33 +680,71 @@
         <w:ind w:firstLine="0"/>
       </w:pPr>
       <w:r>
+        <w:rPr>
+          <w:rFonts w:ascii="Times New Roman" w:hAnsi="Times New Roman"/>
+          <w:sz w:val="24"/>
+        </w:rPr>
         <w:t xml:space="preserve">Earlier pediatric pan-cancer genomics efforts and whole-cancer</w:t>
       </w:r>
       <w:r>
-        <w:t xml:space="preserve"> </w:t>
-      </w:r>
-      <w:r>
+        <w:rPr>
+          <w:rFonts w:ascii="Times New Roman" w:hAnsi="Times New Roman"/>
+          <w:sz w:val="24"/>
+        </w:rPr>
+        <w:t xml:space="preserve"> </w:t>
+      </w:r>
+      <w:r>
+        <w:rPr>
+          <w:rFonts w:ascii="Times New Roman" w:hAnsi="Times New Roman"/>
+          <w:sz w:val="24"/>
+        </w:rPr>
         <w:t xml:space="preserve">structural-variation surveys provided important context for that gap by</w:t>
       </w:r>
       <w:r>
-        <w:t xml:space="preserve"> </w:t>
-      </w:r>
-      <w:r>
+        <w:rPr>
+          <w:rFonts w:ascii="Times New Roman" w:hAnsi="Times New Roman"/>
+          <w:sz w:val="24"/>
+        </w:rPr>
+        <w:t xml:space="preserve"> </w:t>
+      </w:r>
+      <w:r>
+        <w:rPr>
+          <w:rFonts w:ascii="Times New Roman" w:hAnsi="Times New Roman"/>
+          <w:sz w:val="24"/>
+        </w:rPr>
         <w:t xml:space="preserve">outlining recurrent genomic alterations across childhood cancers and by</w:t>
       </w:r>
       <w:r>
-        <w:t xml:space="preserve"> </w:t>
-      </w:r>
-      <w:r>
+        <w:rPr>
+          <w:rFonts w:ascii="Times New Roman" w:hAnsi="Times New Roman"/>
+          <w:sz w:val="24"/>
+        </w:rPr>
+        <w:t xml:space="preserve"> </w:t>
+      </w:r>
+      <w:r>
+        <w:rPr>
+          <w:rFonts w:ascii="Times New Roman" w:hAnsi="Times New Roman"/>
+          <w:sz w:val="24"/>
+        </w:rPr>
         <w:t xml:space="preserve">formalizing major rearrangement patterns across human malignancies</w:t>
       </w:r>
-      <w:r>
-        <w:rPr>
-          <w:vertAlign w:val="superscript"/>
-        </w:rPr>
-        <w:t xml:space="preserve">2–4</w:t>
-      </w:r>
-      <w:r>
+      <w:hyperlink w:anchor="ref-2">
+        <w:r>
+          <w:rPr>
+            <w:rFonts w:ascii="Times New Roman" w:hAnsi="Times New Roman"/>
+            <w:sz w:val="24"/>
+            <w:vertAlign w:val="superscript"/>
+            <w:color w:val="0000FF"/>
+            <w:u w:val="none"/>
+          </w:rPr>
+          <w:t xml:space="preserve">[2–4]</w:t>
+        </w:r>
+      </w:hyperlink>
+      <w:r>
+        <w:rPr>
+          <w:rFonts w:ascii="Times New Roman" w:hAnsi="Times New Roman"/>
+          <w:sz w:val="24"/>
+        </w:rPr>
         <w:t xml:space="preserve">.</w:t>
       </w:r>
     </w:p>
@@ -410,51 +755,113 @@
         <w:ind w:firstLine="0"/>
       </w:pPr>
       <w:r>
+        <w:rPr>
+          <w:rFonts w:ascii="Times New Roman" w:hAnsi="Times New Roman"/>
+          <w:sz w:val="24"/>
+        </w:rPr>
         <w:t xml:space="preserve">The public study by Greenhalgh and colleagues addressed that gap by</w:t>
       </w:r>
       <w:r>
-        <w:t xml:space="preserve"> </w:t>
-      </w:r>
-      <w:r>
+        <w:rPr>
+          <w:rFonts w:ascii="Times New Roman" w:hAnsi="Times New Roman"/>
+          <w:sz w:val="24"/>
+        </w:rPr>
+        <w:t xml:space="preserve"> </w:t>
+      </w:r>
+      <w:r>
+        <w:rPr>
+          <w:rFonts w:ascii="Times New Roman" w:hAnsi="Times New Roman"/>
+          <w:sz w:val="24"/>
+        </w:rPr>
         <w:t xml:space="preserve">surveying pediatric and adult whole-genome cohorts side by side and by</w:t>
       </w:r>
       <w:r>
-        <w:t xml:space="preserve"> </w:t>
-      </w:r>
-      <w:r>
+        <w:rPr>
+          <w:rFonts w:ascii="Times New Roman" w:hAnsi="Times New Roman"/>
+          <w:sz w:val="24"/>
+        </w:rPr>
+        <w:t xml:space="preserve"> </w:t>
+      </w:r>
+      <w:r>
+        <w:rPr>
+          <w:rFonts w:ascii="Times New Roman" w:hAnsi="Times New Roman"/>
+          <w:sz w:val="24"/>
+        </w:rPr>
         <w:t xml:space="preserve">focusing on the biological consequences of rearrangements instead of</w:t>
       </w:r>
       <w:r>
-        <w:t xml:space="preserve"> </w:t>
-      </w:r>
-      <w:r>
+        <w:rPr>
+          <w:rFonts w:ascii="Times New Roman" w:hAnsi="Times New Roman"/>
+          <w:sz w:val="24"/>
+        </w:rPr>
+        <w:t xml:space="preserve"> </w:t>
+      </w:r>
+      <w:r>
+        <w:rPr>
+          <w:rFonts w:ascii="Times New Roman" w:hAnsi="Times New Roman"/>
+          <w:sz w:val="24"/>
+        </w:rPr>
         <w:t xml:space="preserve">only their raw counts</w:t>
       </w:r>
-      <w:r>
-        <w:rPr>
-          <w:vertAlign w:val="superscript"/>
-        </w:rPr>
-        <w:t xml:space="preserve">1</w:t>
-      </w:r>
-      <w:r>
+      <w:hyperlink w:anchor="ref-1">
+        <w:r>
+          <w:rPr>
+            <w:rFonts w:ascii="Times New Roman" w:hAnsi="Times New Roman"/>
+            <w:sz w:val="24"/>
+            <w:vertAlign w:val="superscript"/>
+            <w:color w:val="0000FF"/>
+            <w:u w:val="none"/>
+          </w:rPr>
+          <w:t xml:space="preserve">[1]</w:t>
+        </w:r>
+      </w:hyperlink>
+      <w:r>
+        <w:rPr>
+          <w:rFonts w:ascii="Times New Roman" w:hAnsi="Times New Roman"/>
+          <w:sz w:val="24"/>
+        </w:rPr>
         <w:t xml:space="preserve">. Their work is</w:t>
       </w:r>
       <w:r>
-        <w:t xml:space="preserve"> </w:t>
-      </w:r>
-      <w:r>
+        <w:rPr>
+          <w:rFonts w:ascii="Times New Roman" w:hAnsi="Times New Roman"/>
+          <w:sz w:val="24"/>
+        </w:rPr>
+        <w:t xml:space="preserve"> </w:t>
+      </w:r>
+      <w:r>
+        <w:rPr>
+          <w:rFonts w:ascii="Times New Roman" w:hAnsi="Times New Roman"/>
+          <w:sz w:val="24"/>
+        </w:rPr>
         <w:t xml:space="preserve">especially useful as a formatting example because it combines</w:t>
       </w:r>
       <w:r>
-        <w:t xml:space="preserve"> </w:t>
-      </w:r>
-      <w:r>
+        <w:rPr>
+          <w:rFonts w:ascii="Times New Roman" w:hAnsi="Times New Roman"/>
+          <w:sz w:val="24"/>
+        </w:rPr>
+        <w:t xml:space="preserve"> </w:t>
+      </w:r>
+      <w:r>
+        <w:rPr>
+          <w:rFonts w:ascii="Times New Roman" w:hAnsi="Times New Roman"/>
+          <w:sz w:val="24"/>
+        </w:rPr>
         <w:t xml:space="preserve">large-cohort genomics, mutation signatures, and clinically relevant</w:t>
       </w:r>
       <w:r>
-        <w:t xml:space="preserve"> </w:t>
-      </w:r>
-      <w:r>
+        <w:rPr>
+          <w:rFonts w:ascii="Times New Roman" w:hAnsi="Times New Roman"/>
+          <w:sz w:val="24"/>
+        </w:rPr>
+        <w:t xml:space="preserve"> </w:t>
+      </w:r>
+      <w:r>
+        <w:rPr>
+          <w:rFonts w:ascii="Times New Roman" w:hAnsi="Times New Roman"/>
+          <w:sz w:val="24"/>
+        </w:rPr>
         <w:t xml:space="preserve">language in a conventional IMRaD structure.</w:t>
       </w:r>
     </w:p>
@@ -465,45 +872,95 @@
         <w:ind w:firstLine="0"/>
       </w:pPr>
       <w:r>
+        <w:rPr>
+          <w:rFonts w:ascii="Times New Roman" w:hAnsi="Times New Roman"/>
+          <w:sz w:val="24"/>
+        </w:rPr>
         <w:t xml:space="preserve">This project does not reproduce the journal article verbatim.</w:t>
       </w:r>
       <w:r>
-        <w:t xml:space="preserve"> </w:t>
-      </w:r>
-      <w:r>
+        <w:rPr>
+          <w:rFonts w:ascii="Times New Roman" w:hAnsi="Times New Roman"/>
+          <w:sz w:val="24"/>
+        </w:rPr>
+        <w:t xml:space="preserve"> </w:t>
+      </w:r>
+      <w:r>
+        <w:rPr>
+          <w:rFonts w:ascii="Times New Roman" w:hAnsi="Times New Roman"/>
+          <w:sz w:val="24"/>
+        </w:rPr>
         <w:t xml:space="preserve">Instead, it uses publicly accessible metadata and abstract-level</w:t>
       </w:r>
       <w:r>
-        <w:t xml:space="preserve"> </w:t>
-      </w:r>
-      <w:r>
+        <w:rPr>
+          <w:rFonts w:ascii="Times New Roman" w:hAnsi="Times New Roman"/>
+          <w:sz w:val="24"/>
+        </w:rPr>
+        <w:t xml:space="preserve"> </w:t>
+      </w:r>
+      <w:r>
+        <w:rPr>
+          <w:rFonts w:ascii="Times New Roman" w:hAnsi="Times New Roman"/>
+          <w:sz w:val="24"/>
+        </w:rPr>
         <w:t xml:space="preserve">findings to create a clean demonstration manuscript for the</w:t>
       </w:r>
       <w:r>
+        <w:rPr>
+          <w:rFonts w:ascii="Times New Roman" w:hAnsi="Times New Roman"/>
+          <w:sz w:val="24"/>
+        </w:rPr>
         <w:t xml:space="preserve"> </w:t>
       </w:r>
       <w:r>
         <w:rPr>
           <w:rStyle w:val="VerbatimChar"/>
+          <w:rFonts w:ascii="Times New Roman" w:hAnsi="Times New Roman"/>
+          <w:sz w:val="24"/>
         </w:rPr>
         <w:t xml:space="preserve">bensz-paper</w:t>
       </w:r>
       <w:r>
-        <w:t xml:space="preserve"> </w:t>
-      </w:r>
-      <w:r>
+        <w:rPr>
+          <w:rFonts w:ascii="Times New Roman" w:hAnsi="Times New Roman"/>
+          <w:sz w:val="24"/>
+        </w:rPr>
+        <w:t xml:space="preserve"> </w:t>
+      </w:r>
+      <w:r>
+        <w:rPr>
+          <w:rFonts w:ascii="Times New Roman" w:hAnsi="Times New Roman"/>
+          <w:sz w:val="24"/>
+        </w:rPr>
         <w:t xml:space="preserve">package. The goal is to give repository users a</w:t>
       </w:r>
       <w:r>
-        <w:t xml:space="preserve"> </w:t>
-      </w:r>
-      <w:r>
+        <w:rPr>
+          <w:rFonts w:ascii="Times New Roman" w:hAnsi="Times New Roman"/>
+          <w:sz w:val="24"/>
+        </w:rPr>
+        <w:t xml:space="preserve"> </w:t>
+      </w:r>
+      <w:r>
+        <w:rPr>
+          <w:rFonts w:ascii="Times New Roman" w:hAnsi="Times New Roman"/>
+          <w:sz w:val="24"/>
+        </w:rPr>
         <w:t xml:space="preserve">ready-to-render SCI template with both PDF and Word outputs while</w:t>
       </w:r>
       <w:r>
-        <w:t xml:space="preserve"> </w:t>
-      </w:r>
-      <w:r>
+        <w:rPr>
+          <w:rFonts w:ascii="Times New Roman" w:hAnsi="Times New Roman"/>
+          <w:sz w:val="24"/>
+        </w:rPr>
+        <w:t xml:space="preserve"> </w:t>
+      </w:r>
+      <w:r>
+        <w:rPr>
+          <w:rFonts w:ascii="Times New Roman" w:hAnsi="Times New Roman"/>
+          <w:sz w:val="24"/>
+        </w:rPr>
         <w:t xml:space="preserve">keeping the sample text openly shareable.</w:t>
       </w:r>
     </w:p>
@@ -512,11 +969,16 @@
     <w:p>
       <w:pPr>
         <w:pStyle w:val="1"/>
-        <w:spacing w:line="360" w:lineRule="auto" w:after="80" w:before="0"/>
+        <w:spacing w:line="360" w:lineRule="exact" w:after="60" w:before="0"/>
         <w:ind w:firstLine="0"/>
         <w:jc w:val="left"/>
       </w:pPr>
       <w:r>
+        <w:rPr>
+          <w:rFonts w:ascii="Times New Roman" w:hAnsi="Times New Roman"/>
+          <w:b/>
+          <w:sz w:val="28"/>
+        </w:rPr>
         <w:t xml:space="preserve">Methods</w:t>
       </w:r>
     </w:p>
@@ -527,40 +989,86 @@
         <w:ind w:firstLine="0"/>
       </w:pPr>
       <w:r>
+        <w:rPr>
+          <w:rFonts w:ascii="Times New Roman" w:hAnsi="Times New Roman"/>
+          <w:sz w:val="24"/>
+        </w:rPr>
         <w:t xml:space="preserve">For this demonstration project, we used only public information</w:t>
       </w:r>
       <w:r>
-        <w:t xml:space="preserve"> </w:t>
-      </w:r>
-      <w:r>
+        <w:rPr>
+          <w:rFonts w:ascii="Times New Roman" w:hAnsi="Times New Roman"/>
+          <w:sz w:val="24"/>
+        </w:rPr>
+        <w:t xml:space="preserve"> </w:t>
+      </w:r>
+      <w:r>
+        <w:rPr>
+          <w:rFonts w:ascii="Times New Roman" w:hAnsi="Times New Roman"/>
+          <w:sz w:val="24"/>
+        </w:rPr>
         <w:t xml:space="preserve">available from the published bibliographic record and abstract of the</w:t>
       </w:r>
       <w:r>
-        <w:t xml:space="preserve"> </w:t>
-      </w:r>
-      <w:r>
+        <w:rPr>
+          <w:rFonts w:ascii="Times New Roman" w:hAnsi="Times New Roman"/>
+          <w:sz w:val="24"/>
+        </w:rPr>
+        <w:t xml:space="preserve"> </w:t>
+      </w:r>
+      <w:r>
+        <w:rPr>
+          <w:rFonts w:ascii="Times New Roman" w:hAnsi="Times New Roman"/>
+          <w:sz w:val="24"/>
+        </w:rPr>
         <w:t xml:space="preserve">source article</w:t>
       </w:r>
-      <w:r>
-        <w:rPr>
-          <w:vertAlign w:val="superscript"/>
-        </w:rPr>
-        <w:t xml:space="preserve">1</w:t>
-      </w:r>
-      <w:r>
-        <w:t xml:space="preserve">. No unpublished files,</w:t>
-      </w:r>
-      <w:r>
-        <w:t xml:space="preserve"> </w:t>
-      </w:r>
-      <w:r>
-        <w:t xml:space="preserve">figures, supplementary tables, or protected full-text material from</w:t>
-      </w:r>
-      <w:r>
-        <w:t xml:space="preserve"> </w:t>
-      </w:r>
-      <w:r>
-        <w:t xml:space="preserve">other manuscripts were imported into this repository.</w:t>
+      <w:hyperlink w:anchor="ref-1">
+        <w:r>
+          <w:rPr>
+            <w:rFonts w:ascii="Times New Roman" w:hAnsi="Times New Roman"/>
+            <w:sz w:val="24"/>
+            <w:vertAlign w:val="superscript"/>
+            <w:color w:val="0000FF"/>
+            <w:u w:val="none"/>
+          </w:rPr>
+          <w:t xml:space="preserve">[1]</w:t>
+        </w:r>
+      </w:hyperlink>
+      <w:r>
+        <w:rPr>
+          <w:rFonts w:ascii="Times New Roman" w:hAnsi="Times New Roman"/>
+          <w:sz w:val="24"/>
+        </w:rPr>
+        <w:t xml:space="preserve">. No unpublished</w:t>
+      </w:r>
+      <w:r>
+        <w:rPr>
+          <w:rFonts w:ascii="Times New Roman" w:hAnsi="Times New Roman"/>
+          <w:sz w:val="24"/>
+        </w:rPr>
+        <w:t xml:space="preserve"> </w:t>
+      </w:r>
+      <w:r>
+        <w:rPr>
+          <w:rFonts w:ascii="Times New Roman" w:hAnsi="Times New Roman"/>
+          <w:sz w:val="24"/>
+        </w:rPr>
+        <w:t xml:space="preserve">files, figures, supplementary tables, or protected full-text material</w:t>
+      </w:r>
+      <w:r>
+        <w:rPr>
+          <w:rFonts w:ascii="Times New Roman" w:hAnsi="Times New Roman"/>
+          <w:sz w:val="24"/>
+        </w:rPr>
+        <w:t xml:space="preserve"> </w:t>
+      </w:r>
+      <w:r>
+        <w:rPr>
+          <w:rFonts w:ascii="Times New Roman" w:hAnsi="Times New Roman"/>
+          <w:sz w:val="24"/>
+        </w:rPr>
+        <w:t xml:space="preserve">from other manuscripts were imported into this repository.</w:t>
       </w:r>
     </w:p>
     <w:p>
@@ -570,87 +1078,175 @@
         <w:ind w:firstLine="0"/>
       </w:pPr>
       <w:r>
+        <w:rPr>
+          <w:rFonts w:ascii="Times New Roman" w:hAnsi="Times New Roman"/>
+          <w:sz w:val="24"/>
+        </w:rPr>
         <w:t xml:space="preserve">The manuscript body is maintained directly as LaTeX fragments under</w:t>
       </w:r>
       <w:r>
+        <w:rPr>
+          <w:rFonts w:ascii="Times New Roman" w:hAnsi="Times New Roman"/>
+          <w:sz w:val="24"/>
+        </w:rPr>
         <w:t xml:space="preserve"> </w:t>
       </w:r>
       <w:r>
         <w:rPr>
           <w:rStyle w:val="VerbatimChar"/>
+          <w:rFonts w:ascii="Times New Roman" w:hAnsi="Times New Roman"/>
+          <w:sz w:val="24"/>
         </w:rPr>
         <w:t xml:space="preserve">extraTex/</w:t>
       </w:r>
       <w:r>
+        <w:rPr>
+          <w:rFonts w:ascii="Times New Roman" w:hAnsi="Times New Roman"/>
+          <w:sz w:val="24"/>
+        </w:rPr>
         <w:t xml:space="preserve">. During build,</w:t>
       </w:r>
       <w:r>
+        <w:rPr>
+          <w:rFonts w:ascii="Times New Roman" w:hAnsi="Times New Roman"/>
+          <w:sz w:val="24"/>
+        </w:rPr>
         <w:t xml:space="preserve"> </w:t>
       </w:r>
       <w:r>
         <w:rPr>
           <w:rStyle w:val="VerbatimChar"/>
+          <w:rFonts w:ascii="Times New Roman" w:hAnsi="Times New Roman"/>
+          <w:sz w:val="24"/>
         </w:rPr>
         <w:t xml:space="preserve">packages/bensz-paper/scripts/manuscript_tool.py</w:t>
       </w:r>
       <w:r>
-        <w:t xml:space="preserve"> </w:t>
-      </w:r>
-      <w:r>
+        <w:rPr>
+          <w:rFonts w:ascii="Times New Roman" w:hAnsi="Times New Roman"/>
+          <w:sz w:val="24"/>
+        </w:rPr>
+        <w:t xml:space="preserve"> </w:t>
+      </w:r>
+      <w:r>
+        <w:rPr>
+          <w:rFonts w:ascii="Times New Roman" w:hAnsi="Times New Roman"/>
+          <w:sz w:val="24"/>
+        </w:rPr>
         <w:t xml:space="preserve">compiles</w:t>
       </w:r>
       <w:r>
+        <w:rPr>
+          <w:rFonts w:ascii="Times New Roman" w:hAnsi="Times New Roman"/>
+          <w:sz w:val="24"/>
+        </w:rPr>
         <w:t xml:space="preserve"> </w:t>
       </w:r>
       <w:r>
         <w:rPr>
           <w:rStyle w:val="VerbatimChar"/>
+          <w:rFonts w:ascii="Times New Roman" w:hAnsi="Times New Roman"/>
+          <w:sz w:val="24"/>
         </w:rPr>
         <w:t xml:space="preserve">main.tex</w:t>
       </w:r>
       <w:r>
-        <w:t xml:space="preserve"> </w:t>
-      </w:r>
-      <w:r>
+        <w:rPr>
+          <w:rFonts w:ascii="Times New Roman" w:hAnsi="Times New Roman"/>
+          <w:sz w:val="24"/>
+        </w:rPr>
+        <w:t xml:space="preserve"> </w:t>
+      </w:r>
+      <w:r>
+        <w:rPr>
+          <w:rFonts w:ascii="Times New Roman" w:hAnsi="Times New Roman"/>
+          <w:sz w:val="24"/>
+        </w:rPr>
         <w:t xml:space="preserve">against those source files for PDF output and</w:t>
       </w:r>
       <w:r>
-        <w:t xml:space="preserve"> </w:t>
-      </w:r>
-      <w:r>
+        <w:rPr>
+          <w:rFonts w:ascii="Times New Roman" w:hAnsi="Times New Roman"/>
+          <w:sz w:val="24"/>
+        </w:rPr>
+        <w:t xml:space="preserve"> </w:t>
+      </w:r>
+      <w:r>
+        <w:rPr>
+          <w:rFonts w:ascii="Times New Roman" w:hAnsi="Times New Roman"/>
+          <w:sz w:val="24"/>
+        </w:rPr>
         <w:t xml:space="preserve">converts the same</w:t>
       </w:r>
       <w:r>
+        <w:rPr>
+          <w:rFonts w:ascii="Times New Roman" w:hAnsi="Times New Roman"/>
+          <w:sz w:val="24"/>
+        </w:rPr>
         <w:t xml:space="preserve"> </w:t>
       </w:r>
       <w:r>
         <w:rPr>
           <w:rStyle w:val="VerbatimChar"/>
+          <w:rFonts w:ascii="Times New Roman" w:hAnsi="Times New Roman"/>
+          <w:sz w:val="24"/>
         </w:rPr>
         <w:t xml:space="preserve">extraTex/**/*.tex</w:t>
       </w:r>
       <w:r>
-        <w:t xml:space="preserve"> </w:t>
-      </w:r>
-      <w:r>
+        <w:rPr>
+          <w:rFonts w:ascii="Times New Roman" w:hAnsi="Times New Roman"/>
+          <w:sz w:val="24"/>
+        </w:rPr>
+        <w:t xml:space="preserve"> </w:t>
+      </w:r>
+      <w:r>
+        <w:rPr>
+          <w:rFonts w:ascii="Times New Roman" w:hAnsi="Times New Roman"/>
+          <w:sz w:val="24"/>
+        </w:rPr>
         <w:t xml:space="preserve">fragments into</w:t>
       </w:r>
       <w:r>
-        <w:t xml:space="preserve"> </w:t>
-      </w:r>
-      <w:r>
+        <w:rPr>
+          <w:rFonts w:ascii="Times New Roman" w:hAnsi="Times New Roman"/>
+          <w:sz w:val="24"/>
+        </w:rPr>
+        <w:t xml:space="preserve"> </w:t>
+      </w:r>
+      <w:r>
+        <w:rPr>
+          <w:rFonts w:ascii="Times New Roman" w:hAnsi="Times New Roman"/>
+          <w:sz w:val="24"/>
+        </w:rPr>
         <w:t xml:space="preserve">temporary Markdown at runtime for Pandoc-based DOCX export. The Markdown</w:t>
       </w:r>
       <w:r>
-        <w:t xml:space="preserve"> </w:t>
-      </w:r>
-      <w:r>
+        <w:rPr>
+          <w:rFonts w:ascii="Times New Roman" w:hAnsi="Times New Roman"/>
+          <w:sz w:val="24"/>
+        </w:rPr>
+        <w:t xml:space="preserve"> </w:t>
+      </w:r>
+      <w:r>
+        <w:rPr>
+          <w:rFonts w:ascii="Times New Roman" w:hAnsi="Times New Roman"/>
+          <w:sz w:val="24"/>
+        </w:rPr>
         <w:t xml:space="preserve">is treated only as an intermediate representation and is not stored as a</w:t>
       </w:r>
       <w:r>
-        <w:t xml:space="preserve"> </w:t>
-      </w:r>
-      <w:r>
+        <w:rPr>
+          <w:rFonts w:ascii="Times New Roman" w:hAnsi="Times New Roman"/>
+          <w:sz w:val="24"/>
+        </w:rPr>
+        <w:t xml:space="preserve"> </w:t>
+      </w:r>
+      <w:r>
+        <w:rPr>
+          <w:rFonts w:ascii="Times New Roman" w:hAnsi="Times New Roman"/>
+          <w:sz w:val="24"/>
+        </w:rPr>
         <w:t xml:space="preserve">second editable source of truth.</w:t>
       </w:r>
     </w:p>
@@ -661,57 +1257,117 @@
         <w:ind w:firstLine="0"/>
       </w:pPr>
       <w:r>
+        <w:rPr>
+          <w:rFonts w:ascii="Times New Roman" w:hAnsi="Times New Roman"/>
+          <w:sz w:val="24"/>
+        </w:rPr>
         <w:t xml:space="preserve">PDF rendering follows the fixed sequence</w:t>
       </w:r>
       <w:r>
+        <w:rPr>
+          <w:rFonts w:ascii="Times New Roman" w:hAnsi="Times New Roman"/>
+          <w:sz w:val="24"/>
+        </w:rPr>
         <w:t xml:space="preserve"> </w:t>
       </w:r>
       <w:r>
         <w:rPr>
           <w:rStyle w:val="VerbatimChar"/>
+          <w:rFonts w:ascii="Times New Roman" w:hAnsi="Times New Roman"/>
+          <w:sz w:val="24"/>
         </w:rPr>
         <w:t xml:space="preserve">xelatex -&gt; biber -&gt; xelatex -&gt; xelatex</w:t>
       </w:r>
       <w:r>
+        <w:rPr>
+          <w:rFonts w:ascii="Times New Roman" w:hAnsi="Times New Roman"/>
+          <w:sz w:val="24"/>
+        </w:rPr>
         <w:t xml:space="preserve">. DOCX</w:t>
       </w:r>
       <w:r>
-        <w:t xml:space="preserve"> </w:t>
-      </w:r>
-      <w:r>
+        <w:rPr>
+          <w:rFonts w:ascii="Times New Roman" w:hAnsi="Times New Roman"/>
+          <w:sz w:val="24"/>
+        </w:rPr>
+        <w:t xml:space="preserve"> </w:t>
+      </w:r>
+      <w:r>
+        <w:rPr>
+          <w:rFonts w:ascii="Times New Roman" w:hAnsi="Times New Roman"/>
+          <w:sz w:val="24"/>
+        </w:rPr>
         <w:t xml:space="preserve">rendering uses Pandoc with the bundled</w:t>
       </w:r>
       <w:r>
+        <w:rPr>
+          <w:rFonts w:ascii="Times New Roman" w:hAnsi="Times New Roman"/>
+          <w:sz w:val="24"/>
+        </w:rPr>
         <w:t xml:space="preserve"> </w:t>
       </w:r>
       <w:r>
         <w:rPr>
           <w:rStyle w:val="VerbatimChar"/>
+          <w:rFonts w:ascii="Times New Roman" w:hAnsi="Times New Roman"/>
+          <w:sz w:val="24"/>
         </w:rPr>
         <w:t xml:space="preserve">reference.docx</w:t>
       </w:r>
       <w:r>
-        <w:t xml:space="preserve"> </w:t>
-      </w:r>
-      <w:r>
+        <w:rPr>
+          <w:rFonts w:ascii="Times New Roman" w:hAnsi="Times New Roman"/>
+          <w:sz w:val="24"/>
+        </w:rPr>
+        <w:t xml:space="preserve"> </w:t>
+      </w:r>
+      <w:r>
+        <w:rPr>
+          <w:rFonts w:ascii="Times New Roman" w:hAnsi="Times New Roman"/>
+          <w:sz w:val="24"/>
+        </w:rPr>
         <w:t xml:space="preserve">and</w:t>
       </w:r>
       <w:r>
-        <w:t xml:space="preserve"> </w:t>
-      </w:r>
-      <w:r>
+        <w:rPr>
+          <w:rFonts w:ascii="Times New Roman" w:hAnsi="Times New Roman"/>
+          <w:sz w:val="24"/>
+        </w:rPr>
+        <w:t xml:space="preserve"> </w:t>
+      </w:r>
+      <w:r>
+        <w:rPr>
+          <w:rFonts w:ascii="Times New Roman" w:hAnsi="Times New Roman"/>
+          <w:sz w:val="24"/>
+        </w:rPr>
         <w:t xml:space="preserve">CSL file, after which a post-processing step normalizes line spacing,</w:t>
       </w:r>
       <w:r>
-        <w:t xml:space="preserve"> </w:t>
-      </w:r>
-      <w:r>
+        <w:rPr>
+          <w:rFonts w:ascii="Times New Roman" w:hAnsi="Times New Roman"/>
+          <w:sz w:val="24"/>
+        </w:rPr>
+        <w:t xml:space="preserve"> </w:t>
+      </w:r>
+      <w:r>
+        <w:rPr>
+          <w:rFonts w:ascii="Times New Roman" w:hAnsi="Times New Roman"/>
+          <w:sz w:val="24"/>
+        </w:rPr>
         <w:t xml:space="preserve">paragraph spacing, and bibliography placement so that the Word output</w:t>
       </w:r>
       <w:r>
-        <w:t xml:space="preserve"> </w:t>
-      </w:r>
-      <w:r>
+        <w:rPr>
+          <w:rFonts w:ascii="Times New Roman" w:hAnsi="Times New Roman"/>
+          <w:sz w:val="24"/>
+        </w:rPr>
+        <w:t xml:space="preserve"> </w:t>
+      </w:r>
+      <w:r>
+        <w:rPr>
+          <w:rFonts w:ascii="Times New Roman" w:hAnsi="Times New Roman"/>
+          <w:sz w:val="24"/>
+        </w:rPr>
         <w:t xml:space="preserve">remains visually close to the LaTeX PDF.</w:t>
       </w:r>
     </w:p>
@@ -722,18 +1378,38 @@
         <w:ind w:firstLine="0"/>
       </w:pPr>
       <w:r>
+        <w:rPr>
+          <w:rFonts w:ascii="Times New Roman" w:hAnsi="Times New Roman"/>
+          <w:sz w:val="24"/>
+        </w:rPr>
         <w:t xml:space="preserve">To keep the PDF and DOCX outputs exercising the same table-rendering</w:t>
       </w:r>
       <w:r>
-        <w:t xml:space="preserve"> </w:t>
-      </w:r>
-      <w:r>
+        <w:rPr>
+          <w:rFonts w:ascii="Times New Roman" w:hAnsi="Times New Roman"/>
+          <w:sz w:val="24"/>
+        </w:rPr>
+        <w:t xml:space="preserve"> </w:t>
+      </w:r>
+      <w:r>
+        <w:rPr>
+          <w:rFonts w:ascii="Times New Roman" w:hAnsi="Times New Roman"/>
+          <w:sz w:val="24"/>
+        </w:rPr>
         <w:t xml:space="preserve">path, the demo manuscript also includes one compact resource table built</w:t>
       </w:r>
       <w:r>
-        <w:t xml:space="preserve"> </w:t>
-      </w:r>
-      <w:r>
+        <w:rPr>
+          <w:rFonts w:ascii="Times New Roman" w:hAnsi="Times New Roman"/>
+          <w:sz w:val="24"/>
+        </w:rPr>
+        <w:t xml:space="preserve"> </w:t>
+      </w:r>
+      <w:r>
+        <w:rPr>
+          <w:rFonts w:ascii="Times New Roman" w:hAnsi="Times New Roman"/>
+          <w:sz w:val="24"/>
+        </w:rPr>
         <w:t xml:space="preserve">directly from the LaTeX source of truth.</w:t>
       </w:r>
     </w:p>
@@ -744,6 +1420,10 @@
         <w:ind w:firstLine="0"/>
       </w:pPr>
       <w:r>
+        <w:rPr>
+          <w:rFonts w:ascii="Times New Roman" w:hAnsi="Times New Roman"/>
+          <w:sz w:val="24"/>
+        </w:rPr>
         <w:t xml:space="preserve">Public resources used in the demo build pipeline</w:t>
       </w:r>
     </w:p>
@@ -885,11 +1565,16 @@
     <w:p>
       <w:pPr>
         <w:pStyle w:val="1"/>
-        <w:spacing w:line="360" w:lineRule="auto" w:after="80" w:before="0"/>
+        <w:spacing w:line="360" w:lineRule="exact" w:after="60" w:before="0"/>
         <w:ind w:firstLine="0"/>
         <w:jc w:val="left"/>
       </w:pPr>
       <w:r>
+        <w:rPr>
+          <w:rFonts w:ascii="Times New Roman" w:hAnsi="Times New Roman"/>
+          <w:b/>
+          <w:sz w:val="28"/>
+        </w:rPr>
         <w:t xml:space="preserve">Results</w:t>
       </w:r>
     </w:p>
@@ -900,51 +1585,113 @@
         <w:ind w:firstLine="0"/>
       </w:pPr>
       <w:r>
+        <w:rPr>
+          <w:rFonts w:ascii="Times New Roman" w:hAnsi="Times New Roman"/>
+          <w:sz w:val="24"/>
+        </w:rPr>
         <w:t xml:space="preserve">Greenhalgh et al. reported that structural-variation burden varied by</w:t>
       </w:r>
       <w:r>
-        <w:t xml:space="preserve"> </w:t>
-      </w:r>
-      <w:r>
+        <w:rPr>
+          <w:rFonts w:ascii="Times New Roman" w:hAnsi="Times New Roman"/>
+          <w:sz w:val="24"/>
+        </w:rPr>
+        <w:t xml:space="preserve"> </w:t>
+      </w:r>
+      <w:r>
+        <w:rPr>
+          <w:rFonts w:ascii="Times New Roman" w:hAnsi="Times New Roman"/>
+          <w:sz w:val="24"/>
+        </w:rPr>
         <w:t xml:space="preserve">roughly two orders of magnitude across pediatric cancer types,</w:t>
       </w:r>
       <w:r>
-        <w:t xml:space="preserve"> </w:t>
-      </w:r>
-      <w:r>
+        <w:rPr>
+          <w:rFonts w:ascii="Times New Roman" w:hAnsi="Times New Roman"/>
+          <w:sz w:val="24"/>
+        </w:rPr>
+        <w:t xml:space="preserve"> </w:t>
+      </w:r>
+      <w:r>
+        <w:rPr>
+          <w:rFonts w:ascii="Times New Roman" w:hAnsi="Times New Roman"/>
+          <w:sz w:val="24"/>
+        </w:rPr>
         <w:t xml:space="preserve">underscoring that rearrangement biology is highly disease-specific</w:t>
       </w:r>
       <w:r>
-        <w:t xml:space="preserve"> </w:t>
-      </w:r>
-      <w:r>
+        <w:rPr>
+          <w:rFonts w:ascii="Times New Roman" w:hAnsi="Times New Roman"/>
+          <w:sz w:val="24"/>
+        </w:rPr>
+        <w:t xml:space="preserve"> </w:t>
+      </w:r>
+      <w:r>
+        <w:rPr>
+          <w:rFonts w:ascii="Times New Roman" w:hAnsi="Times New Roman"/>
+          <w:sz w:val="24"/>
+        </w:rPr>
         <w:t xml:space="preserve">rather than uniform across childhood malignancies</w:t>
       </w:r>
-      <w:r>
-        <w:rPr>
-          <w:vertAlign w:val="superscript"/>
-        </w:rPr>
-        <w:t xml:space="preserve">1</w:t>
-      </w:r>
-      <w:r>
+      <w:hyperlink w:anchor="ref-1">
+        <w:r>
+          <w:rPr>
+            <w:rFonts w:ascii="Times New Roman" w:hAnsi="Times New Roman"/>
+            <w:sz w:val="24"/>
+            <w:vertAlign w:val="superscript"/>
+            <w:color w:val="0000FF"/>
+            <w:u w:val="none"/>
+          </w:rPr>
+          <w:t xml:space="preserve">[1]</w:t>
+        </w:r>
+      </w:hyperlink>
+      <w:r>
+        <w:rPr>
+          <w:rFonts w:ascii="Times New Roman" w:hAnsi="Times New Roman"/>
+          <w:sz w:val="24"/>
+        </w:rPr>
         <w:t xml:space="preserve">. Compared with adult</w:t>
       </w:r>
       <w:r>
-        <w:t xml:space="preserve"> </w:t>
-      </w:r>
-      <w:r>
+        <w:rPr>
+          <w:rFonts w:ascii="Times New Roman" w:hAnsi="Times New Roman"/>
+          <w:sz w:val="24"/>
+        </w:rPr>
+        <w:t xml:space="preserve"> </w:t>
+      </w:r>
+      <w:r>
+        <w:rPr>
+          <w:rFonts w:ascii="Times New Roman" w:hAnsi="Times New Roman"/>
+          <w:sz w:val="24"/>
+        </w:rPr>
         <w:t xml:space="preserve">brain and solid tumors, most pediatric solid cancers carried</w:t>
       </w:r>
       <w:r>
-        <w:t xml:space="preserve"> </w:t>
-      </w:r>
-      <w:r>
+        <w:rPr>
+          <w:rFonts w:ascii="Times New Roman" w:hAnsi="Times New Roman"/>
+          <w:sz w:val="24"/>
+        </w:rPr>
+        <w:t xml:space="preserve"> </w:t>
+      </w:r>
+      <w:r>
+        <w:rPr>
+          <w:rFonts w:ascii="Times New Roman" w:hAnsi="Times New Roman"/>
+          <w:sz w:val="24"/>
+        </w:rPr>
         <w:t xml:space="preserve">substantially fewer structural variants, whereas hematological</w:t>
       </w:r>
       <w:r>
-        <w:t xml:space="preserve"> </w:t>
-      </w:r>
-      <w:r>
+        <w:rPr>
+          <w:rFonts w:ascii="Times New Roman" w:hAnsi="Times New Roman"/>
+          <w:sz w:val="24"/>
+        </w:rPr>
+        <w:t xml:space="preserve"> </w:t>
+      </w:r>
+      <w:r>
+        <w:rPr>
+          <w:rFonts w:ascii="Times New Roman" w:hAnsi="Times New Roman"/>
+          <w:sz w:val="24"/>
+        </w:rPr>
         <w:t xml:space="preserve">malignancies showed a much closer burden profile.</w:t>
       </w:r>
     </w:p>
@@ -955,15 +1702,31 @@
         <w:ind w:firstLine="0"/>
       </w:pPr>
       <w:r>
+        <w:rPr>
+          <w:rFonts w:ascii="Times New Roman" w:hAnsi="Times New Roman"/>
+          <w:sz w:val="24"/>
+        </w:rPr>
         <w:t xml:space="preserve">To make formula support easier to review by eye, the demo manuscript</w:t>
       </w:r>
       <w:r>
-        <w:t xml:space="preserve"> </w:t>
-      </w:r>
-      <w:r>
+        <w:rPr>
+          <w:rFonts w:ascii="Times New Roman" w:hAnsi="Times New Roman"/>
+          <w:sz w:val="24"/>
+        </w:rPr>
+        <w:t xml:space="preserve"> </w:t>
+      </w:r>
+      <w:r>
+        <w:rPr>
+          <w:rFonts w:ascii="Times New Roman" w:hAnsi="Times New Roman"/>
+          <w:sz w:val="24"/>
+        </w:rPr>
         <w:t xml:space="preserve">now includes a compact set of representative expressions. Let</w:t>
       </w:r>
       <w:r>
+        <w:rPr>
+          <w:rFonts w:ascii="Times New Roman" w:hAnsi="Times New Roman"/>
+          <w:sz w:val="24"/>
+        </w:rPr>
         <w:t xml:space="preserve"> </w:t>
       </w:r>
       <m:oMath>
@@ -972,12 +1735,24 @@
         </m:r>
       </m:oMath>
       <w:r>
-        <w:t xml:space="preserve"> </w:t>
-      </w:r>
-      <w:r>
+        <w:rPr>
+          <w:rFonts w:ascii="Times New Roman" w:hAnsi="Times New Roman"/>
+          <w:sz w:val="24"/>
+        </w:rPr>
+        <w:t xml:space="preserve"> </w:t>
+      </w:r>
+      <w:r>
+        <w:rPr>
+          <w:rFonts w:ascii="Times New Roman" w:hAnsi="Times New Roman"/>
+          <w:sz w:val="24"/>
+        </w:rPr>
         <w:t xml:space="preserve">denote a rank-based association summary, let</w:t>
       </w:r>
       <w:r>
+        <w:rPr>
+          <w:rFonts w:ascii="Times New Roman" w:hAnsi="Times New Roman"/>
+          <w:sz w:val="24"/>
+        </w:rPr>
         <w:t xml:space="preserve"> </w:t>
       </w:r>
       <m:oMath>
@@ -989,12 +1764,24 @@
         </m:r>
       </m:oMath>
       <w:r>
-        <w:t xml:space="preserve"> </w:t>
-      </w:r>
-      <w:r>
+        <w:rPr>
+          <w:rFonts w:ascii="Times New Roman" w:hAnsi="Times New Roman"/>
+          <w:sz w:val="24"/>
+        </w:rPr>
+        <w:t xml:space="preserve"> </w:t>
+      </w:r>
+      <w:r>
+        <w:rPr>
+          <w:rFonts w:ascii="Times New Roman" w:hAnsi="Times New Roman"/>
+          <w:sz w:val="24"/>
+        </w:rPr>
         <w:t xml:space="preserve">denote a between-group burden shift, let</w:t>
       </w:r>
       <w:r>
+        <w:rPr>
+          <w:rFonts w:ascii="Times New Roman" w:hAnsi="Times New Roman"/>
+          <w:sz w:val="24"/>
+        </w:rPr>
         <w:t xml:space="preserve"> </w:t>
       </w:r>
       <m:oMath>
@@ -1010,12 +1797,24 @@
         </m:acc>
       </m:oMath>
       <w:r>
-        <w:t xml:space="preserve"> </w:t>
-      </w:r>
-      <w:r>
+        <w:rPr>
+          <w:rFonts w:ascii="Times New Roman" w:hAnsi="Times New Roman"/>
+          <w:sz w:val="24"/>
+        </w:rPr>
+        <w:t xml:space="preserve"> </w:t>
+      </w:r>
+      <w:r>
+        <w:rPr>
+          <w:rFonts w:ascii="Times New Roman" w:hAnsi="Times New Roman"/>
+          <w:sz w:val="24"/>
+        </w:rPr>
         <w:t xml:space="preserve">denote an estimated scaling factor, and let</w:t>
       </w:r>
       <w:r>
+        <w:rPr>
+          <w:rFonts w:ascii="Times New Roman" w:hAnsi="Times New Roman"/>
+          <w:sz w:val="24"/>
+        </w:rPr>
         <w:t xml:space="preserve"> </w:t>
       </w:r>
       <m:oMath>
@@ -1051,12 +1850,24 @@
         </m:sSub>
       </m:oMath>
       <w:r>
-        <w:t xml:space="preserve"> </w:t>
-      </w:r>
-      <w:r>
+        <w:rPr>
+          <w:rFonts w:ascii="Times New Roman" w:hAnsi="Times New Roman"/>
+          <w:sz w:val="24"/>
+        </w:rPr>
+        <w:t xml:space="preserve"> </w:t>
+      </w:r>
+      <w:r>
+        <w:rPr>
+          <w:rFonts w:ascii="Times New Roman" w:hAnsi="Times New Roman"/>
+          <w:sz w:val="24"/>
+        </w:rPr>
         <w:t xml:space="preserve">denote the structural-variation count for sample</w:t>
       </w:r>
       <w:r>
+        <w:rPr>
+          <w:rFonts w:ascii="Times New Roman" w:hAnsi="Times New Roman"/>
+          <w:sz w:val="24"/>
+        </w:rPr>
         <w:t xml:space="preserve"> </w:t>
       </w:r>
       <m:oMath>
@@ -1065,12 +1876,24 @@
         </m:r>
       </m:oMath>
       <w:r>
+        <w:rPr>
+          <w:rFonts w:ascii="Times New Roman" w:hAnsi="Times New Roman"/>
+          <w:sz w:val="24"/>
+        </w:rPr>
         <w:t xml:space="preserve">.</w:t>
       </w:r>
       <w:r>
-        <w:t xml:space="preserve"> </w:t>
-      </w:r>
-      <w:r>
+        <w:rPr>
+          <w:rFonts w:ascii="Times New Roman" w:hAnsi="Times New Roman"/>
+          <w:sz w:val="24"/>
+        </w:rPr>
+        <w:t xml:space="preserve"> </w:t>
+      </w:r>
+      <w:r>
+        <w:rPr>
+          <w:rFonts w:ascii="Times New Roman" w:hAnsi="Times New Roman"/>
+          <w:sz w:val="24"/>
+        </w:rPr>
         <w:t xml:space="preserve">A log-scaled burden summary can then be written as</w:t>
       </w:r>
     </w:p>
@@ -1186,9 +2009,17 @@
         <w:ind w:firstLine="0"/>
       </w:pPr>
       <w:r>
+        <w:rPr>
+          <w:rFonts w:ascii="Times New Roman" w:hAnsi="Times New Roman"/>
+          <w:sz w:val="24"/>
+        </w:rPr>
         <w:t xml:space="preserve">Using cohort-level mean</w:t>
       </w:r>
       <w:r>
+        <w:rPr>
+          <w:rFonts w:ascii="Times New Roman" w:hAnsi="Times New Roman"/>
+          <w:sz w:val="24"/>
+        </w:rPr>
         <w:t xml:space="preserve"> </w:t>
       </w:r>
       <m:oMath>
@@ -1206,12 +2037,24 @@
         </m:sSub>
       </m:oMath>
       <w:r>
-        <w:t xml:space="preserve"> </w:t>
-      </w:r>
-      <w:r>
+        <w:rPr>
+          <w:rFonts w:ascii="Times New Roman" w:hAnsi="Times New Roman"/>
+          <w:sz w:val="24"/>
+        </w:rPr>
+        <w:t xml:space="preserve"> </w:t>
+      </w:r>
+      <w:r>
+        <w:rPr>
+          <w:rFonts w:ascii="Times New Roman" w:hAnsi="Times New Roman"/>
+          <w:sz w:val="24"/>
+        </w:rPr>
         <w:t xml:space="preserve">and standard deviation</w:t>
       </w:r>
       <w:r>
+        <w:rPr>
+          <w:rFonts w:ascii="Times New Roman" w:hAnsi="Times New Roman"/>
+          <w:sz w:val="24"/>
+        </w:rPr>
         <w:t xml:space="preserve"> </w:t>
       </w:r>
       <m:oMath>
@@ -1229,12 +2072,24 @@
         </m:sSub>
       </m:oMath>
       <w:r>
+        <w:rPr>
+          <w:rFonts w:ascii="Times New Roman" w:hAnsi="Times New Roman"/>
+          <w:sz w:val="24"/>
+        </w:rPr>
         <w:t xml:space="preserve">,</w:t>
       </w:r>
       <w:r>
-        <w:t xml:space="preserve"> </w:t>
-      </w:r>
-      <w:r>
+        <w:rPr>
+          <w:rFonts w:ascii="Times New Roman" w:hAnsi="Times New Roman"/>
+          <w:sz w:val="24"/>
+        </w:rPr>
+        <w:t xml:space="preserve"> </w:t>
+      </w:r>
+      <w:r>
+        <w:rPr>
+          <w:rFonts w:ascii="Times New Roman" w:hAnsi="Times New Roman"/>
+          <w:sz w:val="24"/>
+        </w:rPr>
         <w:t xml:space="preserve">the standardized burden score is</w:t>
       </w:r>
     </w:p>
@@ -1334,12 +2189,24 @@
         <w:ind w:firstLine="0"/>
       </w:pPr>
       <w:r>
+        <w:rPr>
+          <w:rFonts w:ascii="Times New Roman" w:hAnsi="Times New Roman"/>
+          <w:sz w:val="24"/>
+        </w:rPr>
         <w:t xml:space="preserve">If multiple signature-derived components are combined into a single</w:t>
       </w:r>
       <w:r>
-        <w:t xml:space="preserve"> </w:t>
-      </w:r>
-      <w:r>
+        <w:rPr>
+          <w:rFonts w:ascii="Times New Roman" w:hAnsi="Times New Roman"/>
+          <w:sz w:val="24"/>
+        </w:rPr>
+        <w:t xml:space="preserve"> </w:t>
+      </w:r>
+      <w:r>
+        <w:rPr>
+          <w:rFonts w:ascii="Times New Roman" w:hAnsi="Times New Roman"/>
+          <w:sz w:val="24"/>
+        </w:rPr>
         <w:t xml:space="preserve">review score, one convenient weighted summary is</w:t>
       </w:r>
     </w:p>
@@ -1503,12 +2370,24 @@
         <w:ind w:firstLine="0"/>
       </w:pPr>
       <w:r>
+        <w:rPr>
+          <w:rFonts w:ascii="Times New Roman" w:hAnsi="Times New Roman"/>
+          <w:sz w:val="24"/>
+        </w:rPr>
         <w:t xml:space="preserve">For a simple</w:t>
       </w:r>
       <w:r>
-        <w:t xml:space="preserve"> </w:t>
-      </w:r>
-      <w:r>
+        <w:rPr>
+          <w:rFonts w:ascii="Times New Roman" w:hAnsi="Times New Roman"/>
+          <w:sz w:val="24"/>
+        </w:rPr>
+        <w:t xml:space="preserve"> </w:t>
+      </w:r>
+      <w:r>
+        <w:rPr>
+          <w:rFonts w:ascii="Times New Roman" w:hAnsi="Times New Roman"/>
+          <w:sz w:val="24"/>
+        </w:rPr>
         <w:t xml:space="preserve">threshold-based flag, the indicator variable can be expressed as</w:t>
       </w:r>
     </w:p>
@@ -1698,18 +2577,38 @@
         <w:ind w:firstLine="0"/>
       </w:pPr>
       <w:r>
+        <w:rPr>
+          <w:rFonts w:ascii="Times New Roman" w:hAnsi="Times New Roman"/>
+          <w:sz w:val="24"/>
+        </w:rPr>
         <w:t xml:space="preserve">Together, these examples cover</w:t>
       </w:r>
       <w:r>
-        <w:t xml:space="preserve"> </w:t>
-      </w:r>
-      <w:r>
+        <w:rPr>
+          <w:rFonts w:ascii="Times New Roman" w:hAnsi="Times New Roman"/>
+          <w:sz w:val="24"/>
+        </w:rPr>
+        <w:t xml:space="preserve"> </w:t>
+      </w:r>
+      <w:r>
+        <w:rPr>
+          <w:rFonts w:ascii="Times New Roman" w:hAnsi="Times New Roman"/>
+          <w:sz w:val="24"/>
+        </w:rPr>
         <w:t xml:space="preserve">inline Greek letters, subscripts, superscripts, fractions, summation,</w:t>
       </w:r>
       <w:r>
-        <w:t xml:space="preserve"> </w:t>
-      </w:r>
-      <w:r>
+        <w:rPr>
+          <w:rFonts w:ascii="Times New Roman" w:hAnsi="Times New Roman"/>
+          <w:sz w:val="24"/>
+        </w:rPr>
+        <w:t xml:space="preserve"> </w:t>
+      </w:r>
+      <w:r>
+        <w:rPr>
+          <w:rFonts w:ascii="Times New Roman" w:hAnsi="Times New Roman"/>
+          <w:sz w:val="24"/>
+        </w:rPr>
         <w:t xml:space="preserve">delimiters, and a piecewise definition in both PDF and DOCX export.</w:t>
       </w:r>
     </w:p>
@@ -1720,51 +2619,113 @@
         <w:ind w:firstLine="0"/>
       </w:pPr>
       <w:r>
+        <w:rPr>
+          <w:rFonts w:ascii="Times New Roman" w:hAnsi="Times New Roman"/>
+          <w:sz w:val="24"/>
+        </w:rPr>
         <w:t xml:space="preserve">The same analysis ranked genes disrupted by structural variants and</w:t>
       </w:r>
       <w:r>
-        <w:t xml:space="preserve"> </w:t>
-      </w:r>
-      <w:r>
+        <w:rPr>
+          <w:rFonts w:ascii="Times New Roman" w:hAnsi="Times New Roman"/>
+          <w:sz w:val="24"/>
+        </w:rPr>
+        <w:t xml:space="preserve"> </w:t>
+      </w:r>
+      <w:r>
+        <w:rPr>
+          <w:rFonts w:ascii="Times New Roman" w:hAnsi="Times New Roman"/>
+          <w:sz w:val="24"/>
+        </w:rPr>
         <w:t xml:space="preserve">found that the highest-priority events aligned with recognized pediatric</w:t>
       </w:r>
       <w:r>
-        <w:t xml:space="preserve"> </w:t>
-      </w:r>
-      <w:r>
+        <w:rPr>
+          <w:rFonts w:ascii="Times New Roman" w:hAnsi="Times New Roman"/>
+          <w:sz w:val="24"/>
+        </w:rPr>
+        <w:t xml:space="preserve"> </w:t>
+      </w:r>
+      <w:r>
+        <w:rPr>
+          <w:rFonts w:ascii="Times New Roman" w:hAnsi="Times New Roman"/>
+          <w:sz w:val="24"/>
+        </w:rPr>
         <w:t xml:space="preserve">cancer drivers, while adult cohorts were enriched for disruptions</w:t>
       </w:r>
       <w:r>
-        <w:t xml:space="preserve"> </w:t>
-      </w:r>
-      <w:r>
+        <w:rPr>
+          <w:rFonts w:ascii="Times New Roman" w:hAnsi="Times New Roman"/>
+          <w:sz w:val="24"/>
+        </w:rPr>
+        <w:t xml:space="preserve"> </w:t>
+      </w:r>
+      <w:r>
+        <w:rPr>
+          <w:rFonts w:ascii="Times New Roman" w:hAnsi="Times New Roman"/>
+          <w:sz w:val="24"/>
+        </w:rPr>
         <w:t xml:space="preserve">involving fragile genomic regions</w:t>
       </w:r>
-      <w:r>
-        <w:rPr>
-          <w:vertAlign w:val="superscript"/>
-        </w:rPr>
-        <w:t xml:space="preserve">1</w:t>
-      </w:r>
-      <w:r>
+      <w:hyperlink w:anchor="ref-1">
+        <w:r>
+          <w:rPr>
+            <w:rFonts w:ascii="Times New Roman" w:hAnsi="Times New Roman"/>
+            <w:sz w:val="24"/>
+            <w:vertAlign w:val="superscript"/>
+            <w:color w:val="0000FF"/>
+            <w:u w:val="none"/>
+          </w:rPr>
+          <w:t xml:space="preserve">[1]</w:t>
+        </w:r>
+      </w:hyperlink>
+      <w:r>
+        <w:rPr>
+          <w:rFonts w:ascii="Times New Roman" w:hAnsi="Times New Roman"/>
+          <w:sz w:val="24"/>
+        </w:rPr>
         <w:t xml:space="preserve">. This contrast</w:t>
       </w:r>
       <w:r>
-        <w:t xml:space="preserve"> </w:t>
-      </w:r>
-      <w:r>
+        <w:rPr>
+          <w:rFonts w:ascii="Times New Roman" w:hAnsi="Times New Roman"/>
+          <w:sz w:val="24"/>
+        </w:rPr>
+        <w:t xml:space="preserve"> </w:t>
+      </w:r>
+      <w:r>
+        <w:rPr>
+          <w:rFonts w:ascii="Times New Roman" w:hAnsi="Times New Roman"/>
+          <w:sz w:val="24"/>
+        </w:rPr>
         <w:t xml:space="preserve">suggested that pediatric structural variation more often tracks direct</w:t>
       </w:r>
       <w:r>
-        <w:t xml:space="preserve"> </w:t>
-      </w:r>
-      <w:r>
+        <w:rPr>
+          <w:rFonts w:ascii="Times New Roman" w:hAnsi="Times New Roman"/>
+          <w:sz w:val="24"/>
+        </w:rPr>
+        <w:t xml:space="preserve"> </w:t>
+      </w:r>
+      <w:r>
+        <w:rPr>
+          <w:rFonts w:ascii="Times New Roman" w:hAnsi="Times New Roman"/>
+          <w:sz w:val="24"/>
+        </w:rPr>
         <w:t xml:space="preserve">driver selection, whereas adult rearrangement landscapes carry a larger</w:t>
       </w:r>
       <w:r>
-        <w:t xml:space="preserve"> </w:t>
-      </w:r>
-      <w:r>
+        <w:rPr>
+          <w:rFonts w:ascii="Times New Roman" w:hAnsi="Times New Roman"/>
+          <w:sz w:val="24"/>
+        </w:rPr>
+        <w:t xml:space="preserve"> </w:t>
+      </w:r>
+      <w:r>
+        <w:rPr>
+          <w:rFonts w:ascii="Times New Roman" w:hAnsi="Times New Roman"/>
+          <w:sz w:val="24"/>
+        </w:rPr>
         <w:t xml:space="preserve">imprint of accumulated genomic instability.</w:t>
       </w:r>
     </w:p>
@@ -1775,45 +2736,99 @@
         <w:ind w:firstLine="0"/>
       </w:pPr>
       <w:r>
+        <w:rPr>
+          <w:rFonts w:ascii="Times New Roman" w:hAnsi="Times New Roman"/>
+          <w:sz w:val="24"/>
+        </w:rPr>
         <w:t xml:space="preserve">A second notable result concerned hotspot architecture near RAG</w:t>
       </w:r>
       <w:r>
-        <w:t xml:space="preserve"> </w:t>
-      </w:r>
-      <w:r>
+        <w:rPr>
+          <w:rFonts w:ascii="Times New Roman" w:hAnsi="Times New Roman"/>
+          <w:sz w:val="24"/>
+        </w:rPr>
+        <w:t xml:space="preserve"> </w:t>
+      </w:r>
+      <w:r>
+        <w:rPr>
+          <w:rFonts w:ascii="Times New Roman" w:hAnsi="Times New Roman"/>
+          <w:sz w:val="24"/>
+        </w:rPr>
         <w:t xml:space="preserve">recombination signal sequences. In pediatric acute lymphoblastic</w:t>
       </w:r>
       <w:r>
-        <w:t xml:space="preserve"> </w:t>
-      </w:r>
-      <w:r>
+        <w:rPr>
+          <w:rFonts w:ascii="Times New Roman" w:hAnsi="Times New Roman"/>
+          <w:sz w:val="24"/>
+        </w:rPr>
+        <w:t xml:space="preserve"> </w:t>
+      </w:r>
+      <w:r>
+        <w:rPr>
+          <w:rFonts w:ascii="Times New Roman" w:hAnsi="Times New Roman"/>
+          <w:sz w:val="24"/>
+        </w:rPr>
         <w:t xml:space="preserve">leukemias, recurrent hotspots affected both immune loci and oncogenic</w:t>
       </w:r>
       <w:r>
-        <w:t xml:space="preserve"> </w:t>
-      </w:r>
-      <w:r>
+        <w:rPr>
+          <w:rFonts w:ascii="Times New Roman" w:hAnsi="Times New Roman"/>
+          <w:sz w:val="24"/>
+        </w:rPr>
+        <w:t xml:space="preserve"> </w:t>
+      </w:r>
+      <w:r>
+        <w:rPr>
+          <w:rFonts w:ascii="Times New Roman" w:hAnsi="Times New Roman"/>
+          <w:sz w:val="24"/>
+        </w:rPr>
         <w:t xml:space="preserve">driver genes, while adult lymphoid cancers were described as showing</w:t>
       </w:r>
       <w:r>
-        <w:t xml:space="preserve"> </w:t>
-      </w:r>
-      <w:r>
+        <w:rPr>
+          <w:rFonts w:ascii="Times New Roman" w:hAnsi="Times New Roman"/>
+          <w:sz w:val="24"/>
+        </w:rPr>
+        <w:t xml:space="preserve"> </w:t>
+      </w:r>
+      <w:r>
+        <w:rPr>
+          <w:rFonts w:ascii="Times New Roman" w:hAnsi="Times New Roman"/>
+          <w:sz w:val="24"/>
+        </w:rPr>
         <w:t xml:space="preserve">disruption of immune loci without the same degree of pediatric driver</w:t>
       </w:r>
       <w:r>
-        <w:t xml:space="preserve"> </w:t>
-      </w:r>
-      <w:r>
+        <w:rPr>
+          <w:rFonts w:ascii="Times New Roman" w:hAnsi="Times New Roman"/>
+          <w:sz w:val="24"/>
+        </w:rPr>
+        <w:t xml:space="preserve"> </w:t>
+      </w:r>
+      <w:r>
+        <w:rPr>
+          <w:rFonts w:ascii="Times New Roman" w:hAnsi="Times New Roman"/>
+          <w:sz w:val="24"/>
+        </w:rPr>
         <w:t xml:space="preserve">involvement</w:t>
       </w:r>
-      <w:r>
-        <w:rPr>
-          <w:vertAlign w:val="superscript"/>
-        </w:rPr>
-        <w:t xml:space="preserve">1</w:t>
-      </w:r>
-      <w:r>
+      <w:hyperlink w:anchor="ref-1">
+        <w:r>
+          <w:rPr>
+            <w:rFonts w:ascii="Times New Roman" w:hAnsi="Times New Roman"/>
+            <w:sz w:val="24"/>
+            <w:vertAlign w:val="superscript"/>
+            <w:color w:val="0000FF"/>
+            <w:u w:val="none"/>
+          </w:rPr>
+          <w:t xml:space="preserve">[1]</w:t>
+        </w:r>
+      </w:hyperlink>
+      <w:r>
+        <w:rPr>
+          <w:rFonts w:ascii="Times New Roman" w:hAnsi="Times New Roman"/>
+          <w:sz w:val="24"/>
+        </w:rPr>
         <w:t xml:space="preserve">.</w:t>
       </w:r>
     </w:p>
@@ -1824,45 +2839,99 @@
         <w:ind w:firstLine="0"/>
       </w:pPr>
       <w:r>
+        <w:rPr>
+          <w:rFonts w:ascii="Times New Roman" w:hAnsi="Times New Roman"/>
+          <w:sz w:val="24"/>
+        </w:rPr>
         <w:t xml:space="preserve">Finally, signature extraction and longitudinal clustering added an</w:t>
       </w:r>
       <w:r>
-        <w:t xml:space="preserve"> </w:t>
-      </w:r>
-      <w:r>
+        <w:rPr>
+          <w:rFonts w:ascii="Times New Roman" w:hAnsi="Times New Roman"/>
+          <w:sz w:val="24"/>
+        </w:rPr>
+        <w:t xml:space="preserve"> </w:t>
+      </w:r>
+      <w:r>
+        <w:rPr>
+          <w:rFonts w:ascii="Times New Roman" w:hAnsi="Times New Roman"/>
+          <w:sz w:val="24"/>
+        </w:rPr>
         <w:t xml:space="preserve">evolutionary perspective. The authors described ten structural-variation</w:t>
       </w:r>
       <w:r>
-        <w:t xml:space="preserve"> </w:t>
-      </w:r>
-      <w:r>
+        <w:rPr>
+          <w:rFonts w:ascii="Times New Roman" w:hAnsi="Times New Roman"/>
+          <w:sz w:val="24"/>
+        </w:rPr>
+        <w:t xml:space="preserve"> </w:t>
+      </w:r>
+      <w:r>
+        <w:rPr>
+          <w:rFonts w:ascii="Times New Roman" w:hAnsi="Times New Roman"/>
+          <w:sz w:val="24"/>
+        </w:rPr>
         <w:t xml:space="preserve">signatures, implicated RAG-mediated mutagenesis in the etiology of</w:t>
       </w:r>
       <w:r>
-        <w:t xml:space="preserve"> </w:t>
-      </w:r>
-      <w:r>
+        <w:rPr>
+          <w:rFonts w:ascii="Times New Roman" w:hAnsi="Times New Roman"/>
+          <w:sz w:val="24"/>
+        </w:rPr>
+        <w:t xml:space="preserve"> </w:t>
+      </w:r>
+      <w:r>
+        <w:rPr>
+          <w:rFonts w:ascii="Times New Roman" w:hAnsi="Times New Roman"/>
+          <w:sz w:val="24"/>
+        </w:rPr>
         <w:t xml:space="preserve">COSMIC SV7 within lymphoid cancers, and used multiple samples from 13</w:t>
       </w:r>
       <w:r>
-        <w:t xml:space="preserve"> </w:t>
-      </w:r>
-      <w:r>
+        <w:rPr>
+          <w:rFonts w:ascii="Times New Roman" w:hAnsi="Times New Roman"/>
+          <w:sz w:val="24"/>
+        </w:rPr>
+        <w:t xml:space="preserve"> </w:t>
+      </w:r>
+      <w:r>
+        <w:rPr>
+          <w:rFonts w:ascii="Times New Roman" w:hAnsi="Times New Roman"/>
+          <w:sz w:val="24"/>
+        </w:rPr>
         <w:t xml:space="preserve">patients to illustrate that structural variants continue to shape</w:t>
       </w:r>
       <w:r>
-        <w:t xml:space="preserve"> </w:t>
-      </w:r>
-      <w:r>
+        <w:rPr>
+          <w:rFonts w:ascii="Times New Roman" w:hAnsi="Times New Roman"/>
+          <w:sz w:val="24"/>
+        </w:rPr>
+        <w:t xml:space="preserve"> </w:t>
+      </w:r>
+      <w:r>
+        <w:rPr>
+          <w:rFonts w:ascii="Times New Roman" w:hAnsi="Times New Roman"/>
+          <w:sz w:val="24"/>
+        </w:rPr>
         <w:t xml:space="preserve">intra-tumor heterogeneity over time</w:t>
       </w:r>
-      <w:r>
-        <w:rPr>
-          <w:vertAlign w:val="superscript"/>
-        </w:rPr>
-        <w:t xml:space="preserve">1</w:t>
-      </w:r>
-      <w:r>
+      <w:hyperlink w:anchor="ref-1">
+        <w:r>
+          <w:rPr>
+            <w:rFonts w:ascii="Times New Roman" w:hAnsi="Times New Roman"/>
+            <w:sz w:val="24"/>
+            <w:vertAlign w:val="superscript"/>
+            <w:color w:val="0000FF"/>
+            <w:u w:val="none"/>
+          </w:rPr>
+          <w:t xml:space="preserve">[1]</w:t>
+        </w:r>
+      </w:hyperlink>
+      <w:r>
+        <w:rPr>
+          <w:rFonts w:ascii="Times New Roman" w:hAnsi="Times New Roman"/>
+          <w:sz w:val="24"/>
+        </w:rPr>
         <w:t xml:space="preserve">.</w:t>
       </w:r>
     </w:p>
@@ -1871,11 +2940,16 @@
     <w:p>
       <w:pPr>
         <w:pStyle w:val="1"/>
-        <w:spacing w:line="360" w:lineRule="auto" w:after="80" w:before="0"/>
+        <w:spacing w:line="360" w:lineRule="exact" w:after="60" w:before="0"/>
         <w:ind w:firstLine="0"/>
         <w:jc w:val="left"/>
       </w:pPr>
       <w:r>
+        <w:rPr>
+          <w:rFonts w:ascii="Times New Roman" w:hAnsi="Times New Roman"/>
+          <w:b/>
+          <w:sz w:val="28"/>
+        </w:rPr>
         <w:t xml:space="preserve">Discussion</w:t>
       </w:r>
     </w:p>
@@ -1886,45 +2960,99 @@
         <w:ind w:firstLine="0"/>
       </w:pPr>
       <w:r>
+        <w:rPr>
+          <w:rFonts w:ascii="Times New Roman" w:hAnsi="Times New Roman"/>
+          <w:sz w:val="24"/>
+        </w:rPr>
         <w:t xml:space="preserve">From a translational perspective, this public study reinforces that</w:t>
       </w:r>
       <w:r>
-        <w:t xml:space="preserve"> </w:t>
-      </w:r>
-      <w:r>
+        <w:rPr>
+          <w:rFonts w:ascii="Times New Roman" w:hAnsi="Times New Roman"/>
+          <w:sz w:val="24"/>
+        </w:rPr>
+        <w:t xml:space="preserve"> </w:t>
+      </w:r>
+      <w:r>
+        <w:rPr>
+          <w:rFonts w:ascii="Times New Roman" w:hAnsi="Times New Roman"/>
+          <w:sz w:val="24"/>
+        </w:rPr>
         <w:t xml:space="preserve">structural variation should not be treated as a secondary genomic layer</w:t>
       </w:r>
       <w:r>
-        <w:t xml:space="preserve"> </w:t>
-      </w:r>
-      <w:r>
+        <w:rPr>
+          <w:rFonts w:ascii="Times New Roman" w:hAnsi="Times New Roman"/>
+          <w:sz w:val="24"/>
+        </w:rPr>
+        <w:t xml:space="preserve"> </w:t>
+      </w:r>
+      <w:r>
+        <w:rPr>
+          <w:rFonts w:ascii="Times New Roman" w:hAnsi="Times New Roman"/>
+          <w:sz w:val="24"/>
+        </w:rPr>
         <w:t xml:space="preserve">in pediatric oncology. Even when overall rearrangement burden is lower</w:t>
       </w:r>
       <w:r>
-        <w:t xml:space="preserve"> </w:t>
-      </w:r>
-      <w:r>
+        <w:rPr>
+          <w:rFonts w:ascii="Times New Roman" w:hAnsi="Times New Roman"/>
+          <w:sz w:val="24"/>
+        </w:rPr>
+        <w:t xml:space="preserve"> </w:t>
+      </w:r>
+      <w:r>
+        <w:rPr>
+          <w:rFonts w:ascii="Times New Roman" w:hAnsi="Times New Roman"/>
+          <w:sz w:val="24"/>
+        </w:rPr>
         <w:t xml:space="preserve">than that in adult solid tumors, the disrupted loci can still</w:t>
       </w:r>
       <w:r>
-        <w:t xml:space="preserve"> </w:t>
-      </w:r>
-      <w:r>
+        <w:rPr>
+          <w:rFonts w:ascii="Times New Roman" w:hAnsi="Times New Roman"/>
+          <w:sz w:val="24"/>
+        </w:rPr>
+        <w:t xml:space="preserve"> </w:t>
+      </w:r>
+      <w:r>
+        <w:rPr>
+          <w:rFonts w:ascii="Times New Roman" w:hAnsi="Times New Roman"/>
+          <w:sz w:val="24"/>
+        </w:rPr>
         <w:t xml:space="preserve">concentrate in biologically decisive drivers and therefore remain highly</w:t>
       </w:r>
       <w:r>
-        <w:t xml:space="preserve"> </w:t>
-      </w:r>
-      <w:r>
+        <w:rPr>
+          <w:rFonts w:ascii="Times New Roman" w:hAnsi="Times New Roman"/>
+          <w:sz w:val="24"/>
+        </w:rPr>
+        <w:t xml:space="preserve"> </w:t>
+      </w:r>
+      <w:r>
+        <w:rPr>
+          <w:rFonts w:ascii="Times New Roman" w:hAnsi="Times New Roman"/>
+          <w:sz w:val="24"/>
+        </w:rPr>
         <w:t xml:space="preserve">relevant for disease classification and downstream clinical testing</w:t>
       </w:r>
-      <w:r>
-        <w:rPr>
-          <w:vertAlign w:val="superscript"/>
-        </w:rPr>
-        <w:t xml:space="preserve">1</w:t>
-      </w:r>
-      <w:r>
+      <w:hyperlink w:anchor="ref-1">
+        <w:r>
+          <w:rPr>
+            <w:rFonts w:ascii="Times New Roman" w:hAnsi="Times New Roman"/>
+            <w:sz w:val="24"/>
+            <w:vertAlign w:val="superscript"/>
+            <w:color w:val="0000FF"/>
+            <w:u w:val="none"/>
+          </w:rPr>
+          <w:t xml:space="preserve">[1]</w:t>
+        </w:r>
+      </w:hyperlink>
+      <w:r>
+        <w:rPr>
+          <w:rFonts w:ascii="Times New Roman" w:hAnsi="Times New Roman"/>
+          <w:sz w:val="24"/>
+        </w:rPr>
         <w:t xml:space="preserve">.</w:t>
       </w:r>
     </w:p>
@@ -1935,45 +3063,99 @@
         <w:ind w:firstLine="0"/>
       </w:pPr>
       <w:r>
+        <w:rPr>
+          <w:rFonts w:ascii="Times New Roman" w:hAnsi="Times New Roman"/>
+          <w:sz w:val="24"/>
+        </w:rPr>
         <w:t xml:space="preserve">The RAG-associated hotspot and signature findings are also important</w:t>
       </w:r>
       <w:r>
-        <w:t xml:space="preserve"> </w:t>
-      </w:r>
-      <w:r>
+        <w:rPr>
+          <w:rFonts w:ascii="Times New Roman" w:hAnsi="Times New Roman"/>
+          <w:sz w:val="24"/>
+        </w:rPr>
+        <w:t xml:space="preserve"> </w:t>
+      </w:r>
+      <w:r>
+        <w:rPr>
+          <w:rFonts w:ascii="Times New Roman" w:hAnsi="Times New Roman"/>
+          <w:sz w:val="24"/>
+        </w:rPr>
         <w:t xml:space="preserve">conceptually because they connect genome architecture to</w:t>
       </w:r>
       <w:r>
-        <w:t xml:space="preserve"> </w:t>
-      </w:r>
-      <w:r>
+        <w:rPr>
+          <w:rFonts w:ascii="Times New Roman" w:hAnsi="Times New Roman"/>
+          <w:sz w:val="24"/>
+        </w:rPr>
+        <w:t xml:space="preserve"> </w:t>
+      </w:r>
+      <w:r>
+        <w:rPr>
+          <w:rFonts w:ascii="Times New Roman" w:hAnsi="Times New Roman"/>
+          <w:sz w:val="24"/>
+        </w:rPr>
         <w:t xml:space="preserve">lineage-specific mutational processes. That link helps explain why</w:t>
       </w:r>
       <w:r>
-        <w:t xml:space="preserve"> </w:t>
-      </w:r>
-      <w:r>
+        <w:rPr>
+          <w:rFonts w:ascii="Times New Roman" w:hAnsi="Times New Roman"/>
+          <w:sz w:val="24"/>
+        </w:rPr>
+        <w:t xml:space="preserve"> </w:t>
+      </w:r>
+      <w:r>
+        <w:rPr>
+          <w:rFonts w:ascii="Times New Roman" w:hAnsi="Times New Roman"/>
+          <w:sz w:val="24"/>
+        </w:rPr>
         <w:t xml:space="preserve">lymphoid malignancies may display recurrent rearrangement patterns that</w:t>
       </w:r>
       <w:r>
-        <w:t xml:space="preserve"> </w:t>
-      </w:r>
-      <w:r>
+        <w:rPr>
+          <w:rFonts w:ascii="Times New Roman" w:hAnsi="Times New Roman"/>
+          <w:sz w:val="24"/>
+        </w:rPr>
+        <w:t xml:space="preserve"> </w:t>
+      </w:r>
+      <w:r>
+        <w:rPr>
+          <w:rFonts w:ascii="Times New Roman" w:hAnsi="Times New Roman"/>
+          <w:sz w:val="24"/>
+        </w:rPr>
         <w:t xml:space="preserve">differ from those seen in non-hematological tumors and provides a</w:t>
       </w:r>
       <w:r>
-        <w:t xml:space="preserve"> </w:t>
-      </w:r>
-      <w:r>
+        <w:rPr>
+          <w:rFonts w:ascii="Times New Roman" w:hAnsi="Times New Roman"/>
+          <w:sz w:val="24"/>
+        </w:rPr>
+        <w:t xml:space="preserve"> </w:t>
+      </w:r>
+      <w:r>
+        <w:rPr>
+          <w:rFonts w:ascii="Times New Roman" w:hAnsi="Times New Roman"/>
+          <w:sz w:val="24"/>
+        </w:rPr>
         <w:t xml:space="preserve">clearer mechanistic narrative than burden summaries alone</w:t>
       </w:r>
-      <w:r>
-        <w:rPr>
-          <w:vertAlign w:val="superscript"/>
-        </w:rPr>
-        <w:t xml:space="preserve">1</w:t>
-      </w:r>
-      <w:r>
+      <w:hyperlink w:anchor="ref-1">
+        <w:r>
+          <w:rPr>
+            <w:rFonts w:ascii="Times New Roman" w:hAnsi="Times New Roman"/>
+            <w:sz w:val="24"/>
+            <w:vertAlign w:val="superscript"/>
+            <w:color w:val="0000FF"/>
+            <w:u w:val="none"/>
+          </w:rPr>
+          <w:t xml:space="preserve">[1]</w:t>
+        </w:r>
+      </w:hyperlink>
+      <w:r>
+        <w:rPr>
+          <w:rFonts w:ascii="Times New Roman" w:hAnsi="Times New Roman"/>
+          <w:sz w:val="24"/>
+        </w:rPr>
         <w:t xml:space="preserve">.</w:t>
       </w:r>
     </w:p>
@@ -1984,42 +3166,94 @@
         <w:ind w:firstLine="0"/>
       </w:pPr>
       <w:r>
+        <w:rPr>
+          <w:rFonts w:ascii="Times New Roman" w:hAnsi="Times New Roman"/>
+          <w:sz w:val="24"/>
+        </w:rPr>
         <w:t xml:space="preserve">This repository example intentionally stops at the level of a concise</w:t>
       </w:r>
       <w:r>
-        <w:t xml:space="preserve"> </w:t>
-      </w:r>
-      <w:r>
+        <w:rPr>
+          <w:rFonts w:ascii="Times New Roman" w:hAnsi="Times New Roman"/>
+          <w:sz w:val="24"/>
+        </w:rPr>
+        <w:t xml:space="preserve"> </w:t>
+      </w:r>
+      <w:r>
+        <w:rPr>
+          <w:rFonts w:ascii="Times New Roman" w:hAnsi="Times New Roman"/>
+          <w:sz w:val="24"/>
+        </w:rPr>
         <w:t xml:space="preserve">public summary. Users who need full methodological detail, extended</w:t>
       </w:r>
       <w:r>
-        <w:t xml:space="preserve"> </w:t>
-      </w:r>
-      <w:r>
+        <w:rPr>
+          <w:rFonts w:ascii="Times New Roman" w:hAnsi="Times New Roman"/>
+          <w:sz w:val="24"/>
+        </w:rPr>
+        <w:t xml:space="preserve"> </w:t>
+      </w:r>
+      <w:r>
+        <w:rPr>
+          <w:rFonts w:ascii="Times New Roman" w:hAnsi="Times New Roman"/>
+          <w:sz w:val="24"/>
+        </w:rPr>
         <w:t xml:space="preserve">figure interpretation, or exact supplemental evidence should consult the</w:t>
       </w:r>
       <w:r>
-        <w:t xml:space="preserve"> </w:t>
-      </w:r>
-      <w:r>
+        <w:rPr>
+          <w:rFonts w:ascii="Times New Roman" w:hAnsi="Times New Roman"/>
+          <w:sz w:val="24"/>
+        </w:rPr>
+        <w:t xml:space="preserve"> </w:t>
+      </w:r>
+      <w:r>
+        <w:rPr>
+          <w:rFonts w:ascii="Times New Roman" w:hAnsi="Times New Roman"/>
+          <w:sz w:val="24"/>
+        </w:rPr>
         <w:t xml:space="preserve">published article directly rather than rely on this demonstration text.</w:t>
       </w:r>
       <w:r>
-        <w:t xml:space="preserve"> </w:t>
-      </w:r>
-      <w:r>
+        <w:rPr>
+          <w:rFonts w:ascii="Times New Roman" w:hAnsi="Times New Roman"/>
+          <w:sz w:val="24"/>
+        </w:rPr>
+        <w:t xml:space="preserve"> </w:t>
+      </w:r>
+      <w:r>
+        <w:rPr>
+          <w:rFonts w:ascii="Times New Roman" w:hAnsi="Times New Roman"/>
+          <w:sz w:val="24"/>
+        </w:rPr>
         <w:t xml:space="preserve">The value of the current project lies in showing how an openly shareable</w:t>
       </w:r>
       <w:r>
-        <w:t xml:space="preserve"> </w:t>
-      </w:r>
-      <w:r>
+        <w:rPr>
+          <w:rFonts w:ascii="Times New Roman" w:hAnsi="Times New Roman"/>
+          <w:sz w:val="24"/>
+        </w:rPr>
+        <w:t xml:space="preserve"> </w:t>
+      </w:r>
+      <w:r>
+        <w:rPr>
+          <w:rFonts w:ascii="Times New Roman" w:hAnsi="Times New Roman"/>
+          <w:sz w:val="24"/>
+        </w:rPr>
         <w:t xml:space="preserve">manuscript skeleton can be rendered into publication-style PDF and DOCX</w:t>
       </w:r>
       <w:r>
-        <w:t xml:space="preserve"> </w:t>
-      </w:r>
-      <w:r>
+        <w:rPr>
+          <w:rFonts w:ascii="Times New Roman" w:hAnsi="Times New Roman"/>
+          <w:sz w:val="24"/>
+        </w:rPr>
+        <w:t xml:space="preserve"> </w:t>
+      </w:r>
+      <w:r>
+        <w:rPr>
+          <w:rFonts w:ascii="Times New Roman" w:hAnsi="Times New Roman"/>
+          <w:sz w:val="24"/>
+        </w:rPr>
         <w:t xml:space="preserve">artifacts with a single build command.</w:t>
       </w:r>
     </w:p>
@@ -2028,11 +3262,16 @@
     <w:p>
       <w:pPr>
         <w:pStyle w:val="1"/>
-        <w:spacing w:line="360" w:lineRule="auto" w:after="80" w:before="0"/>
+        <w:spacing w:line="360" w:lineRule="exact" w:after="60" w:before="0"/>
         <w:ind w:firstLine="0"/>
         <w:jc w:val="left"/>
       </w:pPr>
       <w:r>
+        <w:rPr>
+          <w:rFonts w:ascii="Times New Roman" w:hAnsi="Times New Roman"/>
+          <w:b/>
+          <w:sz w:val="28"/>
+        </w:rPr>
         <w:t xml:space="preserve">Conclusion</w:t>
       </w:r>
     </w:p>
@@ -2043,81 +3282,171 @@
         <w:ind w:firstLine="0"/>
       </w:pPr>
       <w:r>
+        <w:rPr>
+          <w:rFonts w:ascii="Times New Roman" w:hAnsi="Times New Roman"/>
+          <w:sz w:val="24"/>
+        </w:rPr>
         <w:t xml:space="preserve">This</w:t>
       </w:r>
       <w:r>
+        <w:rPr>
+          <w:rFonts w:ascii="Times New Roman" w:hAnsi="Times New Roman"/>
+          <w:sz w:val="24"/>
+        </w:rPr>
         <w:t xml:space="preserve"> </w:t>
       </w:r>
       <w:r>
         <w:rPr>
           <w:rStyle w:val="VerbatimChar"/>
+          <w:rFonts w:ascii="Times New Roman" w:hAnsi="Times New Roman"/>
+          <w:sz w:val="24"/>
         </w:rPr>
         <w:t xml:space="preserve">paper-sci-01</w:t>
       </w:r>
       <w:r>
-        <w:t xml:space="preserve"> </w:t>
-      </w:r>
-      <w:r>
+        <w:rPr>
+          <w:rFonts w:ascii="Times New Roman" w:hAnsi="Times New Roman"/>
+          <w:sz w:val="24"/>
+        </w:rPr>
+        <w:t xml:space="preserve"> </w:t>
+      </w:r>
+      <w:r>
+        <w:rPr>
+          <w:rFonts w:ascii="Times New Roman" w:hAnsi="Times New Roman"/>
+          <w:sz w:val="24"/>
+        </w:rPr>
         <w:t xml:space="preserve">example demonstrates that</w:t>
       </w:r>
       <w:r>
+        <w:rPr>
+          <w:rFonts w:ascii="Times New Roman" w:hAnsi="Times New Roman"/>
+          <w:sz w:val="24"/>
+        </w:rPr>
         <w:t xml:space="preserve"> </w:t>
       </w:r>
       <w:r>
         <w:rPr>
           <w:rStyle w:val="VerbatimChar"/>
+          <w:rFonts w:ascii="Times New Roman" w:hAnsi="Times New Roman"/>
+          <w:sz w:val="24"/>
         </w:rPr>
         <w:t xml:space="preserve">bensz-paper</w:t>
       </w:r>
       <w:r>
-        <w:t xml:space="preserve"> </w:t>
-      </w:r>
-      <w:r>
+        <w:rPr>
+          <w:rFonts w:ascii="Times New Roman" w:hAnsi="Times New Roman"/>
+          <w:sz w:val="24"/>
+        </w:rPr>
+        <w:t xml:space="preserve"> </w:t>
+      </w:r>
+      <w:r>
+        <w:rPr>
+          <w:rFonts w:ascii="Times New Roman" w:hAnsi="Times New Roman"/>
+          <w:sz w:val="24"/>
+        </w:rPr>
         <w:t xml:space="preserve">can host a complete SCI-style writing workflow</w:t>
       </w:r>
       <w:r>
-        <w:t xml:space="preserve"> </w:t>
-      </w:r>
-      <w:r>
+        <w:rPr>
+          <w:rFonts w:ascii="Times New Roman" w:hAnsi="Times New Roman"/>
+          <w:sz w:val="24"/>
+        </w:rPr>
+        <w:t xml:space="preserve"> </w:t>
+      </w:r>
+      <w:r>
+        <w:rPr>
+          <w:rFonts w:ascii="Times New Roman" w:hAnsi="Times New Roman"/>
+          <w:sz w:val="24"/>
+        </w:rPr>
         <w:t xml:space="preserve">with one public source of truth and dual PDF/DOCX outputs. The sample</w:t>
       </w:r>
       <w:r>
-        <w:t xml:space="preserve"> </w:t>
-      </w:r>
-      <w:r>
+        <w:rPr>
+          <w:rFonts w:ascii="Times New Roman" w:hAnsi="Times New Roman"/>
+          <w:sz w:val="24"/>
+        </w:rPr>
+        <w:t xml:space="preserve"> </w:t>
+      </w:r>
+      <w:r>
+        <w:rPr>
+          <w:rFonts w:ascii="Times New Roman" w:hAnsi="Times New Roman"/>
+          <w:sz w:val="24"/>
+        </w:rPr>
         <w:t xml:space="preserve">text highlights how structural-variation profiling reveals</w:t>
       </w:r>
       <w:r>
-        <w:t xml:space="preserve"> </w:t>
-      </w:r>
-      <w:r>
+        <w:rPr>
+          <w:rFonts w:ascii="Times New Roman" w:hAnsi="Times New Roman"/>
+          <w:sz w:val="24"/>
+        </w:rPr>
+        <w:t xml:space="preserve"> </w:t>
+      </w:r>
+      <w:r>
+        <w:rPr>
+          <w:rFonts w:ascii="Times New Roman" w:hAnsi="Times New Roman"/>
+          <w:sz w:val="24"/>
+        </w:rPr>
         <w:t xml:space="preserve">disease-specific patterns, driver disruption, RAG-associated hotspots,</w:t>
       </w:r>
       <w:r>
-        <w:t xml:space="preserve"> </w:t>
-      </w:r>
-      <w:r>
+        <w:rPr>
+          <w:rFonts w:ascii="Times New Roman" w:hAnsi="Times New Roman"/>
+          <w:sz w:val="24"/>
+        </w:rPr>
+        <w:t xml:space="preserve"> </w:t>
+      </w:r>
+      <w:r>
+        <w:rPr>
+          <w:rFonts w:ascii="Times New Roman" w:hAnsi="Times New Roman"/>
+          <w:sz w:val="24"/>
+        </w:rPr>
         <w:t xml:space="preserve">and ongoing clonal evolution in pediatric cancer, while the project</w:t>
       </w:r>
       <w:r>
-        <w:t xml:space="preserve"> </w:t>
-      </w:r>
-      <w:r>
+        <w:rPr>
+          <w:rFonts w:ascii="Times New Roman" w:hAnsi="Times New Roman"/>
+          <w:sz w:val="24"/>
+        </w:rPr>
+        <w:t xml:space="preserve"> </w:t>
+      </w:r>
+      <w:r>
+        <w:rPr>
+          <w:rFonts w:ascii="Times New Roman" w:hAnsi="Times New Roman"/>
+          <w:sz w:val="24"/>
+        </w:rPr>
         <w:t xml:space="preserve">structure itself serves as a reusable starting point for future</w:t>
       </w:r>
       <w:r>
-        <w:t xml:space="preserve"> </w:t>
-      </w:r>
-      <w:r>
+        <w:rPr>
+          <w:rFonts w:ascii="Times New Roman" w:hAnsi="Times New Roman"/>
+          <w:sz w:val="24"/>
+        </w:rPr>
+        <w:t xml:space="preserve"> </w:t>
+      </w:r>
+      <w:r>
+        <w:rPr>
+          <w:rFonts w:ascii="Times New Roman" w:hAnsi="Times New Roman"/>
+          <w:sz w:val="24"/>
+        </w:rPr>
         <w:t xml:space="preserve">manuscripts</w:t>
       </w:r>
-      <w:r>
-        <w:rPr>
-          <w:vertAlign w:val="superscript"/>
-        </w:rPr>
-        <w:t xml:space="preserve">1</w:t>
-      </w:r>
-      <w:r>
+      <w:hyperlink w:anchor="ref-1">
+        <w:r>
+          <w:rPr>
+            <w:rFonts w:ascii="Times New Roman" w:hAnsi="Times New Roman"/>
+            <w:sz w:val="24"/>
+            <w:vertAlign w:val="superscript"/>
+            <w:color w:val="0000FF"/>
+            <w:u w:val="none"/>
+          </w:rPr>
+          <w:t xml:space="preserve">[1]</w:t>
+        </w:r>
+      </w:hyperlink>
+      <w:r>
+        <w:rPr>
+          <w:rFonts w:ascii="Times New Roman" w:hAnsi="Times New Roman"/>
+          <w:sz w:val="24"/>
+        </w:rPr>
         <w:t xml:space="preserve">.</w:t>
       </w:r>
     </w:p>
@@ -2126,29 +3455,33 @@
     <w:p>
       <w:pPr>
         <w:pStyle w:val="1"/>
-        <w:spacing w:line="360" w:lineRule="auto" w:after="80" w:before="0"/>
+        <w:spacing w:line="360" w:lineRule="exact" w:after="60" w:before="0"/>
         <w:ind w:firstLine="0"/>
         <w:jc w:val="left"/>
       </w:pPr>
       <w:r>
-        <w:t xml:space="preserve">Additional</w:t>
-      </w:r>
-      <w:r>
-        <w:t xml:space="preserve"> </w:t>
-      </w:r>
-      <w:r>
-        <w:t xml:space="preserve">information</w:t>
+        <w:rPr>
+          <w:rFonts w:ascii="Times New Roman" w:hAnsi="Times New Roman"/>
+          <w:b/>
+          <w:sz w:val="28"/>
+        </w:rPr>
+        <w:t xml:space="preserve">Additional information</w:t>
       </w:r>
     </w:p>
     <w:bookmarkStart w:id="31" w:name="source-statement"/>
     <w:p>
       <w:pPr>
         <w:pStyle w:val="2"/>
-        <w:spacing w:line="360" w:lineRule="auto" w:after="80" w:before="0"/>
+        <w:spacing w:line="360" w:lineRule="exact" w:after="60" w:before="0"/>
         <w:ind w:firstLine="0"/>
         <w:jc w:val="left"/>
       </w:pPr>
       <w:r>
+        <w:rPr>
+          <w:rFonts w:ascii="Times New Roman" w:hAnsi="Times New Roman"/>
+          <w:b/>
+          <w:sz w:val="28"/>
+        </w:rPr>
         <w:t xml:space="preserve">Source statement</w:t>
       </w:r>
     </w:p>
@@ -2159,73 +3492,135 @@
         <w:ind w:firstLine="0"/>
       </w:pPr>
       <w:r>
+        <w:rPr>
+          <w:rFonts w:ascii="Times New Roman" w:hAnsi="Times New Roman"/>
+          <w:sz w:val="24"/>
+        </w:rPr>
         <w:t xml:space="preserve">This project is a formatting demonstration derived from public</w:t>
       </w:r>
       <w:r>
-        <w:t xml:space="preserve"> </w:t>
-      </w:r>
-      <w:r>
+        <w:rPr>
+          <w:rFonts w:ascii="Times New Roman" w:hAnsi="Times New Roman"/>
+          <w:sz w:val="24"/>
+        </w:rPr>
+        <w:t xml:space="preserve"> </w:t>
+      </w:r>
+      <w:r>
+        <w:rPr>
+          <w:rFonts w:ascii="Times New Roman" w:hAnsi="Times New Roman"/>
+          <w:sz w:val="24"/>
+        </w:rPr>
         <w:t xml:space="preserve">metadata and abstract-level findings of Greenhalgh et al.,</w:t>
       </w:r>
       <w:r>
-        <w:t xml:space="preserve"> </w:t>
-      </w:r>
-      <w:r>
-        <w:rPr>
+        <w:rPr>
+          <w:rFonts w:ascii="Times New Roman" w:hAnsi="Times New Roman"/>
+          <w:sz w:val="24"/>
+        </w:rPr>
+        <w:t xml:space="preserve"> </w:t>
+      </w:r>
+      <w:r>
+        <w:rPr>
+          <w:rFonts w:ascii="Times New Roman" w:hAnsi="Times New Roman"/>
           <w:i/>
           <w:iCs/>
+          <w:sz w:val="24"/>
         </w:rPr>
         <w:t xml:space="preserve">Cancer</w:t>
       </w:r>
       <w:r>
         <w:rPr>
+          <w:rFonts w:ascii="Times New Roman" w:hAnsi="Times New Roman"/>
           <w:i/>
           <w:iCs/>
-        </w:rPr>
-        <w:t xml:space="preserve"> </w:t>
-      </w:r>
-      <w:r>
-        <w:rPr>
+          <w:sz w:val="24"/>
+        </w:rPr>
+        <w:t xml:space="preserve"> </w:t>
+      </w:r>
+      <w:r>
+        <w:rPr>
+          <w:rFonts w:ascii="Times New Roman" w:hAnsi="Times New Roman"/>
           <w:i/>
           <w:iCs/>
+          <w:sz w:val="24"/>
         </w:rPr>
         <w:t xml:space="preserve">Cell</w:t>
       </w:r>
       <w:r>
-        <w:t xml:space="preserve"> </w:t>
-      </w:r>
-      <w:r>
+        <w:rPr>
+          <w:rFonts w:ascii="Times New Roman" w:hAnsi="Times New Roman"/>
+          <w:sz w:val="24"/>
+        </w:rPr>
+        <w:t xml:space="preserve"> </w:t>
+      </w:r>
+      <w:r>
+        <w:rPr>
+          <w:rFonts w:ascii="Times New Roman" w:hAnsi="Times New Roman"/>
+          <w:sz w:val="24"/>
+        </w:rPr>
         <w:t xml:space="preserve">2026</w:t>
       </w:r>
-      <w:r>
-        <w:rPr>
-          <w:vertAlign w:val="superscript"/>
-        </w:rPr>
-        <w:t xml:space="preserve">1</w:t>
-      </w:r>
-      <w:r>
+      <w:hyperlink w:anchor="ref-1">
+        <w:r>
+          <w:rPr>
+            <w:rFonts w:ascii="Times New Roman" w:hAnsi="Times New Roman"/>
+            <w:sz w:val="24"/>
+            <w:vertAlign w:val="superscript"/>
+            <w:color w:val="0000FF"/>
+            <w:u w:val="none"/>
+          </w:rPr>
+          <w:t xml:space="preserve">[1]</w:t>
+        </w:r>
+      </w:hyperlink>
+      <w:r>
+        <w:rPr>
+          <w:rFonts w:ascii="Times New Roman" w:hAnsi="Times New Roman"/>
+          <w:sz w:val="24"/>
+        </w:rPr>
         <w:t xml:space="preserve">. It is</w:t>
       </w:r>
       <w:r>
-        <w:t xml:space="preserve"> </w:t>
-      </w:r>
-      <w:r>
-        <w:rPr>
+        <w:rPr>
+          <w:rFonts w:ascii="Times New Roman" w:hAnsi="Times New Roman"/>
+          <w:sz w:val="24"/>
+        </w:rPr>
+        <w:t xml:space="preserve"> </w:t>
+      </w:r>
+      <w:r>
+        <w:rPr>
+          <w:rFonts w:ascii="Times New Roman" w:hAnsi="Times New Roman"/>
           <w:b/>
           <w:bCs/>
+          <w:sz w:val="24"/>
         </w:rPr>
         <w:t xml:space="preserve">not</w:t>
       </w:r>
       <w:r>
-        <w:t xml:space="preserve"> </w:t>
-      </w:r>
-      <w:r>
+        <w:rPr>
+          <w:rFonts w:ascii="Times New Roman" w:hAnsi="Times New Roman"/>
+          <w:sz w:val="24"/>
+        </w:rPr>
+        <w:t xml:space="preserve"> </w:t>
+      </w:r>
+      <w:r>
+        <w:rPr>
+          <w:rFonts w:ascii="Times New Roman" w:hAnsi="Times New Roman"/>
+          <w:sz w:val="24"/>
+        </w:rPr>
         <w:t xml:space="preserve">the publisher PDF, not the article’s original full</w:t>
       </w:r>
       <w:r>
-        <w:t xml:space="preserve"> </w:t>
-      </w:r>
-      <w:r>
+        <w:rPr>
+          <w:rFonts w:ascii="Times New Roman" w:hAnsi="Times New Roman"/>
+          <w:sz w:val="24"/>
+        </w:rPr>
+        <w:t xml:space="preserve"> </w:t>
+      </w:r>
+      <w:r>
+        <w:rPr>
+          <w:rFonts w:ascii="Times New Roman" w:hAnsi="Times New Roman"/>
+          <w:sz w:val="24"/>
+        </w:rPr>
         <w:t xml:space="preserve">text, and not an unpublished manuscript.</w:t>
       </w:r>
     </w:p>
@@ -2234,18 +3629,17 @@
     <w:p>
       <w:pPr>
         <w:pStyle w:val="2"/>
-        <w:spacing w:line="360" w:lineRule="auto" w:after="80" w:before="0"/>
+        <w:spacing w:line="360" w:lineRule="exact" w:after="60" w:before="0"/>
         <w:ind w:firstLine="0"/>
         <w:jc w:val="left"/>
       </w:pPr>
       <w:r>
-        <w:t xml:space="preserve">Availability of</w:t>
-      </w:r>
-      <w:r>
-        <w:t xml:space="preserve"> </w:t>
-      </w:r>
-      <w:r>
-        <w:t xml:space="preserve">materials</w:t>
+        <w:rPr>
+          <w:rFonts w:ascii="Times New Roman" w:hAnsi="Times New Roman"/>
+          <w:b/>
+          <w:sz w:val="28"/>
+        </w:rPr>
+        <w:t xml:space="preserve">Availability of materials</w:t>
       </w:r>
     </w:p>
     <w:p>
@@ -2255,81 +3649,161 @@
         <w:ind w:firstLine="0"/>
       </w:pPr>
       <w:r>
+        <w:rPr>
+          <w:rFonts w:ascii="Times New Roman" w:hAnsi="Times New Roman"/>
+          <w:sz w:val="24"/>
+        </w:rPr>
         <w:t xml:space="preserve">All editable source files required to rebuild this demonstration</w:t>
       </w:r>
       <w:r>
-        <w:t xml:space="preserve"> </w:t>
-      </w:r>
-      <w:r>
+        <w:rPr>
+          <w:rFonts w:ascii="Times New Roman" w:hAnsi="Times New Roman"/>
+          <w:sz w:val="24"/>
+        </w:rPr>
+        <w:t xml:space="preserve"> </w:t>
+      </w:r>
+      <w:r>
+        <w:rPr>
+          <w:rFonts w:ascii="Times New Roman" w:hAnsi="Times New Roman"/>
+          <w:sz w:val="24"/>
+        </w:rPr>
         <w:t xml:space="preserve">project are stored in this repository, with manuscript content</w:t>
       </w:r>
       <w:r>
-        <w:t xml:space="preserve"> </w:t>
-      </w:r>
-      <w:r>
+        <w:rPr>
+          <w:rFonts w:ascii="Times New Roman" w:hAnsi="Times New Roman"/>
+          <w:sz w:val="24"/>
+        </w:rPr>
+        <w:t xml:space="preserve"> </w:t>
+      </w:r>
+      <w:r>
+        <w:rPr>
+          <w:rFonts w:ascii="Times New Roman" w:hAnsi="Times New Roman"/>
+          <w:sz w:val="24"/>
+        </w:rPr>
         <w:t xml:space="preserve">maintained under</w:t>
       </w:r>
       <w:r>
+        <w:rPr>
+          <w:rFonts w:ascii="Times New Roman" w:hAnsi="Times New Roman"/>
+          <w:sz w:val="24"/>
+        </w:rPr>
         <w:t xml:space="preserve"> </w:t>
       </w:r>
       <w:r>
         <w:rPr>
           <w:rStyle w:val="VerbatimChar"/>
+          <w:rFonts w:ascii="Times New Roman" w:hAnsi="Times New Roman"/>
+          <w:sz w:val="24"/>
         </w:rPr>
         <w:t xml:space="preserve">projects/paper-sci-01/extraTex/</w:t>
       </w:r>
       <w:r>
+        <w:rPr>
+          <w:rFonts w:ascii="Times New Roman" w:hAnsi="Times New Roman"/>
+          <w:sz w:val="24"/>
+        </w:rPr>
         <w:t xml:space="preserve">. Generated</w:t>
       </w:r>
       <w:r>
-        <w:t xml:space="preserve"> </w:t>
-      </w:r>
-      <w:r>
+        <w:rPr>
+          <w:rFonts w:ascii="Times New Roman" w:hAnsi="Times New Roman"/>
+          <w:sz w:val="24"/>
+        </w:rPr>
+        <w:t xml:space="preserve"> </w:t>
+      </w:r>
+      <w:r>
+        <w:rPr>
+          <w:rFonts w:ascii="Times New Roman" w:hAnsi="Times New Roman"/>
+          <w:sz w:val="24"/>
+        </w:rPr>
         <w:t xml:space="preserve">artifacts are written to</w:t>
       </w:r>
       <w:r>
+        <w:rPr>
+          <w:rFonts w:ascii="Times New Roman" w:hAnsi="Times New Roman"/>
+          <w:sz w:val="24"/>
+        </w:rPr>
         <w:t xml:space="preserve"> </w:t>
       </w:r>
       <w:r>
         <w:rPr>
           <w:rStyle w:val="VerbatimChar"/>
+          <w:rFonts w:ascii="Times New Roman" w:hAnsi="Times New Roman"/>
+          <w:sz w:val="24"/>
         </w:rPr>
         <w:t xml:space="preserve">.latex-cache/</w:t>
       </w:r>
       <w:r>
+        <w:rPr>
+          <w:rFonts w:ascii="Times New Roman" w:hAnsi="Times New Roman"/>
+          <w:sz w:val="24"/>
+        </w:rPr>
         <w:t xml:space="preserve">,</w:t>
       </w:r>
       <w:r>
+        <w:rPr>
+          <w:rFonts w:ascii="Times New Roman" w:hAnsi="Times New Roman"/>
+          <w:sz w:val="24"/>
+        </w:rPr>
         <w:t xml:space="preserve"> </w:t>
       </w:r>
       <w:r>
         <w:rPr>
           <w:rStyle w:val="VerbatimChar"/>
+          <w:rFonts w:ascii="Times New Roman" w:hAnsi="Times New Roman"/>
+          <w:sz w:val="24"/>
         </w:rPr>
         <w:t xml:space="preserve">main.pdf</w:t>
       </w:r>
       <w:r>
+        <w:rPr>
+          <w:rFonts w:ascii="Times New Roman" w:hAnsi="Times New Roman"/>
+          <w:sz w:val="24"/>
+        </w:rPr>
         <w:t xml:space="preserve">, and</w:t>
       </w:r>
       <w:r>
+        <w:rPr>
+          <w:rFonts w:ascii="Times New Roman" w:hAnsi="Times New Roman"/>
+          <w:sz w:val="24"/>
+        </w:rPr>
         <w:t xml:space="preserve"> </w:t>
       </w:r>
       <w:r>
         <w:rPr>
           <w:rStyle w:val="VerbatimChar"/>
+          <w:rFonts w:ascii="Times New Roman" w:hAnsi="Times New Roman"/>
+          <w:sz w:val="24"/>
         </w:rPr>
         <w:t xml:space="preserve">main.docx</w:t>
       </w:r>
       <w:r>
-        <w:t xml:space="preserve"> </w:t>
-      </w:r>
-      <w:r>
+        <w:rPr>
+          <w:rFonts w:ascii="Times New Roman" w:hAnsi="Times New Roman"/>
+          <w:sz w:val="24"/>
+        </w:rPr>
+        <w:t xml:space="preserve"> </w:t>
+      </w:r>
+      <w:r>
+        <w:rPr>
+          <w:rFonts w:ascii="Times New Roman" w:hAnsi="Times New Roman"/>
+          <w:sz w:val="24"/>
+        </w:rPr>
         <w:t xml:space="preserve">during the official</w:t>
       </w:r>
       <w:r>
-        <w:t xml:space="preserve"> </w:t>
-      </w:r>
-      <w:r>
+        <w:rPr>
+          <w:rFonts w:ascii="Times New Roman" w:hAnsi="Times New Roman"/>
+          <w:sz w:val="24"/>
+        </w:rPr>
+        <w:t xml:space="preserve"> </w:t>
+      </w:r>
+      <w:r>
+        <w:rPr>
+          <w:rFonts w:ascii="Times New Roman" w:hAnsi="Times New Roman"/>
+          <w:sz w:val="24"/>
+        </w:rPr>
         <w:t xml:space="preserve">build process.</w:t>
       </w:r>
     </w:p>
@@ -2338,11 +3812,16 @@
     <w:p>
       <w:pPr>
         <w:pStyle w:val="2"/>
-        <w:spacing w:line="360" w:lineRule="auto" w:after="80" w:before="0"/>
+        <w:spacing w:line="360" w:lineRule="exact" w:after="60" w:before="0"/>
         <w:ind w:firstLine="0"/>
         <w:jc w:val="left"/>
       </w:pPr>
       <w:r>
+        <w:rPr>
+          <w:rFonts w:ascii="Times New Roman" w:hAnsi="Times New Roman"/>
+          <w:b/>
+          <w:sz w:val="28"/>
+        </w:rPr>
         <w:t xml:space="preserve">Funding</w:t>
       </w:r>
     </w:p>
@@ -2353,27 +3832,53 @@
         <w:ind w:firstLine="0"/>
       </w:pPr>
       <w:r>
+        <w:rPr>
+          <w:rFonts w:ascii="Times New Roman" w:hAnsi="Times New Roman"/>
+          <w:sz w:val="24"/>
+        </w:rPr>
         <w:t xml:space="preserve">No external funding was associated with this demonstration</w:t>
       </w:r>
       <w:r>
-        <w:t xml:space="preserve"> </w:t>
-      </w:r>
-      <w:r>
+        <w:rPr>
+          <w:rFonts w:ascii="Times New Roman" w:hAnsi="Times New Roman"/>
+          <w:sz w:val="24"/>
+        </w:rPr>
+        <w:t xml:space="preserve"> </w:t>
+      </w:r>
+      <w:r>
+        <w:rPr>
+          <w:rFonts w:ascii="Times New Roman" w:hAnsi="Times New Roman"/>
+          <w:sz w:val="24"/>
+        </w:rPr>
         <w:t xml:space="preserve">manuscript. The sample exists solely to validate the</w:t>
       </w:r>
       <w:r>
+        <w:rPr>
+          <w:rFonts w:ascii="Times New Roman" w:hAnsi="Times New Roman"/>
+          <w:sz w:val="24"/>
+        </w:rPr>
         <w:t xml:space="preserve"> </w:t>
       </w:r>
       <w:r>
         <w:rPr>
           <w:rStyle w:val="VerbatimChar"/>
+          <w:rFonts w:ascii="Times New Roman" w:hAnsi="Times New Roman"/>
+          <w:sz w:val="24"/>
         </w:rPr>
         <w:t xml:space="preserve">bensz-paper</w:t>
       </w:r>
       <w:r>
-        <w:t xml:space="preserve"> </w:t>
-      </w:r>
-      <w:r>
+        <w:rPr>
+          <w:rFonts w:ascii="Times New Roman" w:hAnsi="Times New Roman"/>
+          <w:sz w:val="24"/>
+        </w:rPr>
+        <w:t xml:space="preserve"> </w:t>
+      </w:r>
+      <w:r>
+        <w:rPr>
+          <w:rFonts w:ascii="Times New Roman" w:hAnsi="Times New Roman"/>
+          <w:sz w:val="24"/>
+        </w:rPr>
         <w:t xml:space="preserve">package workflow.</w:t>
       </w:r>
     </w:p>
@@ -2382,11 +3887,16 @@
     <w:p>
       <w:pPr>
         <w:pStyle w:val="2"/>
-        <w:spacing w:line="360" w:lineRule="auto" w:after="80" w:before="0"/>
+        <w:spacing w:line="360" w:lineRule="exact" w:after="60" w:before="0"/>
         <w:ind w:firstLine="0"/>
         <w:jc w:val="left"/>
       </w:pPr>
       <w:r>
+        <w:rPr>
+          <w:rFonts w:ascii="Times New Roman" w:hAnsi="Times New Roman"/>
+          <w:b/>
+          <w:sz w:val="28"/>
+        </w:rPr>
         <w:t xml:space="preserve">Competing interests</w:t>
       </w:r>
     </w:p>
@@ -2397,12 +3907,24 @@
         <w:ind w:firstLine="0"/>
       </w:pPr>
       <w:r>
+        <w:rPr>
+          <w:rFonts w:ascii="Times New Roman" w:hAnsi="Times New Roman"/>
+          <w:sz w:val="24"/>
+        </w:rPr>
         <w:t xml:space="preserve">The authors of this demonstration template declare no competing</w:t>
       </w:r>
       <w:r>
-        <w:t xml:space="preserve"> </w:t>
-      </w:r>
-      <w:r>
+        <w:rPr>
+          <w:rFonts w:ascii="Times New Roman" w:hAnsi="Times New Roman"/>
+          <w:sz w:val="24"/>
+        </w:rPr>
+        <w:t xml:space="preserve"> </w:t>
+      </w:r>
+      <w:r>
+        <w:rPr>
+          <w:rFonts w:ascii="Times New Roman" w:hAnsi="Times New Roman"/>
+          <w:sz w:val="24"/>
+        </w:rPr>
         <w:t xml:space="preserve">interests related to the sample text or build workflow.</w:t>
       </w:r>
     </w:p>
@@ -2412,66 +3934,55 @@
     <w:p>
       <w:pPr>
         <w:pStyle w:val="1"/>
-        <w:spacing w:line="360" w:lineRule="auto" w:after="80" w:before="0"/>
+        <w:spacing w:line="360" w:lineRule="exact" w:after="60" w:before="0"/>
         <w:ind w:firstLine="0"/>
         <w:jc w:val="left"/>
       </w:pPr>
       <w:r>
+        <w:rPr>
+          <w:rFonts w:ascii="Times New Roman" w:hAnsi="Times New Roman"/>
+          <w:b/>
+          <w:sz w:val="28"/>
+        </w:rPr>
         <w:t>References</w:t>
       </w:r>
     </w:p>
     <w:p>
       <w:pPr>
         <w:pStyle w:val="af4"/>
-        <w:spacing w:line="360" w:lineRule="auto" w:after="80" w:before="0"/>
-        <w:ind w:firstLine="0" w:left="0"/>
-      </w:pPr>
-      <w:r>
-        <w:t xml:space="preserve">1. Greenhalgh, R., Brady, S. W., Yang, W.,</w:t>
-      </w:r>
-      <w:r>
-        <w:t xml:space="preserve"> </w:t>
-      </w:r>
-      <w:r>
-        <w:rPr>
-          <w:i/>
-          <w:iCs/>
-        </w:rPr>
-        <w:t xml:space="preserve">et al.</w:t>
-      </w:r>
-      <w:r>
-        <w:t xml:space="preserve"> </w:t>
-      </w:r>
-      <w:r>
-        <w:t xml:space="preserve">The landscape</w:t>
-      </w:r>
-      <w:r>
-        <w:t xml:space="preserve"> </w:t>
-      </w:r>
-      <w:r>
-        <w:t xml:space="preserve">of structural variation in pediatric cancer.</w:t>
-      </w:r>
-      <w:r>
-        <w:t xml:space="preserve"> </w:t>
-      </w:r>
-      <w:r>
-        <w:rPr>
-          <w:i/>
-          <w:iCs/>
-        </w:rPr>
-        <w:t xml:space="preserve">Cancer Cell</w:t>
-      </w:r>
-      <w:r>
-        <w:t xml:space="preserve"> </w:t>
-      </w:r>
-      <w:r>
-        <w:t xml:space="preserve">(2026)</w:t>
-      </w:r>
-      <w:r>
-        <w:t xml:space="preserve"> </w:t>
-      </w:r>
-      <w:r>
-        <w:t xml:space="preserve">doi:</w:t>
+        <w:spacing w:line="300" w:lineRule="exact" w:after="80" w:before="0"/>
+        <w:ind w:left="389" w:hanging="389"/>
+        <w:jc w:val="left"/>
+      </w:pPr>
+      <w:bookmarkStart w:id="47" w:name="ref-1"/>
+      <w:bookmarkEnd w:id="47"/>
+      <w:r>
+        <w:rPr>
+          <w:rFonts w:ascii="Times New Roman" w:hAnsi="Times New Roman"/>
+          <w:sz w:val="21"/>
+        </w:rPr>
+        <w:t xml:space="preserve">1. Greenhalgh R, Brady SW, Yang W, et al. The landscape of structural</w:t>
+      </w:r>
+      <w:r>
+        <w:rPr>
+          <w:rFonts w:ascii="Times New Roman" w:hAnsi="Times New Roman"/>
+          <w:sz w:val="21"/>
+        </w:rPr>
+        <w:t xml:space="preserve"> </w:t>
+      </w:r>
+      <w:r>
+        <w:rPr>
+          <w:rFonts w:ascii="Times New Roman" w:hAnsi="Times New Roman"/>
+          <w:sz w:val="21"/>
+        </w:rPr>
+        <w:t xml:space="preserve">variation in pediatric cancer. Cancer Cell. 2026 Mar; doi:</w:t>
+      </w:r>
+      <w:r>
+        <w:rPr>
+          <w:rFonts w:ascii="Times New Roman" w:hAnsi="Times New Roman"/>
+          <w:sz w:val="21"/>
+        </w:rPr>
+        <w:t xml:space="preserve"> </w:t>
       </w:r>
       <w:hyperlink r:id="rId37">
         <w:r>
@@ -2482,62 +3993,63 @@
         </w:r>
       </w:hyperlink>
       <w:r>
+        <w:rPr>
+          <w:rFonts w:ascii="Times New Roman" w:hAnsi="Times New Roman"/>
+          <w:sz w:val="21"/>
+        </w:rPr>
         <w:t xml:space="preserve">.</w:t>
       </w:r>
     </w:p>
     <w:p>
       <w:pPr>
         <w:pStyle w:val="af4"/>
-        <w:spacing w:line="360" w:lineRule="auto" w:after="80" w:before="0"/>
-        <w:ind w:firstLine="0" w:left="0"/>
-      </w:pPr>
-      <w:r>
-        <w:t xml:space="preserve">2. Gröbner, S. N., Worst, B. C., Weischenfeldt, J.,</w:t>
-      </w:r>
-      <w:r>
-        <w:t xml:space="preserve"> </w:t>
-      </w:r>
-      <w:r>
-        <w:rPr>
-          <w:i/>
-          <w:iCs/>
-        </w:rPr>
-        <w:t xml:space="preserve">et al.</w:t>
-      </w:r>
-      <w:r>
-        <w:t xml:space="preserve"> </w:t>
-      </w:r>
-      <w:r>
-        <w:t xml:space="preserve">The</w:t>
-      </w:r>
-      <w:r>
-        <w:t xml:space="preserve"> </w:t>
-      </w:r>
-      <w:r>
-        <w:t xml:space="preserve">landscape of genomic alterations across childhood cancers.</w:t>
-      </w:r>
-      <w:r>
-        <w:t xml:space="preserve"> </w:t>
-      </w:r>
-      <w:r>
-        <w:rPr>
-          <w:i/>
-          <w:iCs/>
-        </w:rPr>
-        <w:t xml:space="preserve">Nature</w:t>
-      </w:r>
-      <w:r>
-        <w:t xml:space="preserve"> </w:t>
-      </w:r>
-      <w:r>
-        <w:rPr>
-          <w:b/>
-          <w:bCs/>
-        </w:rPr>
-        <w:t xml:space="preserve">555</w:t>
-      </w:r>
-      <w:r>
-        <w:t xml:space="preserve">, 321–327 (2018) doi:</w:t>
+        <w:spacing w:line="300" w:lineRule="exact" w:after="80" w:before="0"/>
+        <w:ind w:left="389" w:hanging="389"/>
+        <w:jc w:val="left"/>
+      </w:pPr>
+      <w:bookmarkStart w:id="48" w:name="ref-2"/>
+      <w:bookmarkEnd w:id="48"/>
+      <w:r>
+        <w:rPr>
+          <w:rFonts w:ascii="Times New Roman" w:hAnsi="Times New Roman"/>
+          <w:sz w:val="21"/>
+        </w:rPr>
+        <w:t xml:space="preserve">2. Gröbner SN, Worst BC, Weischenfeldt J, et al. The landscape of</w:t>
+      </w:r>
+      <w:r>
+        <w:rPr>
+          <w:rFonts w:ascii="Times New Roman" w:hAnsi="Times New Roman"/>
+          <w:sz w:val="21"/>
+        </w:rPr>
+        <w:t xml:space="preserve"> </w:t>
+      </w:r>
+      <w:r>
+        <w:rPr>
+          <w:rFonts w:ascii="Times New Roman" w:hAnsi="Times New Roman"/>
+          <w:sz w:val="21"/>
+        </w:rPr>
+        <w:t xml:space="preserve">genomic alterations across childhood cancers. Nature. 2018</w:t>
+      </w:r>
+      <w:r>
+        <w:rPr>
+          <w:rFonts w:ascii="Times New Roman" w:hAnsi="Times New Roman"/>
+          <w:sz w:val="21"/>
+        </w:rPr>
+        <w:t xml:space="preserve"> </w:t>
+      </w:r>
+      <w:r>
+        <w:rPr>
+          <w:rFonts w:ascii="Times New Roman" w:hAnsi="Times New Roman"/>
+          <w:sz w:val="21"/>
+        </w:rPr>
+        <w:t xml:space="preserve">Feb;555(7696):321–7. doi:</w:t>
+      </w:r>
+      <w:r>
+        <w:rPr>
+          <w:rFonts w:ascii="Times New Roman" w:hAnsi="Times New Roman"/>
+          <w:sz w:val="21"/>
+        </w:rPr>
+        <w:t xml:space="preserve"> </w:t>
       </w:r>
       <w:hyperlink r:id="rId39">
         <w:r>
@@ -2548,62 +4060,63 @@
         </w:r>
       </w:hyperlink>
       <w:r>
+        <w:rPr>
+          <w:rFonts w:ascii="Times New Roman" w:hAnsi="Times New Roman"/>
+          <w:sz w:val="21"/>
+        </w:rPr>
         <w:t xml:space="preserve">.</w:t>
       </w:r>
     </w:p>
     <w:p>
       <w:pPr>
         <w:pStyle w:val="af4"/>
-        <w:spacing w:line="360" w:lineRule="auto" w:after="80" w:before="0"/>
-        <w:ind w:firstLine="0" w:left="0"/>
-      </w:pPr>
-      <w:r>
-        <w:t xml:space="preserve">3. Ma, X., Liu, Y., Liu, Y.,</w:t>
-      </w:r>
-      <w:r>
-        <w:t xml:space="preserve"> </w:t>
-      </w:r>
-      <w:r>
-        <w:rPr>
-          <w:i/>
-          <w:iCs/>
-        </w:rPr>
-        <w:t xml:space="preserve">et al.</w:t>
-      </w:r>
-      <w:r>
-        <w:t xml:space="preserve"> </w:t>
-      </w:r>
-      <w:r>
-        <w:t xml:space="preserve">Pan-cancer genome and</w:t>
-      </w:r>
-      <w:r>
-        <w:t xml:space="preserve"> </w:t>
-      </w:r>
-      <w:r>
-        <w:t xml:space="preserve">transcriptome analyses of 1,699 paediatric leukaemias and solid tumours.</w:t>
-      </w:r>
-      <w:r>
-        <w:t xml:space="preserve"> </w:t>
-      </w:r>
-      <w:r>
-        <w:rPr>
-          <w:i/>
-          <w:iCs/>
-        </w:rPr>
-        <w:t xml:space="preserve">Nature</w:t>
-      </w:r>
-      <w:r>
-        <w:t xml:space="preserve"> </w:t>
-      </w:r>
-      <w:r>
-        <w:rPr>
-          <w:b/>
-          <w:bCs/>
-        </w:rPr>
-        <w:t xml:space="preserve">555</w:t>
-      </w:r>
-      <w:r>
-        <w:t xml:space="preserve">, 371–376 (2018) doi:</w:t>
+        <w:spacing w:line="300" w:lineRule="exact" w:after="80" w:before="0"/>
+        <w:ind w:left="389" w:hanging="389"/>
+        <w:jc w:val="left"/>
+      </w:pPr>
+      <w:bookmarkStart w:id="49" w:name="ref-3"/>
+      <w:bookmarkEnd w:id="49"/>
+      <w:r>
+        <w:rPr>
+          <w:rFonts w:ascii="Times New Roman" w:hAnsi="Times New Roman"/>
+          <w:sz w:val="21"/>
+        </w:rPr>
+        <w:t xml:space="preserve">3. Ma X, Liu Y, Liu Y, et al. Pan-cancer genome and transcriptome</w:t>
+      </w:r>
+      <w:r>
+        <w:rPr>
+          <w:rFonts w:ascii="Times New Roman" w:hAnsi="Times New Roman"/>
+          <w:sz w:val="21"/>
+        </w:rPr>
+        <w:t xml:space="preserve"> </w:t>
+      </w:r>
+      <w:r>
+        <w:rPr>
+          <w:rFonts w:ascii="Times New Roman" w:hAnsi="Times New Roman"/>
+          <w:sz w:val="21"/>
+        </w:rPr>
+        <w:t xml:space="preserve">analyses of 1,699 paediatric leukaemias and solid tumours. Nature. 2018</w:t>
+      </w:r>
+      <w:r>
+        <w:rPr>
+          <w:rFonts w:ascii="Times New Roman" w:hAnsi="Times New Roman"/>
+          <w:sz w:val="21"/>
+        </w:rPr>
+        <w:t xml:space="preserve"> </w:t>
+      </w:r>
+      <w:r>
+        <w:rPr>
+          <w:rFonts w:ascii="Times New Roman" w:hAnsi="Times New Roman"/>
+          <w:sz w:val="21"/>
+        </w:rPr>
+        <w:t xml:space="preserve">Feb;555(7696):371–6. doi:</w:t>
+      </w:r>
+      <w:r>
+        <w:rPr>
+          <w:rFonts w:ascii="Times New Roman" w:hAnsi="Times New Roman"/>
+          <w:sz w:val="21"/>
+        </w:rPr>
+        <w:t xml:space="preserve"> </w:t>
       </w:r>
       <w:hyperlink r:id="rId41">
         <w:r>
@@ -2614,62 +4127,63 @@
         </w:r>
       </w:hyperlink>
       <w:r>
+        <w:rPr>
+          <w:rFonts w:ascii="Times New Roman" w:hAnsi="Times New Roman"/>
+          <w:sz w:val="21"/>
+        </w:rPr>
         <w:t xml:space="preserve">.</w:t>
       </w:r>
     </w:p>
     <w:p>
       <w:pPr>
         <w:pStyle w:val="af4"/>
-        <w:spacing w:line="360" w:lineRule="auto" w:after="80" w:before="0"/>
-        <w:ind w:firstLine="0" w:left="0"/>
-      </w:pPr>
-      <w:r>
-        <w:t xml:space="preserve">4. Li, Y., Roberts, N. D., Wala, J. A.,</w:t>
-      </w:r>
-      <w:r>
-        <w:t xml:space="preserve"> </w:t>
-      </w:r>
-      <w:r>
-        <w:rPr>
-          <w:i/>
-          <w:iCs/>
-        </w:rPr>
-        <w:t xml:space="preserve">et al.</w:t>
-      </w:r>
-      <w:r>
-        <w:t xml:space="preserve"> </w:t>
-      </w:r>
-      <w:r>
-        <w:t xml:space="preserve">Patterns of</w:t>
-      </w:r>
-      <w:r>
-        <w:t xml:space="preserve"> </w:t>
-      </w:r>
-      <w:r>
-        <w:t xml:space="preserve">somatic structural variation in human cancer genomes.</w:t>
-      </w:r>
-      <w:r>
-        <w:t xml:space="preserve"> </w:t>
-      </w:r>
-      <w:r>
-        <w:rPr>
-          <w:i/>
-          <w:iCs/>
-        </w:rPr>
-        <w:t xml:space="preserve">Nature</w:t>
-      </w:r>
-      <w:r>
-        <w:t xml:space="preserve"> </w:t>
-      </w:r>
-      <w:r>
-        <w:rPr>
-          <w:b/>
-          <w:bCs/>
-        </w:rPr>
-        <w:t xml:space="preserve">578</w:t>
-      </w:r>
-      <w:r>
-        <w:t xml:space="preserve">, 112–121 (2020) doi:</w:t>
+        <w:spacing w:line="300" w:lineRule="exact" w:after="80" w:before="0"/>
+        <w:ind w:left="389" w:hanging="389"/>
+        <w:jc w:val="left"/>
+      </w:pPr>
+      <w:bookmarkStart w:id="50" w:name="ref-4"/>
+      <w:bookmarkEnd w:id="50"/>
+      <w:r>
+        <w:rPr>
+          <w:rFonts w:ascii="Times New Roman" w:hAnsi="Times New Roman"/>
+          <w:sz w:val="21"/>
+        </w:rPr>
+        <w:t xml:space="preserve">4. Li Y, Roberts ND, Wala JA, et al. Patterns of somatic structural</w:t>
+      </w:r>
+      <w:r>
+        <w:rPr>
+          <w:rFonts w:ascii="Times New Roman" w:hAnsi="Times New Roman"/>
+          <w:sz w:val="21"/>
+        </w:rPr>
+        <w:t xml:space="preserve"> </w:t>
+      </w:r>
+      <w:r>
+        <w:rPr>
+          <w:rFonts w:ascii="Times New Roman" w:hAnsi="Times New Roman"/>
+          <w:sz w:val="21"/>
+        </w:rPr>
+        <w:t xml:space="preserve">variation in human cancer genomes. Nature. 2020 Feb;578(7793):112–21.</w:t>
+      </w:r>
+      <w:r>
+        <w:rPr>
+          <w:rFonts w:ascii="Times New Roman" w:hAnsi="Times New Roman"/>
+          <w:sz w:val="21"/>
+        </w:rPr>
+        <w:t xml:space="preserve"> </w:t>
+      </w:r>
+      <w:r>
+        <w:rPr>
+          <w:rFonts w:ascii="Times New Roman" w:hAnsi="Times New Roman"/>
+          <w:sz w:val="21"/>
+        </w:rPr>
+        <w:t xml:space="preserve">doi:</w:t>
+      </w:r>
+      <w:r>
+        <w:rPr>
+          <w:rFonts w:ascii="Times New Roman" w:hAnsi="Times New Roman"/>
+          <w:sz w:val="21"/>
+        </w:rPr>
+        <w:t xml:space="preserve"> </w:t>
       </w:r>
       <w:hyperlink r:id="rId43">
         <w:r>
@@ -2680,17 +4194,26 @@
         </w:r>
       </w:hyperlink>
       <w:r>
+        <w:rPr>
+          <w:rFonts w:ascii="Times New Roman" w:hAnsi="Times New Roman"/>
+          <w:sz w:val="21"/>
+        </w:rPr>
         <w:t xml:space="preserve">.</w:t>
       </w:r>
     </w:p>
     <w:p>
       <w:pPr>
         <w:pStyle w:val="1"/>
-        <w:spacing w:line="360" w:lineRule="auto" w:after="80" w:before="0"/>
+        <w:spacing w:line="360" w:lineRule="exact" w:after="60" w:before="0"/>
         <w:ind w:firstLine="0"/>
         <w:jc w:val="left"/>
       </w:pPr>
       <w:r>
+        <w:rPr>
+          <w:rFonts w:ascii="Times New Roman" w:hAnsi="Times New Roman"/>
+          <w:b/>
+          <w:sz w:val="28"/>
+        </w:rPr>
         <w:t xml:space="preserve">Figure legends</w:t>
       </w:r>
     </w:p>
@@ -2701,33 +4224,67 @@
         <w:ind w:firstLine="0"/>
       </w:pPr>
       <w:r>
+        <w:rPr>
+          <w:rFonts w:ascii="Times New Roman" w:hAnsi="Times New Roman"/>
+          <w:sz w:val="24"/>
+        </w:rPr>
         <w:t xml:space="preserve">No figures are bundled with this public demonstration project. Users</w:t>
       </w:r>
       <w:r>
-        <w:t xml:space="preserve"> </w:t>
-      </w:r>
-      <w:r>
+        <w:rPr>
+          <w:rFonts w:ascii="Times New Roman" w:hAnsi="Times New Roman"/>
+          <w:sz w:val="24"/>
+        </w:rPr>
+        <w:t xml:space="preserve"> </w:t>
+      </w:r>
+      <w:r>
+        <w:rPr>
+          <w:rFonts w:ascii="Times New Roman" w:hAnsi="Times New Roman"/>
+          <w:sz w:val="24"/>
+        </w:rPr>
         <w:t xml:space="preserve">can add journal-ready figures later under a project-local</w:t>
       </w:r>
       <w:r>
+        <w:rPr>
+          <w:rFonts w:ascii="Times New Roman" w:hAnsi="Times New Roman"/>
+          <w:sz w:val="24"/>
+        </w:rPr>
         <w:t xml:space="preserve"> </w:t>
       </w:r>
       <w:r>
         <w:rPr>
           <w:rStyle w:val="VerbatimChar"/>
+          <w:rFonts w:ascii="Times New Roman" w:hAnsi="Times New Roman"/>
+          <w:sz w:val="24"/>
         </w:rPr>
         <w:t xml:space="preserve">figures/</w:t>
       </w:r>
       <w:r>
-        <w:t xml:space="preserve"> </w:t>
-      </w:r>
-      <w:r>
+        <w:rPr>
+          <w:rFonts w:ascii="Times New Roman" w:hAnsi="Times New Roman"/>
+          <w:sz w:val="24"/>
+        </w:rPr>
+        <w:t xml:space="preserve"> </w:t>
+      </w:r>
+      <w:r>
+        <w:rPr>
+          <w:rFonts w:ascii="Times New Roman" w:hAnsi="Times New Roman"/>
+          <w:sz w:val="24"/>
+        </w:rPr>
         <w:t xml:space="preserve">directory and extend the manuscript in the same</w:t>
       </w:r>
       <w:r>
-        <w:t xml:space="preserve"> </w:t>
-      </w:r>
-      <w:r>
+        <w:rPr>
+          <w:rFonts w:ascii="Times New Roman" w:hAnsi="Times New Roman"/>
+          <w:sz w:val="24"/>
+        </w:rPr>
+        <w:t xml:space="preserve"> </w:t>
+      </w:r>
+      <w:r>
+        <w:rPr>
+          <w:rFonts w:ascii="Times New Roman" w:hAnsi="Times New Roman"/>
+          <w:sz w:val="24"/>
+        </w:rPr>
         <w:t xml:space="preserve">workflow.</w:t>
       </w:r>
     </w:p>
@@ -2736,18 +4293,17 @@
     <w:p>
       <w:pPr>
         <w:pStyle w:val="1"/>
-        <w:spacing w:line="360" w:lineRule="auto" w:after="80" w:before="0"/>
+        <w:spacing w:line="360" w:lineRule="exact" w:after="60" w:before="0"/>
         <w:ind w:firstLine="0"/>
         <w:jc w:val="left"/>
       </w:pPr>
       <w:r>
-        <w:t xml:space="preserve">Supplementary</w:t>
-      </w:r>
-      <w:r>
-        <w:t xml:space="preserve"> </w:t>
-      </w:r>
-      <w:r>
-        <w:t xml:space="preserve">materials</w:t>
+        <w:rPr>
+          <w:rFonts w:ascii="Times New Roman" w:hAnsi="Times New Roman"/>
+          <w:b/>
+          <w:sz w:val="28"/>
+        </w:rPr>
+        <w:t xml:space="preserve">Supplementary materials</w:t>
       </w:r>
     </w:p>
     <w:p>
@@ -2757,24 +4313,52 @@
         <w:ind w:firstLine="0"/>
       </w:pPr>
       <w:r>
+        <w:rPr>
+          <w:rFonts w:ascii="Times New Roman" w:hAnsi="Times New Roman"/>
+          <w:sz w:val="24"/>
+        </w:rPr>
         <w:t xml:space="preserve">No supplementary tables or appendices are included in this starter</w:t>
       </w:r>
       <w:r>
-        <w:t xml:space="preserve"> </w:t>
-      </w:r>
-      <w:r>
+        <w:rPr>
+          <w:rFonts w:ascii="Times New Roman" w:hAnsi="Times New Roman"/>
+          <w:sz w:val="24"/>
+        </w:rPr>
+        <w:t xml:space="preserve"> </w:t>
+      </w:r>
+      <w:r>
+        <w:rPr>
+          <w:rFonts w:ascii="Times New Roman" w:hAnsi="Times New Roman"/>
+          <w:sz w:val="24"/>
+        </w:rPr>
         <w:t xml:space="preserve">project. The section is retained so that downstream users have a</w:t>
       </w:r>
       <w:r>
-        <w:t xml:space="preserve"> </w:t>
-      </w:r>
-      <w:r>
+        <w:rPr>
+          <w:rFonts w:ascii="Times New Roman" w:hAnsi="Times New Roman"/>
+          <w:sz w:val="24"/>
+        </w:rPr>
+        <w:t xml:space="preserve"> </w:t>
+      </w:r>
+      <w:r>
+        <w:rPr>
+          <w:rFonts w:ascii="Times New Roman" w:hAnsi="Times New Roman"/>
+          <w:sz w:val="24"/>
+        </w:rPr>
         <w:t xml:space="preserve">ready-made insertion point for supplements when adapting the template to</w:t>
       </w:r>
       <w:r>
-        <w:t xml:space="preserve"> </w:t>
-      </w:r>
-      <w:r>
+        <w:rPr>
+          <w:rFonts w:ascii="Times New Roman" w:hAnsi="Times New Roman"/>
+          <w:sz w:val="24"/>
+        </w:rPr>
+        <w:t xml:space="preserve"> </w:t>
+      </w:r>
+      <w:r>
+        <w:rPr>
+          <w:rFonts w:ascii="Times New Roman" w:hAnsi="Times New Roman"/>
+          <w:sz w:val="24"/>
+        </w:rPr>
         <w:t xml:space="preserve">a real manuscript.</w:t>
       </w:r>
     </w:p>

</xml_diff>